<commit_message>
formato nativo word taller kernel
</commit_message>
<xml_diff>
--- a/ClaseSEPTIEMBRE2826.docx
+++ b/ClaseSEPTIEMBRE2826.docx
@@ -68,63 +68,24 @@
     </w:p>
     <w:p>
       <w:pPr>
-        <w:pStyle w:val="Heading1"/>
+        <w:jc w:val="both"/>
       </w:pPr>
       <w:r>
-        <w:t>Clase Septiembre 28 de 2026 — Kernel</w:t>
+        <w:t>Del PDF saqué tres cosas que hay que resolver:</w:t>
       </w:r>
     </w:p>
     <w:p>
       <w:pPr>
+        <w:tabs>
+          <w:tab w:pos="510" w:val="left"/>
+        </w:tabs>
+        <w:ind w:left="510" w:hanging="340"/>
         <w:jc w:val="both"/>
       </w:pPr>
       <w:r>
-        <w:rPr>
-          <w:b/>
-        </w:rPr>
-        <w:t>Materia:</w:t>
-      </w:r>
-      <w:r>
-        <w:t xml:space="preserve"> Sistemas Operativos, UAO</w:t>
-      </w:r>
-    </w:p>
-    <w:p>
-      <w:pPr>
-        <w:jc w:val="both"/>
-      </w:pPr>
-      <w:r>
-        <w:rPr>
-          <w:b/>
-        </w:rPr>
-        <w:t>Fuente:</w:t>
-      </w:r>
-      <w:r>
-        <w:t xml:space="preserve"> </w:t>
-      </w:r>
-      <w:r>
-        <w:rPr>
-          <w:rFonts w:ascii="Consolas" w:hAnsi="Consolas"/>
-          <w:sz w:val="20"/>
-        </w:rPr>
-        <w:t>ClaseSEPTIEMBRE2826.pdf</w:t>
-      </w:r>
-      <w:r>
-        <w:t xml:space="preserve"> (41 diapositivas sobre el kernel)</w:t>
-      </w:r>
-    </w:p>
-    <w:p>
-      <w:pPr>
-        <w:jc w:val="both"/>
-      </w:pPr>
-      <w:r>
-        <w:t>Del PDF saqué tres cosas que hay que resolver:</w:t>
-      </w:r>
-    </w:p>
-    <w:p>
-      <w:pPr>
-        <w:pStyle w:val="ListNumber"/>
-        <w:jc w:val="both"/>
-      </w:pPr>
+        <w:t>1.</w:t>
+        <w:tab/>
+      </w:r>
       <w:r>
         <w:rPr>
           <w:b/>
@@ -137,9 +98,16 @@
     </w:p>
     <w:p>
       <w:pPr>
-        <w:pStyle w:val="ListNumber"/>
+        <w:tabs>
+          <w:tab w:pos="510" w:val="left"/>
+        </w:tabs>
+        <w:ind w:left="510" w:hanging="340"/>
         <w:jc w:val="both"/>
       </w:pPr>
+      <w:r>
+        <w:t>2.</w:t>
+        <w:tab/>
+      </w:r>
       <w:r>
         <w:rPr>
           <w:b/>
@@ -152,9 +120,16 @@
     </w:p>
     <w:p>
       <w:pPr>
-        <w:pStyle w:val="ListNumber"/>
+        <w:tabs>
+          <w:tab w:pos="510" w:val="left"/>
+        </w:tabs>
+        <w:ind w:left="510" w:hanging="340"/>
         <w:jc w:val="both"/>
       </w:pPr>
+      <w:r>
+        <w:t>3.</w:t>
+        <w:tab/>
+      </w:r>
       <w:r>
         <w:rPr>
           <w:b/>
@@ -519,9 +494,16 @@
     </w:p>
     <w:p>
       <w:pPr>
-        <w:pStyle w:val="ListNumber"/>
+        <w:tabs>
+          <w:tab w:pos="510" w:val="left"/>
+        </w:tabs>
+        <w:ind w:left="510" w:hanging="340"/>
         <w:jc w:val="both"/>
       </w:pPr>
+      <w:r>
+        <w:t>1.</w:t>
+        <w:tab/>
+      </w:r>
       <w:r>
         <w:rPr>
           <w:rFonts w:ascii="Consolas" w:hAnsi="Consolas"/>
@@ -535,9 +517,16 @@
     </w:p>
     <w:p>
       <w:pPr>
-        <w:pStyle w:val="ListNumber"/>
+        <w:tabs>
+          <w:tab w:pos="510" w:val="left"/>
+        </w:tabs>
+        <w:ind w:left="510" w:hanging="340"/>
         <w:jc w:val="both"/>
       </w:pPr>
+      <w:r>
+        <w:t>2.</w:t>
+        <w:tab/>
+      </w:r>
       <w:r>
         <w:rPr>
           <w:rFonts w:ascii="Consolas" w:hAnsi="Consolas"/>
@@ -654,9 +643,16 @@
     </w:p>
     <w:p>
       <w:pPr>
-        <w:pStyle w:val="ListNumber"/>
+        <w:tabs>
+          <w:tab w:pos="510" w:val="left"/>
+        </w:tabs>
+        <w:ind w:left="510" w:hanging="340"/>
         <w:jc w:val="both"/>
       </w:pPr>
+      <w:r>
+        <w:t>3.</w:t>
+        <w:tab/>
+      </w:r>
       <w:r>
         <w:rPr>
           <w:rFonts w:ascii="Consolas" w:hAnsi="Consolas"/>
@@ -753,9 +749,16 @@
     </w:p>
     <w:p>
       <w:pPr>
-        <w:pStyle w:val="ListNumber"/>
+        <w:tabs>
+          <w:tab w:pos="510" w:val="left"/>
+        </w:tabs>
+        <w:ind w:left="510" w:hanging="340"/>
         <w:jc w:val="both"/>
       </w:pPr>
+      <w:r>
+        <w:t>1.</w:t>
+        <w:tab/>
+      </w:r>
       <w:r>
         <w:rPr>
           <w:rFonts w:ascii="Consolas" w:hAnsi="Consolas"/>
@@ -863,9 +866,16 @@
     </w:p>
     <w:p>
       <w:pPr>
-        <w:pStyle w:val="ListNumber"/>
+        <w:tabs>
+          <w:tab w:pos="510" w:val="left"/>
+        </w:tabs>
+        <w:ind w:left="510" w:hanging="340"/>
         <w:jc w:val="both"/>
       </w:pPr>
+      <w:r>
+        <w:t>2.</w:t>
+        <w:tab/>
+      </w:r>
       <w:r>
         <w:rPr>
           <w:rFonts w:ascii="Consolas" w:hAnsi="Consolas"/>
@@ -898,9 +908,16 @@
     </w:p>
     <w:p>
       <w:pPr>
-        <w:pStyle w:val="ListNumber"/>
+        <w:tabs>
+          <w:tab w:pos="510" w:val="left"/>
+        </w:tabs>
+        <w:ind w:left="510" w:hanging="340"/>
         <w:jc w:val="both"/>
       </w:pPr>
+      <w:r>
+        <w:t>3.</w:t>
+        <w:tab/>
+      </w:r>
       <w:r>
         <w:rPr>
           <w:rFonts w:ascii="Consolas" w:hAnsi="Consolas"/>
@@ -944,9 +961,16 @@
     </w:p>
     <w:p>
       <w:pPr>
-        <w:pStyle w:val="ListNumber"/>
+        <w:tabs>
+          <w:tab w:pos="510" w:val="left"/>
+        </w:tabs>
+        <w:ind w:left="510" w:hanging="340"/>
         <w:jc w:val="both"/>
       </w:pPr>
+      <w:r>
+        <w:t>4.</w:t>
+        <w:tab/>
+      </w:r>
       <w:r>
         <w:rPr>
           <w:rFonts w:ascii="Consolas" w:hAnsi="Consolas"/>
@@ -1082,9 +1106,16 @@
     </w:p>
     <w:p>
       <w:pPr>
-        <w:pStyle w:val="ListNumber"/>
+        <w:tabs>
+          <w:tab w:pos="510" w:val="left"/>
+        </w:tabs>
+        <w:ind w:left="510" w:hanging="340"/>
         <w:jc w:val="both"/>
       </w:pPr>
+      <w:r>
+        <w:t>1.</w:t>
+        <w:tab/>
+      </w:r>
       <w:r>
         <w:rPr>
           <w:rFonts w:ascii="Consolas" w:hAnsi="Consolas"/>
@@ -1108,9 +1139,16 @@
     </w:p>
     <w:p>
       <w:pPr>
-        <w:pStyle w:val="ListNumber"/>
+        <w:tabs>
+          <w:tab w:pos="510" w:val="left"/>
+        </w:tabs>
+        <w:ind w:left="510" w:hanging="340"/>
         <w:jc w:val="both"/>
       </w:pPr>
+      <w:r>
+        <w:t>2.</w:t>
+        <w:tab/>
+      </w:r>
       <w:r>
         <w:rPr>
           <w:rFonts w:ascii="Consolas" w:hAnsi="Consolas"/>
@@ -1124,9 +1162,16 @@
     </w:p>
     <w:p>
       <w:pPr>
-        <w:pStyle w:val="ListNumber"/>
+        <w:tabs>
+          <w:tab w:pos="510" w:val="left"/>
+        </w:tabs>
+        <w:ind w:left="510" w:hanging="340"/>
         <w:jc w:val="both"/>
       </w:pPr>
+      <w:r>
+        <w:t>3.</w:t>
+        <w:tab/>
+      </w:r>
       <w:r>
         <w:rPr>
           <w:rFonts w:ascii="Consolas" w:hAnsi="Consolas"/>
@@ -1160,9 +1205,16 @@
     </w:p>
     <w:p>
       <w:pPr>
-        <w:pStyle w:val="ListNumber"/>
+        <w:tabs>
+          <w:tab w:pos="510" w:val="left"/>
+        </w:tabs>
+        <w:ind w:left="510" w:hanging="340"/>
         <w:jc w:val="both"/>
       </w:pPr>
+      <w:r>
+        <w:t>4.</w:t>
+        <w:tab/>
+      </w:r>
       <w:r>
         <w:rPr>
           <w:rFonts w:ascii="Consolas" w:hAnsi="Consolas"/>
@@ -1461,7 +1513,7 @@
         <w:tc>
           <w:tcPr>
             <w:tcW w:type="dxa" w:w="3135"/>
-            <w:shd w:val="clear" w:color="auto" w:fill="E8EEF6"/>
+            <w:shd w:val="clear" w:color="auto" w:fill="1B365D"/>
           </w:tcPr>
           <w:p>
             <w:pPr>
@@ -1470,6 +1522,7 @@
             <w:r>
               <w:rPr>
                 <w:b/>
+                <w:color w:val="FFFFFF"/>
                 <w:sz w:val="20"/>
               </w:rPr>
               <w:t>Tipo de kernel / diseño</w:t>
@@ -1479,7 +1532,7 @@
         <w:tc>
           <w:tcPr>
             <w:tcW w:type="dxa" w:w="3135"/>
-            <w:shd w:val="clear" w:color="auto" w:fill="E8EEF6"/>
+            <w:shd w:val="clear" w:color="auto" w:fill="1B365D"/>
           </w:tcPr>
           <w:p>
             <w:pPr>
@@ -1488,6 +1541,7 @@
             <w:r>
               <w:rPr>
                 <w:b/>
+                <w:color w:val="FFFFFF"/>
                 <w:sz w:val="20"/>
               </w:rPr>
               <w:t>SO que presento</w:t>
@@ -1497,7 +1551,7 @@
         <w:tc>
           <w:tcPr>
             <w:tcW w:type="dxa" w:w="3135"/>
-            <w:shd w:val="clear" w:color="auto" w:fill="E8EEF6"/>
+            <w:shd w:val="clear" w:color="auto" w:fill="1B365D"/>
           </w:tcPr>
           <w:p>
             <w:pPr>
@@ -1506,6 +1560,7 @@
             <w:r>
               <w:rPr>
                 <w:b/>
+                <w:color w:val="FFFFFF"/>
                 <w:sz w:val="20"/>
               </w:rPr>
               <w:t>Por qué encaja</w:t>
@@ -1869,36 +1924,64 @@
     </w:p>
     <w:p>
       <w:pPr>
-        <w:pStyle w:val="ListNumber"/>
+        <w:tabs>
+          <w:tab w:pos="510" w:val="left"/>
+        </w:tabs>
+        <w:ind w:left="510" w:hanging="340"/>
         <w:jc w:val="both"/>
       </w:pPr>
+      <w:r>
+        <w:t>1.</w:t>
+        <w:tab/>
+      </w:r>
       <w:r>
         <w:t>Historia breve y para qué se usa el SO.</w:t>
       </w:r>
     </w:p>
     <w:p>
       <w:pPr>
-        <w:pStyle w:val="ListNumber"/>
+        <w:tabs>
+          <w:tab w:pos="510" w:val="left"/>
+        </w:tabs>
+        <w:ind w:left="510" w:hanging="340"/>
         <w:jc w:val="both"/>
       </w:pPr>
+      <w:r>
+        <w:t>2.</w:t>
+        <w:tab/>
+      </w:r>
       <w:r>
         <w:t>Cómo está organizado su kernel, con un diagrama.</w:t>
       </w:r>
     </w:p>
     <w:p>
       <w:pPr>
-        <w:pStyle w:val="ListNumber"/>
+        <w:tabs>
+          <w:tab w:pos="510" w:val="left"/>
+        </w:tabs>
+        <w:ind w:left="510" w:hanging="340"/>
         <w:jc w:val="both"/>
       </w:pPr>
+      <w:r>
+        <w:t>3.</w:t>
+        <w:tab/>
+      </w:r>
       <w:r>
         <w:t>Ventajas y desventajas de ese diseño.</w:t>
       </w:r>
     </w:p>
     <w:p>
       <w:pPr>
-        <w:pStyle w:val="ListNumber"/>
+        <w:tabs>
+          <w:tab w:pos="510" w:val="left"/>
+        </w:tabs>
+        <w:ind w:left="510" w:hanging="340"/>
         <w:jc w:val="both"/>
       </w:pPr>
+      <w:r>
+        <w:t>4.</w:t>
+        <w:tab/>
+      </w:r>
       <w:r>
         <w:t>Comparación con los otros tipos (cuadro final).</w:t>
       </w:r>
@@ -1935,7 +2018,7 @@
         <w:tc>
           <w:tcPr>
             <w:tcW w:type="dxa" w:w="2351"/>
-            <w:shd w:val="clear" w:color="auto" w:fill="E8EEF6"/>
+            <w:shd w:val="clear" w:color="auto" w:fill="1B365D"/>
           </w:tcPr>
           <w:p>
             <w:pPr>
@@ -1944,6 +2027,7 @@
             <w:r>
               <w:rPr>
                 <w:b/>
+                <w:color w:val="FFFFFF"/>
                 <w:sz w:val="20"/>
               </w:rPr>
               <w:t>Diseño</w:t>
@@ -1953,7 +2037,7 @@
         <w:tc>
           <w:tcPr>
             <w:tcW w:type="dxa" w:w="2351"/>
-            <w:shd w:val="clear" w:color="auto" w:fill="E8EEF6"/>
+            <w:shd w:val="clear" w:color="auto" w:fill="1B365D"/>
           </w:tcPr>
           <w:p>
             <w:pPr>
@@ -1962,6 +2046,7 @@
             <w:r>
               <w:rPr>
                 <w:b/>
+                <w:color w:val="FFFFFF"/>
                 <w:sz w:val="20"/>
               </w:rPr>
               <w:t>Rendimiento</w:t>
@@ -1971,7 +2056,7 @@
         <w:tc>
           <w:tcPr>
             <w:tcW w:type="dxa" w:w="2351"/>
-            <w:shd w:val="clear" w:color="auto" w:fill="E8EEF6"/>
+            <w:shd w:val="clear" w:color="auto" w:fill="1B365D"/>
           </w:tcPr>
           <w:p>
             <w:pPr>
@@ -1980,6 +2065,7 @@
             <w:r>
               <w:rPr>
                 <w:b/>
+                <w:color w:val="FFFFFF"/>
                 <w:sz w:val="20"/>
               </w:rPr>
               <w:t>Robustez</w:t>
@@ -1989,7 +2075,7 @@
         <w:tc>
           <w:tcPr>
             <w:tcW w:type="dxa" w:w="2351"/>
-            <w:shd w:val="clear" w:color="auto" w:fill="E8EEF6"/>
+            <w:shd w:val="clear" w:color="auto" w:fill="1B365D"/>
           </w:tcPr>
           <w:p>
             <w:pPr>
@@ -1998,6 +2084,7 @@
             <w:r>
               <w:rPr>
                 <w:b/>
+                <w:color w:val="FFFFFF"/>
                 <w:sz w:val="20"/>
               </w:rPr>
               <w:t>Facilidad de extender</w:t>
@@ -2447,9 +2534,16 @@
     </w:p>
     <w:p>
       <w:pPr>
-        <w:pStyle w:val="ListNumber"/>
+        <w:tabs>
+          <w:tab w:pos="510" w:val="left"/>
+        </w:tabs>
+        <w:ind w:left="510" w:hanging="340"/>
         <w:jc w:val="both"/>
       </w:pPr>
+      <w:r>
+        <w:t>1.</w:t>
+        <w:tab/>
+      </w:r>
       <w:r>
         <w:rPr>
           <w:rFonts w:ascii="Consolas" w:hAnsi="Consolas"/>
@@ -2463,9 +2557,16 @@
     </w:p>
     <w:p>
       <w:pPr>
-        <w:pStyle w:val="ListNumber"/>
+        <w:tabs>
+          <w:tab w:pos="510" w:val="left"/>
+        </w:tabs>
+        <w:ind w:left="510" w:hanging="340"/>
         <w:jc w:val="both"/>
       </w:pPr>
+      <w:r>
+        <w:t>2.</w:t>
+        <w:tab/>
+      </w:r>
       <w:r>
         <w:rPr>
           <w:rFonts w:ascii="Consolas" w:hAnsi="Consolas"/>
@@ -2479,9 +2580,16 @@
     </w:p>
     <w:p>
       <w:pPr>
-        <w:pStyle w:val="ListNumber"/>
+        <w:tabs>
+          <w:tab w:pos="510" w:val="left"/>
+        </w:tabs>
+        <w:ind w:left="510" w:hanging="340"/>
         <w:jc w:val="both"/>
       </w:pPr>
+      <w:r>
+        <w:t>3.</w:t>
+        <w:tab/>
+      </w:r>
       <w:r>
         <w:t xml:space="preserve">Se reinicia y se vuelve a ejecutar </w:t>
       </w:r>
@@ -2697,7 +2805,7 @@
         <w:tc>
           <w:tcPr>
             <w:tcW w:type="dxa" w:w="3135"/>
-            <w:shd w:val="clear" w:color="auto" w:fill="E8EEF6"/>
+            <w:shd w:val="clear" w:color="auto" w:fill="1B365D"/>
           </w:tcPr>
           <w:p>
             <w:pPr>
@@ -2706,6 +2814,7 @@
             <w:r>
               <w:rPr>
                 <w:b/>
+                <w:color w:val="FFFFFF"/>
                 <w:sz w:val="20"/>
               </w:rPr>
               <w:t>SO</w:t>
@@ -2715,7 +2824,7 @@
         <w:tc>
           <w:tcPr>
             <w:tcW w:type="dxa" w:w="3135"/>
-            <w:shd w:val="clear" w:color="auto" w:fill="E8EEF6"/>
+            <w:shd w:val="clear" w:color="auto" w:fill="1B365D"/>
           </w:tcPr>
           <w:p>
             <w:pPr>
@@ -2724,6 +2833,7 @@
             <w:r>
               <w:rPr>
                 <w:b/>
+                <w:color w:val="FFFFFF"/>
                 <w:sz w:val="20"/>
               </w:rPr>
               <w:t>Tipo de kernel</w:t>
@@ -2733,7 +2843,7 @@
         <w:tc>
           <w:tcPr>
             <w:tcW w:type="dxa" w:w="3135"/>
-            <w:shd w:val="clear" w:color="auto" w:fill="E8EEF6"/>
+            <w:shd w:val="clear" w:color="auto" w:fill="1B365D"/>
           </w:tcPr>
           <w:p>
             <w:pPr>
@@ -2742,6 +2852,7 @@
             <w:r>
               <w:rPr>
                 <w:b/>
+                <w:color w:val="FFFFFF"/>
                 <w:sz w:val="20"/>
               </w:rPr>
               <w:t>Comentario</w:t>
@@ -3005,7 +3116,7 @@
         <w:tc>
           <w:tcPr>
             <w:tcW w:type="dxa" w:w="3135"/>
-            <w:shd w:val="clear" w:color="auto" w:fill="E8EEF6"/>
+            <w:shd w:val="clear" w:color="auto" w:fill="1B365D"/>
           </w:tcPr>
           <w:p>
             <w:pPr>
@@ -3014,6 +3125,7 @@
             <w:r>
               <w:rPr>
                 <w:b/>
+                <w:color w:val="FFFFFF"/>
                 <w:sz w:val="20"/>
               </w:rPr>
               <w:t>SO</w:t>
@@ -3023,7 +3135,7 @@
         <w:tc>
           <w:tcPr>
             <w:tcW w:type="dxa" w:w="3135"/>
-            <w:shd w:val="clear" w:color="auto" w:fill="E8EEF6"/>
+            <w:shd w:val="clear" w:color="auto" w:fill="1B365D"/>
           </w:tcPr>
           <w:p>
             <w:pPr>
@@ -3032,6 +3144,7 @@
             <w:r>
               <w:rPr>
                 <w:b/>
+                <w:color w:val="FFFFFF"/>
                 <w:sz w:val="20"/>
               </w:rPr>
               <w:t>Tipo de kernel</w:t>
@@ -3041,7 +3154,7 @@
         <w:tc>
           <w:tcPr>
             <w:tcW w:type="dxa" w:w="3135"/>
-            <w:shd w:val="clear" w:color="auto" w:fill="E8EEF6"/>
+            <w:shd w:val="clear" w:color="auto" w:fill="1B365D"/>
           </w:tcPr>
           <w:p>
             <w:pPr>
@@ -3050,6 +3163,7 @@
             <w:r>
               <w:rPr>
                 <w:b/>
+                <w:color w:val="FFFFFF"/>
                 <w:sz w:val="20"/>
               </w:rPr>
               <w:t>Comentario</w:t>

</xml_diff>

<commit_message>
version final universitaria reporte
</commit_message>
<xml_diff>
--- a/ClaseSEPTIEMBRE2826.docx
+++ b/ClaseSEPTIEMBRE2826.docx
@@ -10,7 +10,7 @@
       <w:r>
         <w:rPr>
           <w:b/>
-          <w:color w:val="1B365D"/>
+          <w:color w:val="000000"/>
           <w:sz w:val="28"/>
         </w:rPr>
         <w:t>Universidad Autónoma de Occidente (UAO)</w:t>
@@ -24,7 +24,7 @@
       <w:r>
         <w:rPr>
           <w:b w:val="0"/>
-          <w:color w:val="1B365D"/>
+          <w:color w:val="000000"/>
           <w:sz w:val="24"/>
         </w:rPr>
         <w:t>Facultad de Ingeniería — Sistemas Operativos</w:t>
@@ -38,7 +38,7 @@
       <w:r>
         <w:rPr>
           <w:b w:val="0"/>
-          <w:color w:val="1B365D"/>
+          <w:color w:val="000000"/>
           <w:sz w:val="24"/>
         </w:rPr>
         <w:t>Taller de Kernel — 28 de Septiembre</w:t>
@@ -52,7 +52,7 @@
       <w:r>
         <w:rPr>
           <w:b w:val="0"/>
-          <w:color w:val="1B365D"/>
+          <w:color w:val="000000"/>
           <w:sz w:val="24"/>
         </w:rPr>
         <w:t>Estudiante: Sergio Gómez Quiñones</w:t>
@@ -61,365 +61,10 @@
     <w:p>
       <w:pPr>
         <w:pBdr>
-          <w:bottom w:val="single" w:sz="12" w:space="1" w:color="1B365D"/>
+          <w:bottom w:val="single" w:sz="12" w:space="1" w:color="000000"/>
         </w:pBdr>
         <w:spacing w:after="200"/>
       </w:pPr>
-    </w:p>
-    <w:p>
-      <w:pPr>
-        <w:jc w:val="both"/>
-      </w:pPr>
-      <w:r>
-        <w:t>Del PDF saqué tres cosas que hay que resolver:</w:t>
-      </w:r>
-    </w:p>
-    <w:p>
-      <w:pPr>
-        <w:tabs>
-          <w:tab w:pos="510" w:val="left"/>
-        </w:tabs>
-        <w:ind w:left="510" w:hanging="340"/>
-        <w:jc w:val="both"/>
-      </w:pPr>
-      <w:r>
-        <w:t>1.</w:t>
-        <w:tab/>
-      </w:r>
-      <w:r>
-        <w:rPr>
-          <w:b/>
-        </w:rPr>
-        <w:t>Actividad de laboratorio (diapositivas 38-39):</w:t>
-      </w:r>
-      <w:r>
-        <w:t xml:space="preserve"> identificar el sistema FreeBSD y compilar e instalar un kernel personalizado.</w:t>
-      </w:r>
-    </w:p>
-    <w:p>
-      <w:pPr>
-        <w:tabs>
-          <w:tab w:pos="510" w:val="left"/>
-        </w:tabs>
-        <w:ind w:left="510" w:hanging="340"/>
-        <w:jc w:val="both"/>
-      </w:pPr>
-      <w:r>
-        <w:t>2.</w:t>
-        <w:tab/>
-      </w:r>
-      <w:r>
-        <w:rPr>
-          <w:b/>
-        </w:rPr>
-        <w:t>Trabajo investigativo (diapositiva 40), entrega el 5 de octubre:</w:t>
-      </w:r>
-      <w:r>
-        <w:t xml:space="preserve"> presentar un sistema operativo por cada tipo de kernel.</w:t>
-      </w:r>
-    </w:p>
-    <w:p>
-      <w:pPr>
-        <w:tabs>
-          <w:tab w:pos="510" w:val="left"/>
-        </w:tabs>
-        <w:ind w:left="510" w:hanging="340"/>
-        <w:jc w:val="both"/>
-      </w:pPr>
-      <w:r>
-        <w:t>3.</w:t>
-        <w:tab/>
-      </w:r>
-      <w:r>
-        <w:rPr>
-          <w:b/>
-        </w:rPr>
-        <w:t>Versión 6 (diapositiva 40), entrega el 19 de octubre:</w:t>
-      </w:r>
-      <w:r>
-        <w:t xml:space="preserve"> instalar un kernel nuevo en Oracle Linux, Ubuntu o CentOS, y clasificar el kernel de varios SO.</w:t>
-      </w:r>
-    </w:p>
-    <w:p>
-      <w:pPr>
-        <w:jc w:val="both"/>
-      </w:pPr>
-      <w:r>
-        <w:t>Antes de resolver, dejo un resumen de la teoría de la clase. Me sirvió para entender las respuestas y no solo copiarlas.</w:t>
-      </w:r>
-    </w:p>
-    <w:p>
-      <w:pPr>
-        <w:pStyle w:val="Heading2"/>
-      </w:pPr>
-      <w:r>
-        <w:t>0. Resumen de la teoría (para tener contexto)</w:t>
-      </w:r>
-    </w:p>
-    <w:p>
-      <w:pPr>
-        <w:pStyle w:val="ListBullet"/>
-        <w:jc w:val="both"/>
-      </w:pPr>
-      <w:r>
-        <w:rPr>
-          <w:b/>
-        </w:rPr>
-        <w:t>Kernel:</w:t>
-      </w:r>
-      <w:r>
-        <w:t xml:space="preserve"> es el núcleo del SO. Administra el hardware, sobre todo la </w:t>
-      </w:r>
-      <w:r>
-        <w:rPr>
-          <w:b/>
-        </w:rPr>
-        <w:t>CPU, la memoria y los dispositivos de E/S</w:t>
-      </w:r>
-      <w:r>
-        <w:t>. Además da protección (niveles de acceso) y acceso compartido (multiplexado) a los recursos.</w:t>
-      </w:r>
-    </w:p>
-    <w:p>
-      <w:pPr>
-        <w:pStyle w:val="ListBullet"/>
-        <w:jc w:val="both"/>
-      </w:pPr>
-      <w:r>
-        <w:rPr>
-          <w:b/>
-        </w:rPr>
-        <w:t>Modo kernel y modo usuario:</w:t>
-      </w:r>
-      <w:r>
-        <w:t xml:space="preserve"> la CPU tiene niveles de privilegio (*rings*). Las aplicaciones corren en espacio de usuario y le piden cosas al kernel con </w:t>
-      </w:r>
-      <w:r>
-        <w:rPr>
-          <w:b/>
-        </w:rPr>
-        <w:t>llamadas al sistema (syscalls)</w:t>
-      </w:r>
-      <w:r>
-        <w:t>.</w:t>
-      </w:r>
-    </w:p>
-    <w:p>
-      <w:pPr>
-        <w:pStyle w:val="ListBullet"/>
-        <w:jc w:val="both"/>
-      </w:pPr>
-      <w:r>
-        <w:rPr>
-          <w:b/>
-        </w:rPr>
-        <w:t>Kernel panic:</w:t>
-      </w:r>
-      <w:r>
-        <w:t xml:space="preserve"> error grave que el kernel detecta y no puede resolver, por ejemplo una referencia a una dirección de memoria inválida. Puede venir de un bug o de una falla de hardware como la RAM.</w:t>
-      </w:r>
-    </w:p>
-    <w:p>
-      <w:pPr>
-        <w:pStyle w:val="ListBullet"/>
-        <w:jc w:val="both"/>
-      </w:pPr>
-      <w:r>
-        <w:rPr>
-          <w:b/>
-        </w:rPr>
-        <w:t>Versiones del kernel Linux (XX.YY.ZZ):</w:t>
-      </w:r>
-    </w:p>
-    <w:p>
-      <w:pPr>
-        <w:pStyle w:val="ListBullet2"/>
-        <w:jc w:val="both"/>
-      </w:pPr>
-      <w:r>
-        <w:t>XX es la serie principal.</w:t>
-      </w:r>
-    </w:p>
-    <w:p>
-      <w:pPr>
-        <w:pStyle w:val="ListBullet2"/>
-        <w:jc w:val="both"/>
-      </w:pPr>
-      <w:r>
-        <w:t>YY par significa producción (estable) e impar significa desarrollo.</w:t>
-      </w:r>
-    </w:p>
-    <w:p>
-      <w:pPr>
-        <w:pStyle w:val="ListBullet2"/>
-        <w:jc w:val="both"/>
-      </w:pPr>
-      <w:r>
-        <w:t>ZZ es la revisión que corrige bugs.</w:t>
-      </w:r>
-    </w:p>
-    <w:p>
-      <w:pPr>
-        <w:pStyle w:val="ListBullet2"/>
-        <w:jc w:val="both"/>
-      </w:pPr>
-      <w:r>
-        <w:t xml:space="preserve">Ejemplo: </w:t>
-      </w:r>
-      <w:r>
-        <w:rPr>
-          <w:rFonts w:ascii="Consolas" w:hAnsi="Consolas"/>
-          <w:sz w:val="20"/>
-        </w:rPr>
-        <w:t>2.4.0</w:t>
-      </w:r>
-      <w:r>
-        <w:t xml:space="preserve"> es serie 2, producción 4 (par), primera versión. </w:t>
-      </w:r>
-      <w:r>
-        <w:rPr>
-          <w:rFonts w:ascii="Consolas" w:hAnsi="Consolas"/>
-          <w:sz w:val="20"/>
-        </w:rPr>
-        <w:t>2.5.0</w:t>
-      </w:r>
-      <w:r>
-        <w:t xml:space="preserve"> es la versión 0 del kernel de desarrollo 2.5.</w:t>
-      </w:r>
-    </w:p>
-    <w:p>
-      <w:pPr>
-        <w:pStyle w:val="ListBullet"/>
-        <w:jc w:val="both"/>
-      </w:pPr>
-      <w:r>
-        <w:rPr>
-          <w:b/>
-        </w:rPr>
-        <w:t>Módulos:</w:t>
-      </w:r>
-      <w:r>
-        <w:t xml:space="preserve"> en Linux son los </w:t>
-      </w:r>
-      <w:r>
-        <w:rPr>
-          <w:rFonts w:ascii="Consolas" w:hAnsi="Consolas"/>
-          <w:sz w:val="20"/>
-        </w:rPr>
-        <w:t>.ko</w:t>
-      </w:r>
-      <w:r>
-        <w:t xml:space="preserve"> que están en </w:t>
-      </w:r>
-      <w:r>
-        <w:rPr>
-          <w:rFonts w:ascii="Consolas" w:hAnsi="Consolas"/>
-          <w:sz w:val="20"/>
-        </w:rPr>
-        <w:t>/lib/modules</w:t>
-      </w:r>
-      <w:r>
-        <w:t xml:space="preserve">. Se manejan con </w:t>
-      </w:r>
-      <w:r>
-        <w:rPr>
-          <w:rFonts w:ascii="Consolas" w:hAnsi="Consolas"/>
-          <w:sz w:val="20"/>
-        </w:rPr>
-        <w:t>lsmod</w:t>
-      </w:r>
-      <w:r>
-        <w:t xml:space="preserve">, </w:t>
-      </w:r>
-      <w:r>
-        <w:rPr>
-          <w:rFonts w:ascii="Consolas" w:hAnsi="Consolas"/>
-          <w:sz w:val="20"/>
-        </w:rPr>
-        <w:t>modprobe</w:t>
-      </w:r>
-      <w:r>
-        <w:t xml:space="preserve">, </w:t>
-      </w:r>
-      <w:r>
-        <w:rPr>
-          <w:rFonts w:ascii="Consolas" w:hAnsi="Consolas"/>
-          <w:sz w:val="20"/>
-        </w:rPr>
-        <w:t>modinfo</w:t>
-      </w:r>
-      <w:r>
-        <w:t xml:space="preserve"> y </w:t>
-      </w:r>
-      <w:r>
-        <w:rPr>
-          <w:rFonts w:ascii="Consolas" w:hAnsi="Consolas"/>
-          <w:sz w:val="20"/>
-        </w:rPr>
-        <w:t>depmod</w:t>
-      </w:r>
-      <w:r>
-        <w:t xml:space="preserve">. En FreeBSD están en </w:t>
-      </w:r>
-      <w:r>
-        <w:rPr>
-          <w:rFonts w:ascii="Consolas" w:hAnsi="Consolas"/>
-          <w:sz w:val="20"/>
-        </w:rPr>
-        <w:t>/boot/kernel</w:t>
-      </w:r>
-      <w:r>
-        <w:t xml:space="preserve"> y se cargan con </w:t>
-      </w:r>
-      <w:r>
-        <w:rPr>
-          <w:rFonts w:ascii="Consolas" w:hAnsi="Consolas"/>
-          <w:sz w:val="20"/>
-        </w:rPr>
-        <w:t>kldload</w:t>
-      </w:r>
-      <w:r>
-        <w:t>.</w:t>
-      </w:r>
-    </w:p>
-    <w:p>
-      <w:pPr>
-        <w:pStyle w:val="ListBullet"/>
-        <w:jc w:val="both"/>
-      </w:pPr>
-      <w:r>
-        <w:rPr>
-          <w:b/>
-        </w:rPr>
-        <w:t>Por qué compilar un kernel propio (FreeBSD):</w:t>
-      </w:r>
-    </w:p>
-    <w:p>
-      <w:pPr>
-        <w:pStyle w:val="ListBullet2"/>
-        <w:jc w:val="both"/>
-      </w:pPr>
-      <w:r>
-        <w:t>Arranca más rápido.</w:t>
-      </w:r>
-    </w:p>
-    <w:p>
-      <w:pPr>
-        <w:pStyle w:val="ListBullet2"/>
-        <w:jc w:val="both"/>
-      </w:pPr>
-      <w:r>
-        <w:t>Usa menos memoria.</w:t>
-      </w:r>
-    </w:p>
-    <w:p>
-      <w:pPr>
-        <w:pStyle w:val="ListBullet2"/>
-        <w:jc w:val="both"/>
-      </w:pPr>
-      <w:r>
-        <w:t>Permite soportar hardware que GENERIC no incluye.</w:t>
-      </w:r>
     </w:p>
     <w:p>
       <w:pPr>
@@ -1513,7 +1158,7 @@
         <w:tc>
           <w:tcPr>
             <w:tcW w:type="dxa" w:w="3135"/>
-            <w:shd w:val="clear" w:color="auto" w:fill="1B365D"/>
+            <w:shd w:val="clear" w:color="auto" w:fill="D9D9D9"/>
           </w:tcPr>
           <w:p>
             <w:pPr>
@@ -1522,7 +1167,7 @@
             <w:r>
               <w:rPr>
                 <w:b/>
-                <w:color w:val="FFFFFF"/>
+                <w:color w:val="000000"/>
                 <w:sz w:val="20"/>
               </w:rPr>
               <w:t>Tipo de kernel / diseño</w:t>
@@ -1532,7 +1177,7 @@
         <w:tc>
           <w:tcPr>
             <w:tcW w:type="dxa" w:w="3135"/>
-            <w:shd w:val="clear" w:color="auto" w:fill="1B365D"/>
+            <w:shd w:val="clear" w:color="auto" w:fill="D9D9D9"/>
           </w:tcPr>
           <w:p>
             <w:pPr>
@@ -1541,7 +1186,7 @@
             <w:r>
               <w:rPr>
                 <w:b/>
-                <w:color w:val="FFFFFF"/>
+                <w:color w:val="000000"/>
                 <w:sz w:val="20"/>
               </w:rPr>
               <w:t>SO que presento</w:t>
@@ -1551,7 +1196,7 @@
         <w:tc>
           <w:tcPr>
             <w:tcW w:type="dxa" w:w="3135"/>
-            <w:shd w:val="clear" w:color="auto" w:fill="1B365D"/>
+            <w:shd w:val="clear" w:color="auto" w:fill="D9D9D9"/>
           </w:tcPr>
           <w:p>
             <w:pPr>
@@ -1560,7 +1205,7 @@
             <w:r>
               <w:rPr>
                 <w:b/>
-                <w:color w:val="FFFFFF"/>
+                <w:color w:val="000000"/>
                 <w:sz w:val="20"/>
               </w:rPr>
               <w:t>Por qué encaja</w:t>
@@ -2018,7 +1663,7 @@
         <w:tc>
           <w:tcPr>
             <w:tcW w:type="dxa" w:w="2351"/>
-            <w:shd w:val="clear" w:color="auto" w:fill="1B365D"/>
+            <w:shd w:val="clear" w:color="auto" w:fill="D9D9D9"/>
           </w:tcPr>
           <w:p>
             <w:pPr>
@@ -2027,7 +1672,7 @@
             <w:r>
               <w:rPr>
                 <w:b/>
-                <w:color w:val="FFFFFF"/>
+                <w:color w:val="000000"/>
                 <w:sz w:val="20"/>
               </w:rPr>
               <w:t>Diseño</w:t>
@@ -2037,7 +1682,7 @@
         <w:tc>
           <w:tcPr>
             <w:tcW w:type="dxa" w:w="2351"/>
-            <w:shd w:val="clear" w:color="auto" w:fill="1B365D"/>
+            <w:shd w:val="clear" w:color="auto" w:fill="D9D9D9"/>
           </w:tcPr>
           <w:p>
             <w:pPr>
@@ -2046,7 +1691,7 @@
             <w:r>
               <w:rPr>
                 <w:b/>
-                <w:color w:val="FFFFFF"/>
+                <w:color w:val="000000"/>
                 <w:sz w:val="20"/>
               </w:rPr>
               <w:t>Rendimiento</w:t>
@@ -2056,7 +1701,7 @@
         <w:tc>
           <w:tcPr>
             <w:tcW w:type="dxa" w:w="2351"/>
-            <w:shd w:val="clear" w:color="auto" w:fill="1B365D"/>
+            <w:shd w:val="clear" w:color="auto" w:fill="D9D9D9"/>
           </w:tcPr>
           <w:p>
             <w:pPr>
@@ -2065,7 +1710,7 @@
             <w:r>
               <w:rPr>
                 <w:b/>
-                <w:color w:val="FFFFFF"/>
+                <w:color w:val="000000"/>
                 <w:sz w:val="20"/>
               </w:rPr>
               <w:t>Robustez</w:t>
@@ -2075,7 +1720,7 @@
         <w:tc>
           <w:tcPr>
             <w:tcW w:type="dxa" w:w="2351"/>
-            <w:shd w:val="clear" w:color="auto" w:fill="1B365D"/>
+            <w:shd w:val="clear" w:color="auto" w:fill="D9D9D9"/>
           </w:tcPr>
           <w:p>
             <w:pPr>
@@ -2084,7 +1729,7 @@
             <w:r>
               <w:rPr>
                 <w:b/>
-                <w:color w:val="FFFFFF"/>
+                <w:color w:val="000000"/>
                 <w:sz w:val="20"/>
               </w:rPr>
               <w:t>Facilidad de extender</w:t>
@@ -2805,7 +2450,7 @@
         <w:tc>
           <w:tcPr>
             <w:tcW w:type="dxa" w:w="3135"/>
-            <w:shd w:val="clear" w:color="auto" w:fill="1B365D"/>
+            <w:shd w:val="clear" w:color="auto" w:fill="D9D9D9"/>
           </w:tcPr>
           <w:p>
             <w:pPr>
@@ -2814,7 +2459,7 @@
             <w:r>
               <w:rPr>
                 <w:b/>
-                <w:color w:val="FFFFFF"/>
+                <w:color w:val="000000"/>
                 <w:sz w:val="20"/>
               </w:rPr>
               <w:t>SO</w:t>
@@ -2824,7 +2469,7 @@
         <w:tc>
           <w:tcPr>
             <w:tcW w:type="dxa" w:w="3135"/>
-            <w:shd w:val="clear" w:color="auto" w:fill="1B365D"/>
+            <w:shd w:val="clear" w:color="auto" w:fill="D9D9D9"/>
           </w:tcPr>
           <w:p>
             <w:pPr>
@@ -2833,7 +2478,7 @@
             <w:r>
               <w:rPr>
                 <w:b/>
-                <w:color w:val="FFFFFF"/>
+                <w:color w:val="000000"/>
                 <w:sz w:val="20"/>
               </w:rPr>
               <w:t>Tipo de kernel</w:t>
@@ -2843,7 +2488,7 @@
         <w:tc>
           <w:tcPr>
             <w:tcW w:type="dxa" w:w="3135"/>
-            <w:shd w:val="clear" w:color="auto" w:fill="1B365D"/>
+            <w:shd w:val="clear" w:color="auto" w:fill="D9D9D9"/>
           </w:tcPr>
           <w:p>
             <w:pPr>
@@ -2852,7 +2497,7 @@
             <w:r>
               <w:rPr>
                 <w:b/>
-                <w:color w:val="FFFFFF"/>
+                <w:color w:val="000000"/>
                 <w:sz w:val="20"/>
               </w:rPr>
               <w:t>Comentario</w:t>
@@ -3116,7 +2761,7 @@
         <w:tc>
           <w:tcPr>
             <w:tcW w:type="dxa" w:w="3135"/>
-            <w:shd w:val="clear" w:color="auto" w:fill="1B365D"/>
+            <w:shd w:val="clear" w:color="auto" w:fill="D9D9D9"/>
           </w:tcPr>
           <w:p>
             <w:pPr>
@@ -3125,7 +2770,7 @@
             <w:r>
               <w:rPr>
                 <w:b/>
-                <w:color w:val="FFFFFF"/>
+                <w:color w:val="000000"/>
                 <w:sz w:val="20"/>
               </w:rPr>
               <w:t>SO</w:t>
@@ -3135,7 +2780,7 @@
         <w:tc>
           <w:tcPr>
             <w:tcW w:type="dxa" w:w="3135"/>
-            <w:shd w:val="clear" w:color="auto" w:fill="1B365D"/>
+            <w:shd w:val="clear" w:color="auto" w:fill="D9D9D9"/>
           </w:tcPr>
           <w:p>
             <w:pPr>
@@ -3144,7 +2789,7 @@
             <w:r>
               <w:rPr>
                 <w:b/>
-                <w:color w:val="FFFFFF"/>
+                <w:color w:val="000000"/>
                 <w:sz w:val="20"/>
               </w:rPr>
               <w:t>Tipo de kernel</w:t>
@@ -3154,7 +2799,7 @@
         <w:tc>
           <w:tcPr>
             <w:tcW w:type="dxa" w:w="3135"/>
-            <w:shd w:val="clear" w:color="auto" w:fill="1B365D"/>
+            <w:shd w:val="clear" w:color="auto" w:fill="D9D9D9"/>
           </w:tcPr>
           <w:p>
             <w:pPr>
@@ -3163,7 +2808,7 @@
             <w:r>
               <w:rPr>
                 <w:b/>
-                <w:color w:val="FFFFFF"/>
+                <w:color w:val="000000"/>
                 <w:sz w:val="20"/>
               </w:rPr>
               <w:t>Comentario</w:t>
@@ -4329,40 +3974,6 @@
         <w:t>. La compilación tardó más de una hora aun con 6 CPU, lo que confirma lo que decía la diapositiva 35 sobre que compilar un kernel lleva su tiempo.</w:t>
       </w:r>
     </w:p>
-    <w:p>
-      <w:pPr>
-        <w:pStyle w:val="Heading2"/>
-      </w:pPr>
-      <w:r>
-        <w:t>5. Lo que aprendí</w:t>
-      </w:r>
-    </w:p>
-    <w:p>
-      <w:pPr>
-        <w:jc w:val="both"/>
-      </w:pPr>
-      <w:r>
-        <w:t xml:space="preserve">Lo que más me quedó es que el kernel no es "el sistema operativo" completo, sino la parte que controla CPU, memoria y dispositivos. Cambiar de un kernel monolítico a un micronúcleo es un problema de equilibrio entre </w:t>
-      </w:r>
-      <w:r>
-        <w:rPr>
-          <w:b/>
-        </w:rPr>
-        <w:t>velocidad</w:t>
-      </w:r>
-      <w:r>
-        <w:t xml:space="preserve"> y </w:t>
-      </w:r>
-      <w:r>
-        <w:rPr>
-          <w:b/>
-        </w:rPr>
-        <w:t>robustez</w:t>
-      </w:r>
-      <w:r>
-        <w:t>. Compilar un kernel propio tiene sentido cuando se necesita quitar lo que sobra o agregar hardware específico. Para lo demás, alcanza con cargar un módulo.</w:t>
-      </w:r>
-    </w:p>
     <w:sectPr>
       <w:pgSz w:w="12240" w:h="15840"/>
       <w:pgMar w:top="1417" w:right="1417" w:bottom="1417" w:left="1417" w:header="720" w:footer="720" w:gutter="0"/>
@@ -4740,7 +4351,7 @@
       <w:spacing w:line="276" w:lineRule="auto" w:after="120"/>
     </w:pPr>
     <w:rPr>
-      <w:rFonts w:ascii="Calibri" w:hAnsi="Calibri" w:eastAsia="Calibri" w:cs="Calibri"/>
+      <w:rFonts w:ascii="Arial" w:hAnsi="Arial" w:eastAsia="Arial" w:cs="Arial"/>
       <w:sz w:val="22"/>
     </w:rPr>
   </w:style>
@@ -4803,10 +4414,10 @@
       <w:outlineLvl w:val="0"/>
     </w:pPr>
     <w:rPr>
-      <w:rFonts w:ascii="Calibri" w:hAnsi="Calibri" w:eastAsia="Calibri" w:cs="Calibri"/>
+      <w:rFonts w:ascii="Arial" w:hAnsi="Arial" w:eastAsia="Arial" w:cs="Arial"/>
       <w:b/>
       <w:bCs/>
-      <w:color w:val="1B365D"/>
+      <w:color w:val="000000"/>
       <w:sz w:val="28"/>
       <w:szCs w:val="28"/>
     </w:rPr>
@@ -4827,10 +4438,10 @@
       <w:outlineLvl w:val="1"/>
     </w:pPr>
     <w:rPr>
-      <w:rFonts w:ascii="Calibri" w:hAnsi="Calibri" w:eastAsia="Calibri" w:cs="Calibri"/>
+      <w:rFonts w:ascii="Arial" w:hAnsi="Arial" w:eastAsia="Arial" w:cs="Arial"/>
       <w:b/>
       <w:bCs/>
-      <w:color w:val="1B365D"/>
+      <w:color w:val="000000"/>
       <w:sz w:val="24"/>
       <w:szCs w:val="26"/>
     </w:rPr>
@@ -4851,10 +4462,10 @@
       <w:outlineLvl w:val="2"/>
     </w:pPr>
     <w:rPr>
-      <w:rFonts w:ascii="Calibri" w:hAnsi="Calibri" w:eastAsia="Calibri" w:cs="Calibri"/>
+      <w:rFonts w:ascii="Arial" w:hAnsi="Arial" w:eastAsia="Arial" w:cs="Arial"/>
       <w:b/>
       <w:bCs/>
-      <w:color w:val="1B365D"/>
+      <w:color w:val="000000"/>
       <w:sz w:val="22"/>
     </w:rPr>
   </w:style>
@@ -5275,7 +4886,7 @@
       <w:contextualSpacing/>
     </w:pPr>
     <w:rPr>
-      <w:rFonts w:ascii="Calibri" w:hAnsi="Calibri" w:eastAsia="Calibri" w:cs="Calibri"/>
+      <w:rFonts w:ascii="Arial" w:hAnsi="Arial" w:eastAsia="Arial" w:cs="Arial"/>
       <w:sz w:val="22"/>
     </w:rPr>
   </w:style>
@@ -5293,7 +4904,7 @@
       <w:contextualSpacing/>
     </w:pPr>
     <w:rPr>
-      <w:rFonts w:ascii="Calibri" w:hAnsi="Calibri" w:eastAsia="Calibri" w:cs="Calibri"/>
+      <w:rFonts w:ascii="Arial" w:hAnsi="Arial" w:eastAsia="Arial" w:cs="Arial"/>
       <w:sz w:val="22"/>
     </w:rPr>
   </w:style>
@@ -5324,7 +4935,7 @@
       <w:contextualSpacing/>
     </w:pPr>
     <w:rPr>
-      <w:rFonts w:ascii="Calibri" w:hAnsi="Calibri" w:eastAsia="Calibri" w:cs="Calibri"/>
+      <w:rFonts w:ascii="Arial" w:hAnsi="Arial" w:eastAsia="Arial" w:cs="Arial"/>
       <w:sz w:val="22"/>
     </w:rPr>
   </w:style>

</xml_diff>

<commit_message>
documento final solo con lo requerido
</commit_message>
<xml_diff>
--- a/ClaseSEPTIEMBRE2826.docx
+++ b/ClaseSEPTIEMBRE2826.docx
@@ -11,7 +11,6 @@
         <w:rPr>
           <w:b/>
           <w:color w:val="000000"/>
-          <w:sz w:val="22"/>
         </w:rPr>
         <w:t>Universidad Autónoma de Occidente (UAO)</w:t>
       </w:r>
@@ -25,7 +24,6 @@
         <w:rPr>
           <w:b w:val="0"/>
           <w:color w:val="000000"/>
-          <w:sz w:val="22"/>
         </w:rPr>
         <w:t>Facultad de Ingeniería — Sistemas Operativos</w:t>
       </w:r>
@@ -39,7 +37,6 @@
         <w:rPr>
           <w:b w:val="0"/>
           <w:color w:val="000000"/>
-          <w:sz w:val="22"/>
         </w:rPr>
         <w:t>Taller de Kernel — 28 de Septiembre</w:t>
       </w:r>
@@ -53,7 +50,6 @@
         <w:rPr>
           <w:b w:val="0"/>
           <w:color w:val="000000"/>
-          <w:sz w:val="22"/>
         </w:rPr>
         <w:t>Estudiante: Sergio Gómez Quiñones</w:t>
       </w:r>
@@ -63,7 +59,6 @@
         <w:pBdr>
           <w:bottom w:val="single" w:sz="12" w:space="1" w:color="000000"/>
         </w:pBdr>
-        <w:spacing w:after="200"/>
       </w:pPr>
     </w:p>
     <w:p>
@@ -79,7 +74,7 @@
         <w:pStyle w:val="Heading3"/>
       </w:pPr>
       <w:r>
-        <w:t>1.1 Identificar el sistema (diapositiva 38)</w:t>
+        <w:t>1.1 Identificar el sistema</w:t>
       </w:r>
     </w:p>
     <w:p>
@@ -87,13 +82,13 @@
         <w:jc w:val="both"/>
       </w:pPr>
       <w:r>
-        <w:t>Estos tres comandos me dicen con qué sistema estoy trabajando antes de tocar el kernel.</w:t>
+        <w:t>Estos tres comandos permiten identificar el sistema antes de compilar el kernel:</w:t>
       </w:r>
     </w:p>
     <w:p>
       <w:pPr>
         <w:spacing w:line="240" w:lineRule="auto" w:before="80" w:after="160"/>
-        <w:ind w:left="113" w:right="113"/>
+        <w:ind w:left="283" w:right="113"/>
         <w:shd w:val="clear" w:color="auto" w:fill="F4F4F4"/>
         <w:pBdr>
           <w:top w:val="single" w:sz="4" w:space="4" w:color="DDDDDD"/>
@@ -105,6 +100,7 @@
       <w:r>
         <w:rPr>
           <w:rFonts w:ascii="Consolas" w:hAnsi="Consolas"/>
+          <w:color w:val="000000"/>
           <w:sz w:val="19"/>
         </w:rPr>
         <w:t>cat /etc/os-release</w:t>
@@ -113,6 +109,7 @@
       <w:r>
         <w:rPr>
           <w:rFonts w:ascii="Consolas" w:hAnsi="Consolas"/>
+          <w:color w:val="000000"/>
           <w:sz w:val="19"/>
         </w:rPr>
         <w:t>freebsd-version -u -k -r</w:t>
@@ -121,6 +118,7 @@
       <w:r>
         <w:rPr>
           <w:rFonts w:ascii="Consolas" w:hAnsi="Consolas"/>
+          <w:color w:val="000000"/>
           <w:sz w:val="19"/>
         </w:rPr>
         <w:t>getconf LONG_BIT</w:t>
@@ -128,219 +126,16 @@
     </w:p>
     <w:p>
       <w:pPr>
-        <w:jc w:val="both"/>
-      </w:pPr>
-      <w:r>
-        <w:rPr>
-          <w:b/>
-        </w:rPr>
-        <w:t>Paso a paso:</w:t>
-      </w:r>
-    </w:p>
-    <w:p>
-      <w:pPr>
-        <w:tabs>
-          <w:tab w:pos="510" w:val="left"/>
-        </w:tabs>
-        <w:ind w:left="510" w:hanging="340"/>
-        <w:jc w:val="both"/>
-      </w:pPr>
-      <w:r>
-        <w:t>1.</w:t>
-        <w:tab/>
-      </w:r>
-      <w:r>
-        <w:rPr>
-          <w:rFonts w:ascii="Consolas" w:hAnsi="Consolas"/>
-          <w:sz w:val="20"/>
-        </w:rPr>
-        <w:t>cat /etc/os-release</w:t>
-      </w:r>
-      <w:r>
-        <w:t xml:space="preserve"> muestra el nombre y la versión de la distribución, en este caso FreeBSD. Sirve para confirmar el SO.</w:t>
-      </w:r>
-    </w:p>
-    <w:p>
-      <w:pPr>
-        <w:tabs>
-          <w:tab w:pos="510" w:val="left"/>
-        </w:tabs>
-        <w:ind w:left="510" w:hanging="340"/>
-        <w:jc w:val="both"/>
-      </w:pPr>
-      <w:r>
-        <w:t>2.</w:t>
-        <w:tab/>
-      </w:r>
-      <w:r>
-        <w:rPr>
-          <w:rFonts w:ascii="Consolas" w:hAnsi="Consolas"/>
-          <w:sz w:val="20"/>
-        </w:rPr>
-        <w:t>freebsd-version -u -k -r</w:t>
-      </w:r>
-      <w:r>
-        <w:t xml:space="preserve"> imprime tres versiones:</w:t>
-      </w:r>
-    </w:p>
-    <w:p>
-      <w:pPr>
-        <w:pStyle w:val="ListBullet2"/>
-        <w:jc w:val="both"/>
-      </w:pPr>
-      <w:r>
-        <w:rPr>
-          <w:rFonts w:ascii="Consolas" w:hAnsi="Consolas"/>
-          <w:sz w:val="20"/>
-        </w:rPr>
-        <w:t>-u</w:t>
-      </w:r>
-      <w:r>
-        <w:t xml:space="preserve"> es la versión de </w:t>
-      </w:r>
-      <w:r>
-        <w:rPr>
-          <w:b/>
-        </w:rPr>
-        <w:t>userland</w:t>
-      </w:r>
-      <w:r>
-        <w:t>, o sea las herramientas del espacio de usuario.</w:t>
-      </w:r>
-    </w:p>
-    <w:p>
-      <w:pPr>
-        <w:pStyle w:val="ListBullet2"/>
-        <w:jc w:val="both"/>
-      </w:pPr>
-      <w:r>
-        <w:rPr>
-          <w:rFonts w:ascii="Consolas" w:hAnsi="Consolas"/>
-          <w:sz w:val="20"/>
-        </w:rPr>
-        <w:t>-k</w:t>
-      </w:r>
-      <w:r>
-        <w:t xml:space="preserve"> es la versión del </w:t>
-      </w:r>
-      <w:r>
-        <w:rPr>
-          <w:b/>
-        </w:rPr>
-        <w:t>kernel instalado</w:t>
-      </w:r>
-      <w:r>
-        <w:t>.</w:t>
-      </w:r>
-    </w:p>
-    <w:p>
-      <w:pPr>
-        <w:pStyle w:val="ListBullet2"/>
-        <w:jc w:val="both"/>
-      </w:pPr>
-      <w:r>
-        <w:rPr>
-          <w:rFonts w:ascii="Consolas" w:hAnsi="Consolas"/>
-          <w:sz w:val="20"/>
-        </w:rPr>
-        <w:t>-r</w:t>
-      </w:r>
-      <w:r>
-        <w:t xml:space="preserve"> es la versión del </w:t>
-      </w:r>
-      <w:r>
-        <w:rPr>
-          <w:b/>
-        </w:rPr>
-        <w:t>kernel que está corriendo</w:t>
-      </w:r>
-      <w:r>
-        <w:t xml:space="preserve"> ahora.</w:t>
-      </w:r>
-    </w:p>
-    <w:p>
-      <w:pPr>
-        <w:jc w:val="both"/>
-      </w:pPr>
-      <w:r>
-        <w:t xml:space="preserve">   Si </w:t>
-      </w:r>
-      <w:r>
-        <w:rPr>
-          <w:rFonts w:ascii="Consolas" w:hAnsi="Consolas"/>
-          <w:sz w:val="20"/>
-        </w:rPr>
-        <w:t>-k</w:t>
-      </w:r>
-      <w:r>
-        <w:t xml:space="preserve"> y </w:t>
-      </w:r>
-      <w:r>
-        <w:rPr>
-          <w:rFonts w:ascii="Consolas" w:hAnsi="Consolas"/>
-          <w:sz w:val="20"/>
-        </w:rPr>
-        <w:t>-r</w:t>
-      </w:r>
-      <w:r>
-        <w:t xml:space="preserve"> son distintas, instalé un kernel nuevo y todavía no reinicié. Esto lo voy a usar al final para comprobar que la instalación funcionó.</w:t>
-      </w:r>
-    </w:p>
-    <w:p>
-      <w:pPr>
-        <w:tabs>
-          <w:tab w:pos="510" w:val="left"/>
-        </w:tabs>
-        <w:ind w:left="510" w:hanging="340"/>
-        <w:jc w:val="both"/>
-      </w:pPr>
-      <w:r>
-        <w:t>3.</w:t>
-        <w:tab/>
-      </w:r>
-      <w:r>
-        <w:rPr>
-          <w:rFonts w:ascii="Consolas" w:hAnsi="Consolas"/>
-          <w:sz w:val="20"/>
-        </w:rPr>
-        <w:t>getconf LONG_BIT</w:t>
-      </w:r>
-      <w:r>
-        <w:t xml:space="preserve"> devuelve </w:t>
-      </w:r>
-      <w:r>
-        <w:rPr>
-          <w:rFonts w:ascii="Consolas" w:hAnsi="Consolas"/>
-          <w:sz w:val="20"/>
-        </w:rPr>
-        <w:t>32</w:t>
-      </w:r>
-      <w:r>
-        <w:t xml:space="preserve"> o </w:t>
-      </w:r>
-      <w:r>
-        <w:rPr>
-          <w:rFonts w:ascii="Consolas" w:hAnsi="Consolas"/>
-          <w:sz w:val="20"/>
-        </w:rPr>
-        <w:t>64</w:t>
-      </w:r>
-      <w:r>
-        <w:t>. Me dice la arquitectura de bits, y eso decide la carpeta de configuración del kernel (ver la nota del paso 1).</w:t>
-      </w:r>
-    </w:p>
-    <w:p>
-      <w:pPr>
         <w:pStyle w:val="Heading3"/>
       </w:pPr>
       <w:r>
-        <w:t>1.2 Configurar el kernel (diapositiva 39)</w:t>
+        <w:t>1.2 Configurar el kernel</w:t>
       </w:r>
     </w:p>
     <w:p>
       <w:pPr>
         <w:spacing w:line="240" w:lineRule="auto" w:before="80" w:after="160"/>
-        <w:ind w:left="113" w:right="113"/>
+        <w:ind w:left="283" w:right="113"/>
         <w:shd w:val="clear" w:color="auto" w:fill="F4F4F4"/>
         <w:pBdr>
           <w:top w:val="single" w:sz="4" w:space="4" w:color="DDDDDD"/>
@@ -352,14 +147,16 @@
       <w:r>
         <w:rPr>
           <w:rFonts w:ascii="Consolas" w:hAnsi="Consolas"/>
+          <w:color w:val="000000"/>
           <w:sz w:val="19"/>
         </w:rPr>
-        <w:t>cd /usr/src/sys/i386/conf</w:t>
+        <w:t>cd /usr/src/sys/amd64/conf</w:t>
         <w:br/>
       </w:r>
       <w:r>
         <w:rPr>
           <w:rFonts w:ascii="Consolas" w:hAnsi="Consolas"/>
+          <w:color w:val="000000"/>
           <w:sz w:val="19"/>
         </w:rPr>
         <w:t>mkdir /root/kernels</w:t>
@@ -368,6 +165,7 @@
       <w:r>
         <w:rPr>
           <w:rFonts w:ascii="Consolas" w:hAnsi="Consolas"/>
+          <w:color w:val="000000"/>
           <w:sz w:val="19"/>
         </w:rPr>
         <w:t>cp GENERIC /root/kernels/CLASEKERN</w:t>
@@ -376,6 +174,7 @@
       <w:r>
         <w:rPr>
           <w:rFonts w:ascii="Consolas" w:hAnsi="Consolas"/>
+          <w:color w:val="000000"/>
           <w:sz w:val="19"/>
         </w:rPr>
         <w:t>ln -s /root/kernels/CLASEKERN</w:t>
@@ -383,321 +182,16 @@
     </w:p>
     <w:p>
       <w:pPr>
-        <w:jc w:val="both"/>
-      </w:pPr>
-      <w:r>
-        <w:rPr>
-          <w:b/>
-        </w:rPr>
-        <w:t>Paso a paso:</w:t>
-      </w:r>
-    </w:p>
-    <w:p>
-      <w:pPr>
-        <w:tabs>
-          <w:tab w:pos="510" w:val="left"/>
-        </w:tabs>
-        <w:ind w:left="510" w:hanging="340"/>
-        <w:jc w:val="both"/>
-      </w:pPr>
-      <w:r>
-        <w:t>1.</w:t>
-        <w:tab/>
-      </w:r>
-      <w:r>
-        <w:rPr>
-          <w:rFonts w:ascii="Consolas" w:hAnsi="Consolas"/>
-          <w:sz w:val="20"/>
-        </w:rPr>
-        <w:t>cd /usr/src/sys/i386/conf</w:t>
-      </w:r>
-      <w:r>
-        <w:t xml:space="preserve"> entra a la carpeta donde vive el archivo de configuración del kernel. Todo el código del kernel está en </w:t>
-      </w:r>
-      <w:r>
-        <w:rPr>
-          <w:rFonts w:ascii="Consolas" w:hAnsi="Consolas"/>
-          <w:sz w:val="20"/>
-        </w:rPr>
-        <w:t>/usr/src/sys</w:t>
-      </w:r>
-      <w:r>
-        <w:t>.</w:t>
-      </w:r>
-    </w:p>
-    <w:p>
-      <w:pPr>
-        <w:pStyle w:val="ListBullet2"/>
-        <w:jc w:val="both"/>
-      </w:pPr>
-      <w:r>
-        <w:rPr>
-          <w:b/>
-        </w:rPr>
-        <w:t>Ojo:</w:t>
-      </w:r>
-      <w:r>
-        <w:t xml:space="preserve"> </w:t>
-      </w:r>
-      <w:r>
-        <w:rPr>
-          <w:rFonts w:ascii="Consolas" w:hAnsi="Consolas"/>
-          <w:sz w:val="20"/>
-        </w:rPr>
-        <w:t>i386</w:t>
-      </w:r>
-      <w:r>
-        <w:t xml:space="preserve"> es para 32 bits. Si </w:t>
-      </w:r>
-      <w:r>
-        <w:rPr>
-          <w:rFonts w:ascii="Consolas" w:hAnsi="Consolas"/>
-          <w:sz w:val="20"/>
-        </w:rPr>
-        <w:t>getconf LONG_BIT</w:t>
-      </w:r>
-      <w:r>
-        <w:t xml:space="preserve"> dio 64, la ruta es </w:t>
-      </w:r>
-      <w:r>
-        <w:rPr>
-          <w:rFonts w:ascii="Consolas" w:hAnsi="Consolas"/>
-          <w:sz w:val="20"/>
-        </w:rPr>
-        <w:t>/usr/src/sys/amd64/conf</w:t>
-      </w:r>
-      <w:r>
-        <w:t>. La diapositiva 37 explica que el directorio depende de la arquitectura.</w:t>
-      </w:r>
-    </w:p>
-    <w:p>
-      <w:pPr>
-        <w:pStyle w:val="ListBullet2"/>
-        <w:jc w:val="both"/>
-      </w:pPr>
-      <w:r>
-        <w:t xml:space="preserve">Si </w:t>
-      </w:r>
-      <w:r>
-        <w:rPr>
-          <w:rFonts w:ascii="Consolas" w:hAnsi="Consolas"/>
-          <w:sz w:val="20"/>
-        </w:rPr>
-        <w:t>/usr/src/sys</w:t>
-      </w:r>
-      <w:r>
-        <w:t xml:space="preserve"> no existe, no están instaladas las fuentes del kernel y hay que instalarlas primero (la diapositiva 37 lo explica con </w:t>
-      </w:r>
-      <w:r>
-        <w:rPr>
-          <w:rFonts w:ascii="Consolas" w:hAnsi="Consolas"/>
-          <w:sz w:val="20"/>
-        </w:rPr>
-        <w:t>sysinstall</w:t>
-      </w:r>
-      <w:r>
-        <w:t xml:space="preserve">; en versiones nuevas se instalan con el set </w:t>
-      </w:r>
-      <w:r>
-        <w:rPr>
-          <w:rFonts w:ascii="Consolas" w:hAnsi="Consolas"/>
-          <w:sz w:val="20"/>
-        </w:rPr>
-        <w:t>src</w:t>
-      </w:r>
-      <w:r>
-        <w:t>).</w:t>
-      </w:r>
-    </w:p>
-    <w:p>
-      <w:pPr>
-        <w:tabs>
-          <w:tab w:pos="510" w:val="left"/>
-        </w:tabs>
-        <w:ind w:left="510" w:hanging="340"/>
-        <w:jc w:val="both"/>
-      </w:pPr>
-      <w:r>
-        <w:t>2.</w:t>
-        <w:tab/>
-      </w:r>
-      <w:r>
-        <w:rPr>
-          <w:rFonts w:ascii="Consolas" w:hAnsi="Consolas"/>
-          <w:sz w:val="20"/>
-        </w:rPr>
-        <w:t>mkdir /root/kernels</w:t>
-      </w:r>
-      <w:r>
-        <w:t xml:space="preserve"> crea una carpeta </w:t>
-      </w:r>
-      <w:r>
-        <w:rPr>
-          <w:b/>
-        </w:rPr>
-        <w:t>fuera</w:t>
-      </w:r>
-      <w:r>
-        <w:t xml:space="preserve"> del árbol de fuentes para guardar mi configuración. Así una actualización de </w:t>
-      </w:r>
-      <w:r>
-        <w:rPr>
-          <w:rFonts w:ascii="Consolas" w:hAnsi="Consolas"/>
-          <w:sz w:val="20"/>
-        </w:rPr>
-        <w:t>/usr/src</w:t>
-      </w:r>
-      <w:r>
-        <w:t xml:space="preserve"> no la borra.</w:t>
-      </w:r>
-    </w:p>
-    <w:p>
-      <w:pPr>
-        <w:tabs>
-          <w:tab w:pos="510" w:val="left"/>
-        </w:tabs>
-        <w:ind w:left="510" w:hanging="340"/>
-        <w:jc w:val="both"/>
-      </w:pPr>
-      <w:r>
-        <w:t>3.</w:t>
-        <w:tab/>
-      </w:r>
-      <w:r>
-        <w:rPr>
-          <w:rFonts w:ascii="Consolas" w:hAnsi="Consolas"/>
-          <w:sz w:val="20"/>
-        </w:rPr>
-        <w:t>cp GENERIC /root/kernels/CLASEKERN</w:t>
-      </w:r>
-      <w:r>
-        <w:t xml:space="preserve"> copia la configuración genérica, que soporta mucho hardware, con el nombre de mi kernel. </w:t>
-      </w:r>
-      <w:r>
-        <w:rPr>
-          <w:rFonts w:ascii="Consolas" w:hAnsi="Consolas"/>
-          <w:sz w:val="20"/>
-        </w:rPr>
-        <w:t>CLASEKERN</w:t>
-      </w:r>
-      <w:r>
-        <w:t xml:space="preserve"> es el nombre que usaré al compilar. Aquí es donde se personaliza: se quitan los dispositivos que no tengo y se dejan solo los necesarios (línea </w:t>
-      </w:r>
-      <w:r>
-        <w:rPr>
-          <w:rFonts w:ascii="Consolas" w:hAnsi="Consolas"/>
-          <w:sz w:val="20"/>
-        </w:rPr>
-        <w:t>cpu</w:t>
-      </w:r>
-      <w:r>
-        <w:t xml:space="preserve">, </w:t>
-      </w:r>
-      <w:r>
-        <w:rPr>
-          <w:rFonts w:ascii="Consolas" w:hAnsi="Consolas"/>
-          <w:sz w:val="20"/>
-        </w:rPr>
-        <w:t>machine</w:t>
-      </w:r>
-      <w:r>
-        <w:t>, etc.).</w:t>
-      </w:r>
-    </w:p>
-    <w:p>
-      <w:pPr>
-        <w:tabs>
-          <w:tab w:pos="510" w:val="left"/>
-        </w:tabs>
-        <w:ind w:left="510" w:hanging="340"/>
-        <w:jc w:val="both"/>
-      </w:pPr>
-      <w:r>
-        <w:t>4.</w:t>
-        <w:tab/>
-      </w:r>
-      <w:r>
-        <w:rPr>
-          <w:rFonts w:ascii="Consolas" w:hAnsi="Consolas"/>
-          <w:sz w:val="20"/>
-        </w:rPr>
-        <w:t>ln -s /root/kernels/CLASEKERN</w:t>
-      </w:r>
-      <w:r>
-        <w:t xml:space="preserve"> crea un </w:t>
-      </w:r>
-      <w:r>
-        <w:rPr>
-          <w:b/>
-        </w:rPr>
-        <w:t>enlace simbólico</w:t>
-      </w:r>
-      <w:r>
-        <w:t xml:space="preserve"> en la carpeta actual (</w:t>
-      </w:r>
-      <w:r>
-        <w:rPr>
-          <w:rFonts w:ascii="Consolas" w:hAnsi="Consolas"/>
-          <w:sz w:val="20"/>
-        </w:rPr>
-        <w:t>.../conf</w:t>
-      </w:r>
-      <w:r>
-        <w:t xml:space="preserve">) apuntando a mi archivo. Así </w:t>
-      </w:r>
-      <w:r>
-        <w:rPr>
-          <w:rFonts w:ascii="Consolas" w:hAnsi="Consolas"/>
-          <w:sz w:val="20"/>
-        </w:rPr>
-        <w:t>make</w:t>
-      </w:r>
-      <w:r>
-        <w:t xml:space="preserve"> encuentra </w:t>
-      </w:r>
-      <w:r>
-        <w:rPr>
-          <w:rFonts w:ascii="Consolas" w:hAnsi="Consolas"/>
-          <w:sz w:val="20"/>
-        </w:rPr>
-        <w:t>CLASEKERN</w:t>
-      </w:r>
-      <w:r>
-        <w:t xml:space="preserve"> en </w:t>
-      </w:r>
-      <w:r>
-        <w:rPr>
-          <w:rFonts w:ascii="Consolas" w:hAnsi="Consolas"/>
-          <w:sz w:val="20"/>
-        </w:rPr>
-        <w:t>conf/</w:t>
-      </w:r>
-      <w:r>
-        <w:t xml:space="preserve">, pero el archivo real queda protegido en </w:t>
-      </w:r>
-      <w:r>
-        <w:rPr>
-          <w:rFonts w:ascii="Consolas" w:hAnsi="Consolas"/>
-          <w:sz w:val="20"/>
-        </w:rPr>
-        <w:t>/root/kernels</w:t>
-      </w:r>
-      <w:r>
-        <w:t>.</w:t>
-      </w:r>
-    </w:p>
-    <w:p>
-      <w:pPr>
         <w:pStyle w:val="Heading3"/>
       </w:pPr>
       <w:r>
-        <w:t>1.3 Compilar e instalar (diapositiva 39)</w:t>
+        <w:t>1.3 Compilar e instalar</w:t>
       </w:r>
     </w:p>
     <w:p>
       <w:pPr>
         <w:spacing w:line="240" w:lineRule="auto" w:before="80" w:after="160"/>
-        <w:ind w:left="113" w:right="113"/>
+        <w:ind w:left="283" w:right="113"/>
         <w:shd w:val="clear" w:color="auto" w:fill="F4F4F4"/>
         <w:pBdr>
           <w:top w:val="single" w:sz="4" w:space="4" w:color="DDDDDD"/>
@@ -709,6 +203,7 @@
       <w:r>
         <w:rPr>
           <w:rFonts w:ascii="Consolas" w:hAnsi="Consolas"/>
+          <w:color w:val="000000"/>
           <w:sz w:val="19"/>
         </w:rPr>
         <w:t>cd /usr/src</w:t>
@@ -717,6 +212,7 @@
       <w:r>
         <w:rPr>
           <w:rFonts w:ascii="Consolas" w:hAnsi="Consolas"/>
+          <w:color w:val="000000"/>
           <w:sz w:val="19"/>
         </w:rPr>
         <w:t>make buildkernel KERNCONF=CLASEKERN</w:t>
@@ -725,211 +221,7 @@
       <w:r>
         <w:rPr>
           <w:rFonts w:ascii="Consolas" w:hAnsi="Consolas"/>
-          <w:sz w:val="19"/>
-        </w:rPr>
-        <w:t>make installkernel KERNCONF=CLASEKERN</w:t>
-        <w:br/>
-      </w:r>
-      <w:r>
-        <w:rPr>
-          <w:rFonts w:ascii="Consolas" w:hAnsi="Consolas"/>
-          <w:sz w:val="19"/>
-        </w:rPr>
-        <w:t>init 6</w:t>
-      </w:r>
-    </w:p>
-    <w:p>
-      <w:pPr>
-        <w:jc w:val="both"/>
-      </w:pPr>
-      <w:r>
-        <w:rPr>
-          <w:b/>
-        </w:rPr>
-        <w:t>Paso a paso:</w:t>
-      </w:r>
-    </w:p>
-    <w:p>
-      <w:pPr>
-        <w:tabs>
-          <w:tab w:pos="510" w:val="left"/>
-        </w:tabs>
-        <w:ind w:left="510" w:hanging="340"/>
-        <w:jc w:val="both"/>
-      </w:pPr>
-      <w:r>
-        <w:t>1.</w:t>
-        <w:tab/>
-      </w:r>
-      <w:r>
-        <w:rPr>
-          <w:rFonts w:ascii="Consolas" w:hAnsi="Consolas"/>
-          <w:sz w:val="20"/>
-        </w:rPr>
-        <w:t>cd /usr/src</w:t>
-      </w:r>
-      <w:r>
-        <w:t xml:space="preserve"> es necesario porque el </w:t>
-      </w:r>
-      <w:r>
-        <w:rPr>
-          <w:rFonts w:ascii="Consolas" w:hAnsi="Consolas"/>
-          <w:sz w:val="20"/>
-        </w:rPr>
-        <w:t>Makefile</w:t>
-      </w:r>
-      <w:r>
-        <w:t xml:space="preserve"> que gestiona la compilación está ahí.</w:t>
-      </w:r>
-    </w:p>
-    <w:p>
-      <w:pPr>
-        <w:tabs>
-          <w:tab w:pos="510" w:val="left"/>
-        </w:tabs>
-        <w:ind w:left="510" w:hanging="340"/>
-        <w:jc w:val="both"/>
-      </w:pPr>
-      <w:r>
-        <w:t>2.</w:t>
-        <w:tab/>
-      </w:r>
-      <w:r>
-        <w:rPr>
-          <w:rFonts w:ascii="Consolas" w:hAnsi="Consolas"/>
-          <w:sz w:val="20"/>
-        </w:rPr>
-        <w:t>make buildkernel KERNCONF=CLASEKERN</w:t>
-      </w:r>
-      <w:r>
-        <w:t xml:space="preserve"> compila el kernel usando mi archivo de configuración. Tarda bastante, y la diapositiva 35 avisa que es un proceso largo. No toca el sistema en uso, solo genera los archivos.</w:t>
-      </w:r>
-    </w:p>
-    <w:p>
-      <w:pPr>
-        <w:tabs>
-          <w:tab w:pos="510" w:val="left"/>
-        </w:tabs>
-        <w:ind w:left="510" w:hanging="340"/>
-        <w:jc w:val="both"/>
-      </w:pPr>
-      <w:r>
-        <w:t>3.</w:t>
-        <w:tab/>
-      </w:r>
-      <w:r>
-        <w:rPr>
-          <w:rFonts w:ascii="Consolas" w:hAnsi="Consolas"/>
-          <w:sz w:val="20"/>
-        </w:rPr>
-        <w:t>make installkernel KERNCONF=CLASEKERN</w:t>
-      </w:r>
-      <w:r>
-        <w:t xml:space="preserve"> copia el kernel compilado a </w:t>
-      </w:r>
-      <w:r>
-        <w:rPr>
-          <w:rFonts w:ascii="Consolas" w:hAnsi="Consolas"/>
-          <w:sz w:val="20"/>
-        </w:rPr>
-        <w:t>/boot/kernel</w:t>
-      </w:r>
-      <w:r>
-        <w:t xml:space="preserve">. FreeBSD conserva el anterior en </w:t>
-      </w:r>
-      <w:r>
-        <w:rPr>
-          <w:rFonts w:ascii="Consolas" w:hAnsi="Consolas"/>
-          <w:sz w:val="20"/>
-        </w:rPr>
-        <w:t>/boot/kernel.old</w:t>
-      </w:r>
-      <w:r>
-        <w:t>, así que hay respaldo si algo sale mal.</w:t>
-      </w:r>
-    </w:p>
-    <w:p>
-      <w:pPr>
-        <w:tabs>
-          <w:tab w:pos="510" w:val="left"/>
-        </w:tabs>
-        <w:ind w:left="510" w:hanging="340"/>
-        <w:jc w:val="both"/>
-      </w:pPr>
-      <w:r>
-        <w:t>4.</w:t>
-        <w:tab/>
-      </w:r>
-      <w:r>
-        <w:rPr>
-          <w:rFonts w:ascii="Consolas" w:hAnsi="Consolas"/>
-          <w:sz w:val="20"/>
-        </w:rPr>
-        <w:t>init 6</w:t>
-      </w:r>
-      <w:r>
-        <w:t xml:space="preserve"> reinicia el sistema (cambia al runlevel 6). Es equivalente a </w:t>
-      </w:r>
-      <w:r>
-        <w:rPr>
-          <w:rFonts w:ascii="Consolas" w:hAnsi="Consolas"/>
-          <w:sz w:val="20"/>
-        </w:rPr>
-        <w:t>shutdown -r now</w:t>
-      </w:r>
-      <w:r>
-        <w:t>. Al arrancar se usa el kernel nuevo.</w:t>
-      </w:r>
-    </w:p>
-    <w:p>
-      <w:pPr>
-        <w:jc w:val="both"/>
-      </w:pPr>
-      <w:r>
-        <w:rPr>
-          <w:b/>
-        </w:rPr>
-        <w:t>Cosa que descubrí al hacerlo de verdad:</w:t>
-      </w:r>
-      <w:r>
-        <w:t xml:space="preserve"> en FreeBSD 15.1 el kernel que viene instalado es de paquetes (pkgbase), y </w:t>
-      </w:r>
-      <w:r>
-        <w:rPr>
-          <w:rFonts w:ascii="Consolas" w:hAnsi="Consolas"/>
-          <w:sz w:val="20"/>
-        </w:rPr>
-        <w:t>make installkernel</w:t>
-      </w:r>
-      <w:r>
-        <w:t xml:space="preserve"> se niega a pisarlo y da error. La solución es instalar el kernel nuevo en otra ruta con </w:t>
-      </w:r>
-      <w:r>
-        <w:rPr>
-          <w:rFonts w:ascii="Consolas" w:hAnsi="Consolas"/>
-          <w:sz w:val="20"/>
-        </w:rPr>
-        <w:t>INSTKERNNAME</w:t>
-      </w:r>
-      <w:r>
-        <w:t>, y así el kernel GENERIC queda intacto como respaldo:</w:t>
-      </w:r>
-    </w:p>
-    <w:p>
-      <w:pPr>
-        <w:spacing w:line="240" w:lineRule="auto" w:before="80" w:after="160"/>
-        <w:ind w:left="113" w:right="113"/>
-        <w:shd w:val="clear" w:color="auto" w:fill="F4F4F4"/>
-        <w:pBdr>
-          <w:top w:val="single" w:sz="4" w:space="4" w:color="DDDDDD"/>
-          <w:left w:val="single" w:sz="4" w:space="4" w:color="DDDDDD"/>
-          <w:bottom w:val="single" w:sz="4" w:space="4" w:color="DDDDDD"/>
-          <w:right w:val="single" w:sz="4" w:space="4" w:color="DDDDDD"/>
-        </w:pBdr>
-      </w:pPr>
-      <w:r>
-        <w:rPr>
-          <w:rFonts w:ascii="Consolas" w:hAnsi="Consolas"/>
+          <w:color w:val="000000"/>
           <w:sz w:val="19"/>
         </w:rPr>
         <w:t>make installkernel KERNCONF=CLASEKERN INSTKERNNAME=CLASEKERN</w:t>
@@ -938,6 +230,7 @@
       <w:r>
         <w:rPr>
           <w:rFonts w:ascii="Consolas" w:hAnsi="Consolas"/>
+          <w:color w:val="000000"/>
           <w:sz w:val="19"/>
         </w:rPr>
         <w:t>nextboot -k CLASEKERN</w:t>
@@ -946,34 +239,10 @@
       <w:r>
         <w:rPr>
           <w:rFonts w:ascii="Consolas" w:hAnsi="Consolas"/>
+          <w:color w:val="000000"/>
           <w:sz w:val="19"/>
         </w:rPr>
         <w:t>init 6</w:t>
-      </w:r>
-    </w:p>
-    <w:p>
-      <w:pPr>
-        <w:jc w:val="both"/>
-      </w:pPr>
-      <w:r>
-        <w:rPr>
-          <w:rFonts w:ascii="Consolas" w:hAnsi="Consolas"/>
-          <w:sz w:val="20"/>
-        </w:rPr>
-        <w:t>nextboot -k</w:t>
-      </w:r>
-      <w:r>
-        <w:t xml:space="preserve"> le dice al cargador que arranque </w:t>
-      </w:r>
-      <w:r>
-        <w:rPr>
-          <w:rFonts w:ascii="Consolas" w:hAnsi="Consolas"/>
-          <w:sz w:val="20"/>
-        </w:rPr>
-        <w:t>CLASEKERN</w:t>
-      </w:r>
-      <w:r>
-        <w:t xml:space="preserve"> solo en el siguiente reinicio. Si algo falla, el siguiente arranque vuelve solo al kernel GENERIC.</w:t>
       </w:r>
     </w:p>
     <w:p>
@@ -987,7 +256,7 @@
     <w:p>
       <w:pPr>
         <w:spacing w:line="240" w:lineRule="auto" w:before="80" w:after="160"/>
-        <w:ind w:left="113" w:right="113"/>
+        <w:ind w:left="283" w:right="113"/>
         <w:shd w:val="clear" w:color="auto" w:fill="F4F4F4"/>
         <w:pBdr>
           <w:top w:val="single" w:sz="4" w:space="4" w:color="DDDDDD"/>
@@ -999,6 +268,7 @@
       <w:r>
         <w:rPr>
           <w:rFonts w:ascii="Consolas" w:hAnsi="Consolas"/>
+          <w:color w:val="000000"/>
           <w:sz w:val="19"/>
         </w:rPr>
         <w:t>uname -a</w:t>
@@ -1007,6 +277,7 @@
       <w:r>
         <w:rPr>
           <w:rFonts w:ascii="Consolas" w:hAnsi="Consolas"/>
+          <w:color w:val="000000"/>
           <w:sz w:val="19"/>
         </w:rPr>
         <w:t>freebsd-version -k -r</w:t>
@@ -1015,6 +286,7 @@
       <w:r>
         <w:rPr>
           <w:rFonts w:ascii="Consolas" w:hAnsi="Consolas"/>
+          <w:color w:val="000000"/>
           <w:sz w:val="19"/>
         </w:rPr>
         <w:t>sysctl kern.conftxt | head</w:t>
@@ -1022,92 +294,55 @@
     </w:p>
     <w:p>
       <w:pPr>
-        <w:jc w:val="both"/>
+        <w:pStyle w:val="Heading2"/>
       </w:pPr>
       <w:r>
-        <w:rPr>
-          <w:rFonts w:ascii="Consolas" w:hAnsi="Consolas"/>
-          <w:sz w:val="20"/>
-        </w:rPr>
-        <w:t>uname -a</w:t>
-      </w:r>
-      <w:r>
-        <w:t xml:space="preserve"> debería mostrar </w:t>
-      </w:r>
-      <w:r>
-        <w:rPr>
-          <w:rFonts w:ascii="Consolas" w:hAnsi="Consolas"/>
-          <w:sz w:val="20"/>
-        </w:rPr>
-        <w:t>CLASEKERN</w:t>
-      </w:r>
-      <w:r>
-        <w:t xml:space="preserve"> al final de la cadena del kernel, y </w:t>
-      </w:r>
-      <w:r>
-        <w:rPr>
-          <w:rFonts w:ascii="Consolas" w:hAnsi="Consolas"/>
-          <w:sz w:val="20"/>
-        </w:rPr>
-        <w:t>sysctl kern.bootfile</w:t>
-      </w:r>
-      <w:r>
-        <w:t xml:space="preserve"> debería apuntar a </w:t>
-      </w:r>
-      <w:r>
-        <w:rPr>
-          <w:rFonts w:ascii="Consolas" w:hAnsi="Consolas"/>
-          <w:sz w:val="20"/>
-        </w:rPr>
-        <w:t>/boot/CLASEKERN/kernel</w:t>
-      </w:r>
-      <w:r>
-        <w:t>.</w:t>
+        <w:t>2. Trabajo investigativo: Tipos de Kernel</w:t>
       </w:r>
     </w:p>
     <w:p>
       <w:pPr>
-        <w:ind w:left="283"/>
+        <w:pStyle w:val="ListBullet"/>
         <w:jc w:val="both"/>
       </w:pPr>
       <w:r>
-        <w:rPr>
-          <w:b/>
-        </w:rPr>
-        <w:t>Si falla el arranque:</w:t>
+        <w:t>Kernel monolítico (Linux): Todos los servicios corren en un solo espacio. Alto rendimiento, pero un fallo en un driver puede afectar el sistema.</w:t>
       </w:r>
+    </w:p>
+    <w:p>
+      <w:pPr>
+        <w:pStyle w:val="ListBullet"/>
+        <w:jc w:val="both"/>
+      </w:pPr>
       <w:r>
-        <w:t xml:space="preserve"> en el menú de arranque de FreeBSD se puede elegir otro kernel para volver al anterior (</w:t>
+        <w:t>Kernel con diseño modular (FreeBSD): Carga y descarga módulos (.ko) en caliente sin recompilar.</w:t>
       </w:r>
+    </w:p>
+    <w:p>
+      <w:pPr>
+        <w:pStyle w:val="ListBullet"/>
+        <w:jc w:val="both"/>
+      </w:pPr>
       <w:r>
-        <w:rPr>
-          <w:rFonts w:ascii="Consolas" w:hAnsi="Consolas"/>
-          <w:sz w:val="20"/>
-        </w:rPr>
-        <w:t>kernel.old</w:t>
+        <w:t>Sistema estructurado en capas (THE): Capas numeradas, fácil de depurar pero con costo de rendimiento por atravesar capas.</w:t>
       </w:r>
+    </w:p>
+    <w:p>
+      <w:pPr>
+        <w:pStyle w:val="ListBullet"/>
+        <w:jc w:val="both"/>
+      </w:pPr>
       <w:r>
-        <w:t xml:space="preserve"> en una instalación clásica, o </w:t>
+        <w:t>Sistema con micronúcleo (MINIX 3): El kernel hace lo mínimo (IPC, procesos). Más robusto, menor rendimiento.</w:t>
       </w:r>
+    </w:p>
+    <w:p>
+      <w:pPr>
+        <w:pStyle w:val="ListBullet"/>
+        <w:jc w:val="both"/>
+      </w:pPr>
       <w:r>
-        <w:rPr>
-          <w:rFonts w:ascii="Consolas" w:hAnsi="Consolas"/>
-          <w:sz w:val="20"/>
-        </w:rPr>
-        <w:t>kernel</w:t>
-      </w:r>
-      <w:r>
-        <w:t xml:space="preserve"> cuando se usó </w:t>
-      </w:r>
-      <w:r>
-        <w:rPr>
-          <w:rFonts w:ascii="Consolas" w:hAnsi="Consolas"/>
-          <w:sz w:val="20"/>
-        </w:rPr>
-        <w:t>INSTKERNNAME</w:t>
-      </w:r>
-      <w:r>
-        <w:t>).</w:t>
+        <w:t>Máquina virtual (IBM VM/370): Un monitor crea copias virtuales del hardware completo para aislar los SO.</w:t>
       </w:r>
     </w:p>
     <w:p>
@@ -1115,897 +350,7 @@
         <w:pStyle w:val="Heading2"/>
       </w:pPr>
       <w:r>
-        <w:t>2. Trabajo investigativo (entrega individual: 5 de octubre de 2026)</w:t>
-      </w:r>
-    </w:p>
-    <w:p>
-      <w:pPr>
-        <w:jc w:val="both"/>
-      </w:pPr>
-      <w:r>
-        <w:t xml:space="preserve">Piden presentar </w:t>
-      </w:r>
-      <w:r>
-        <w:rPr>
-          <w:b/>
-        </w:rPr>
-        <w:t>un sistema operativo por cada tipo de kernel</w:t>
-      </w:r>
-      <w:r>
-        <w:t>. Mi elección, con la razón de cada una:</w:t>
-      </w:r>
-    </w:p>
-    <w:tbl>
-      <w:tblPr>
-        <w:tblStyle w:val="TableGrid"/>
-        <w:tblW w:type="auto" w:w="0"/>
-        <w:jc w:val="center"/>
-        <w:tblLook w:firstColumn="1" w:firstRow="1" w:lastColumn="0" w:lastRow="0" w:noHBand="0" w:noVBand="1" w:val="04A0"/>
-        <w:tblBorders>
-          <w:top w:val="single" w:sz="4" w:space="0" w:color="A6A6A6"/>
-          <w:left w:val="single" w:sz="4" w:space="0" w:color="A6A6A6"/>
-          <w:bottom w:val="single" w:sz="4" w:space="0" w:color="A6A6A6"/>
-          <w:right w:val="single" w:sz="4" w:space="0" w:color="A6A6A6"/>
-          <w:insideH w:val="single" w:sz="4" w:space="0" w:color="A6A6A6"/>
-          <w:insideV w:val="single" w:sz="4" w:space="0" w:color="A6A6A6"/>
-        </w:tblBorders>
-      </w:tblPr>
-      <w:tblGrid>
-        <w:gridCol w:w="3135"/>
-        <w:gridCol w:w="3135"/>
-        <w:gridCol w:w="3135"/>
-      </w:tblGrid>
-      <w:tr>
-        <w:tc>
-          <w:tcPr>
-            <w:tcW w:type="dxa" w:w="3135"/>
-            <w:shd w:val="clear" w:color="auto" w:fill="D9D9D9"/>
-          </w:tcPr>
-          <w:p>
-            <w:pPr>
-              <w:spacing w:after="40" w:line="240" w:lineRule="auto"/>
-            </w:pPr>
-            <w:r>
-              <w:rPr>
-                <w:b/>
-                <w:color w:val="000000"/>
-                <w:sz w:val="22"/>
-              </w:rPr>
-              <w:t>Tipo de kernel / diseño</w:t>
-            </w:r>
-          </w:p>
-        </w:tc>
-        <w:tc>
-          <w:tcPr>
-            <w:tcW w:type="dxa" w:w="3135"/>
-            <w:shd w:val="clear" w:color="auto" w:fill="D9D9D9"/>
-          </w:tcPr>
-          <w:p>
-            <w:pPr>
-              <w:spacing w:after="40" w:line="240" w:lineRule="auto"/>
-            </w:pPr>
-            <w:r>
-              <w:rPr>
-                <w:b/>
-                <w:color w:val="000000"/>
-                <w:sz w:val="22"/>
-              </w:rPr>
-              <w:t>SO que presento</w:t>
-            </w:r>
-          </w:p>
-        </w:tc>
-        <w:tc>
-          <w:tcPr>
-            <w:tcW w:type="dxa" w:w="3135"/>
-            <w:shd w:val="clear" w:color="auto" w:fill="D9D9D9"/>
-          </w:tcPr>
-          <w:p>
-            <w:pPr>
-              <w:spacing w:after="40" w:line="240" w:lineRule="auto"/>
-            </w:pPr>
-            <w:r>
-              <w:rPr>
-                <w:b/>
-                <w:color w:val="000000"/>
-                <w:sz w:val="22"/>
-              </w:rPr>
-              <w:t>Por qué encaja</w:t>
-            </w:r>
-          </w:p>
-        </w:tc>
-      </w:tr>
-      <w:tr>
-        <w:tc>
-          <w:tcPr>
-            <w:tcW w:type="dxa" w:w="3135"/>
-          </w:tcPr>
-          <w:p>
-            <w:pPr>
-              <w:spacing w:after="40" w:line="240" w:lineRule="auto"/>
-            </w:pPr>
-            <w:r>
-              <w:rPr>
-                <w:b/>
-                <w:sz w:val="22"/>
-              </w:rPr>
-              <w:t>Kernel monolítico</w:t>
-            </w:r>
-          </w:p>
-        </w:tc>
-        <w:tc>
-          <w:tcPr>
-            <w:tcW w:type="dxa" w:w="3135"/>
-          </w:tcPr>
-          <w:p>
-            <w:pPr>
-              <w:spacing w:after="40" w:line="240" w:lineRule="auto"/>
-            </w:pPr>
-            <w:r>
-              <w:rPr>
-                <w:b/>
-                <w:sz w:val="22"/>
-              </w:rPr>
-              <w:t>Linux</w:t>
-            </w:r>
-          </w:p>
-        </w:tc>
-        <w:tc>
-          <w:tcPr>
-            <w:tcW w:type="dxa" w:w="3135"/>
-          </w:tcPr>
-          <w:p>
-            <w:pPr>
-              <w:spacing w:after="40" w:line="240" w:lineRule="auto"/>
-            </w:pPr>
-            <w:r>
-              <w:rPr>
-                <w:sz w:val="22"/>
-              </w:rPr>
-              <w:t>Todos los servicios (planificador, memoria, sistema de archivos, drivers, red) corren en un solo espacio de kernel. Es rápido porque todo se llama directamente, pero un fallo en un driver puede tumbar el sistema.</w:t>
-            </w:r>
-          </w:p>
-        </w:tc>
-      </w:tr>
-      <w:tr>
-        <w:tc>
-          <w:tcPr>
-            <w:tcW w:type="dxa" w:w="3135"/>
-          </w:tcPr>
-          <w:p>
-            <w:pPr>
-              <w:spacing w:after="40" w:line="240" w:lineRule="auto"/>
-            </w:pPr>
-            <w:r>
-              <w:rPr>
-                <w:b/>
-                <w:sz w:val="22"/>
-              </w:rPr>
-              <w:t>Kernel con diseño modular</w:t>
-            </w:r>
-          </w:p>
-        </w:tc>
-        <w:tc>
-          <w:tcPr>
-            <w:tcW w:type="dxa" w:w="3135"/>
-          </w:tcPr>
-          <w:p>
-            <w:pPr>
-              <w:spacing w:after="40" w:line="240" w:lineRule="auto"/>
-            </w:pPr>
-            <w:r>
-              <w:rPr>
-                <w:b/>
-                <w:sz w:val="22"/>
-              </w:rPr>
-              <w:t>Linux (LKM)</w:t>
-            </w:r>
-            <w:r>
-              <w:rPr>
-                <w:sz w:val="22"/>
-              </w:rPr>
-              <w:t xml:space="preserve"> o </w:t>
-            </w:r>
-            <w:r>
-              <w:rPr>
-                <w:b/>
-                <w:sz w:val="22"/>
-              </w:rPr>
-              <w:t>FreeBSD (`kldload`)</w:t>
-            </w:r>
-          </w:p>
-        </w:tc>
-        <w:tc>
-          <w:tcPr>
-            <w:tcW w:type="dxa" w:w="3135"/>
-          </w:tcPr>
-          <w:p>
-            <w:pPr>
-              <w:spacing w:after="40" w:line="240" w:lineRule="auto"/>
-            </w:pPr>
-            <w:r>
-              <w:rPr>
-                <w:sz w:val="22"/>
-              </w:rPr>
-              <w:t>Es un kernel que carga y descarga módulos (</w:t>
-            </w:r>
-            <w:r>
-              <w:rPr>
-                <w:rFonts w:ascii="Consolas" w:hAnsi="Consolas"/>
-                <w:sz w:val="20"/>
-              </w:rPr>
-              <w:t>.ko</w:t>
-            </w:r>
-            <w:r>
-              <w:rPr>
-                <w:sz w:val="22"/>
-              </w:rPr>
-              <w:t xml:space="preserve">) en caliente sin recompilar. Lo vimos con </w:t>
-            </w:r>
-            <w:r>
-              <w:rPr>
-                <w:rFonts w:ascii="Consolas" w:hAnsi="Consolas"/>
-                <w:sz w:val="20"/>
-              </w:rPr>
-              <w:t>lsmod</w:t>
-            </w:r>
-            <w:r>
-              <w:rPr>
-                <w:sz w:val="22"/>
-              </w:rPr>
-              <w:t xml:space="preserve">, </w:t>
-            </w:r>
-            <w:r>
-              <w:rPr>
-                <w:rFonts w:ascii="Consolas" w:hAnsi="Consolas"/>
-                <w:sz w:val="20"/>
-              </w:rPr>
-              <w:t>modprobe</w:t>
-            </w:r>
-            <w:r>
-              <w:rPr>
-                <w:sz w:val="22"/>
-              </w:rPr>
-              <w:t xml:space="preserve"> y </w:t>
-            </w:r>
-            <w:r>
-              <w:rPr>
-                <w:rFonts w:ascii="Consolas" w:hAnsi="Consolas"/>
-                <w:sz w:val="20"/>
-              </w:rPr>
-              <w:t>kldload</w:t>
-            </w:r>
-            <w:r>
-              <w:rPr>
-                <w:sz w:val="22"/>
-              </w:rPr>
-              <w:t>.</w:t>
-            </w:r>
-          </w:p>
-        </w:tc>
-      </w:tr>
-      <w:tr>
-        <w:tc>
-          <w:tcPr>
-            <w:tcW w:type="dxa" w:w="3135"/>
-          </w:tcPr>
-          <w:p>
-            <w:pPr>
-              <w:spacing w:after="40" w:line="240" w:lineRule="auto"/>
-            </w:pPr>
-            <w:r>
-              <w:rPr>
-                <w:b/>
-                <w:sz w:val="22"/>
-              </w:rPr>
-              <w:t>Sistema estructurado en capas</w:t>
-            </w:r>
-          </w:p>
-        </w:tc>
-        <w:tc>
-          <w:tcPr>
-            <w:tcW w:type="dxa" w:w="3135"/>
-          </w:tcPr>
-          <w:p>
-            <w:pPr>
-              <w:spacing w:after="40" w:line="240" w:lineRule="auto"/>
-            </w:pPr>
-            <w:r>
-              <w:rPr>
-                <w:b/>
-                <w:sz w:val="22"/>
-              </w:rPr>
-              <w:t>THE</w:t>
-            </w:r>
-            <w:r>
-              <w:rPr>
-                <w:sz w:val="22"/>
-              </w:rPr>
-              <w:t xml:space="preserve"> (Dijkstra, 1968)</w:t>
-            </w:r>
-          </w:p>
-        </w:tc>
-        <w:tc>
-          <w:tcPr>
-            <w:tcW w:type="dxa" w:w="3135"/>
-          </w:tcPr>
-          <w:p>
-            <w:pPr>
-              <w:spacing w:after="40" w:line="240" w:lineRule="auto"/>
-            </w:pPr>
-            <w:r>
-              <w:rPr>
-                <w:sz w:val="22"/>
-              </w:rPr>
-              <w:t>Tiene capas numeradas, y cada una solo usa los servicios de la capa inferior. La ventaja es que es fácil depurar y verificar capa por capa. La desventaja es el costo de atravesar capas.</w:t>
-            </w:r>
-          </w:p>
-        </w:tc>
-      </w:tr>
-      <w:tr>
-        <w:tc>
-          <w:tcPr>
-            <w:tcW w:type="dxa" w:w="3135"/>
-          </w:tcPr>
-          <w:p>
-            <w:pPr>
-              <w:spacing w:after="40" w:line="240" w:lineRule="auto"/>
-            </w:pPr>
-            <w:r>
-              <w:rPr>
-                <w:b/>
-                <w:sz w:val="22"/>
-              </w:rPr>
-              <w:t>Sistema con micronúcleo</w:t>
-            </w:r>
-          </w:p>
-        </w:tc>
-        <w:tc>
-          <w:tcPr>
-            <w:tcW w:type="dxa" w:w="3135"/>
-          </w:tcPr>
-          <w:p>
-            <w:pPr>
-              <w:spacing w:after="40" w:line="240" w:lineRule="auto"/>
-            </w:pPr>
-            <w:r>
-              <w:rPr>
-                <w:b/>
-                <w:sz w:val="22"/>
-              </w:rPr>
-              <w:t>MINIX 3</w:t>
-            </w:r>
-            <w:r>
-              <w:rPr>
-                <w:sz w:val="22"/>
-              </w:rPr>
-              <w:t xml:space="preserve"> (también QNX)</w:t>
-            </w:r>
-          </w:p>
-        </w:tc>
-        <w:tc>
-          <w:tcPr>
-            <w:tcW w:type="dxa" w:w="3135"/>
-          </w:tcPr>
-          <w:p>
-            <w:pPr>
-              <w:spacing w:after="40" w:line="240" w:lineRule="auto"/>
-            </w:pPr>
-            <w:r>
-              <w:rPr>
-                <w:sz w:val="22"/>
-              </w:rPr>
-              <w:t>El kernel solo hace lo mínimo: procesos, memoria básica y comunicación entre procesos (IPC). Drivers y sistema de archivos corren como procesos de usuario. Es más robusto, pero la comunicación por mensajes cuesta rendimiento.</w:t>
-            </w:r>
-          </w:p>
-        </w:tc>
-      </w:tr>
-      <w:tr>
-        <w:tc>
-          <w:tcPr>
-            <w:tcW w:type="dxa" w:w="3135"/>
-          </w:tcPr>
-          <w:p>
-            <w:pPr>
-              <w:spacing w:after="40" w:line="240" w:lineRule="auto"/>
-            </w:pPr>
-            <w:r>
-              <w:rPr>
-                <w:b/>
-                <w:sz w:val="22"/>
-              </w:rPr>
-              <w:t>Máquina virtual</w:t>
-            </w:r>
-          </w:p>
-        </w:tc>
-        <w:tc>
-          <w:tcPr>
-            <w:tcW w:type="dxa" w:w="3135"/>
-          </w:tcPr>
-          <w:p>
-            <w:pPr>
-              <w:spacing w:after="40" w:line="240" w:lineRule="auto"/>
-            </w:pPr>
-            <w:r>
-              <w:rPr>
-                <w:b/>
-                <w:sz w:val="22"/>
-              </w:rPr>
-              <w:t>IBM VM/370 (z/VM)</w:t>
-            </w:r>
-          </w:p>
-        </w:tc>
-        <w:tc>
-          <w:tcPr>
-            <w:tcW w:type="dxa" w:w="3135"/>
-          </w:tcPr>
-          <w:p>
-            <w:pPr>
-              <w:spacing w:after="40" w:line="240" w:lineRule="auto"/>
-            </w:pPr>
-            <w:r>
-              <w:rPr>
-                <w:sz w:val="22"/>
-              </w:rPr>
-              <w:t>Un monitor de máquina virtual crea copias virtuales del hardware completo. Cada usuario corre su propio SO sobre esa máquina virtual.</w:t>
-            </w:r>
-          </w:p>
-        </w:tc>
-      </w:tr>
-    </w:tbl>
-    <w:p>
-      <w:pPr>
-        <w:spacing w:after="80"/>
-      </w:pPr>
-    </w:p>
-    <w:p>
-      <w:pPr>
-        <w:pStyle w:val="Heading3"/>
-      </w:pPr>
-      <w:r>
-        <w:t>Comparación rápida</w:t>
-      </w:r>
-    </w:p>
-    <w:tbl>
-      <w:tblPr>
-        <w:tblStyle w:val="TableGrid"/>
-        <w:tblW w:type="auto" w:w="0"/>
-        <w:jc w:val="center"/>
-        <w:tblLook w:firstColumn="1" w:firstRow="1" w:lastColumn="0" w:lastRow="0" w:noHBand="0" w:noVBand="1" w:val="04A0"/>
-        <w:tblBorders>
-          <w:top w:val="single" w:sz="4" w:space="0" w:color="A6A6A6"/>
-          <w:left w:val="single" w:sz="4" w:space="0" w:color="A6A6A6"/>
-          <w:bottom w:val="single" w:sz="4" w:space="0" w:color="A6A6A6"/>
-          <w:right w:val="single" w:sz="4" w:space="0" w:color="A6A6A6"/>
-          <w:insideH w:val="single" w:sz="4" w:space="0" w:color="A6A6A6"/>
-          <w:insideV w:val="single" w:sz="4" w:space="0" w:color="A6A6A6"/>
-        </w:tblBorders>
-      </w:tblPr>
-      <w:tblGrid>
-        <w:gridCol w:w="2351"/>
-        <w:gridCol w:w="2351"/>
-        <w:gridCol w:w="2351"/>
-        <w:gridCol w:w="2351"/>
-      </w:tblGrid>
-      <w:tr>
-        <w:tc>
-          <w:tcPr>
-            <w:tcW w:type="dxa" w:w="2351"/>
-            <w:shd w:val="clear" w:color="auto" w:fill="D9D9D9"/>
-          </w:tcPr>
-          <w:p>
-            <w:pPr>
-              <w:spacing w:after="40" w:line="240" w:lineRule="auto"/>
-            </w:pPr>
-            <w:r>
-              <w:rPr>
-                <w:b/>
-                <w:color w:val="000000"/>
-                <w:sz w:val="22"/>
-              </w:rPr>
-              <w:t>Diseño</w:t>
-            </w:r>
-          </w:p>
-        </w:tc>
-        <w:tc>
-          <w:tcPr>
-            <w:tcW w:type="dxa" w:w="2351"/>
-            <w:shd w:val="clear" w:color="auto" w:fill="D9D9D9"/>
-          </w:tcPr>
-          <w:p>
-            <w:pPr>
-              <w:spacing w:after="40" w:line="240" w:lineRule="auto"/>
-            </w:pPr>
-            <w:r>
-              <w:rPr>
-                <w:b/>
-                <w:color w:val="000000"/>
-                <w:sz w:val="22"/>
-              </w:rPr>
-              <w:t>Rendimiento</w:t>
-            </w:r>
-          </w:p>
-        </w:tc>
-        <w:tc>
-          <w:tcPr>
-            <w:tcW w:type="dxa" w:w="2351"/>
-            <w:shd w:val="clear" w:color="auto" w:fill="D9D9D9"/>
-          </w:tcPr>
-          <w:p>
-            <w:pPr>
-              <w:spacing w:after="40" w:line="240" w:lineRule="auto"/>
-            </w:pPr>
-            <w:r>
-              <w:rPr>
-                <w:b/>
-                <w:color w:val="000000"/>
-                <w:sz w:val="22"/>
-              </w:rPr>
-              <w:t>Robustez</w:t>
-            </w:r>
-          </w:p>
-        </w:tc>
-        <w:tc>
-          <w:tcPr>
-            <w:tcW w:type="dxa" w:w="2351"/>
-            <w:shd w:val="clear" w:color="auto" w:fill="D9D9D9"/>
-          </w:tcPr>
-          <w:p>
-            <w:pPr>
-              <w:spacing w:after="40" w:line="240" w:lineRule="auto"/>
-            </w:pPr>
-            <w:r>
-              <w:rPr>
-                <w:b/>
-                <w:color w:val="000000"/>
-                <w:sz w:val="22"/>
-              </w:rPr>
-              <w:t>Facilidad de extender</w:t>
-            </w:r>
-          </w:p>
-        </w:tc>
-      </w:tr>
-      <w:tr>
-        <w:tc>
-          <w:tcPr>
-            <w:tcW w:type="dxa" w:w="2351"/>
-          </w:tcPr>
-          <w:p>
-            <w:pPr>
-              <w:spacing w:after="40" w:line="240" w:lineRule="auto"/>
-            </w:pPr>
-            <w:r>
-              <w:rPr>
-                <w:sz w:val="22"/>
-              </w:rPr>
-              <w:t>Monolítico</w:t>
-            </w:r>
-          </w:p>
-        </w:tc>
-        <w:tc>
-          <w:tcPr>
-            <w:tcW w:type="dxa" w:w="2351"/>
-          </w:tcPr>
-          <w:p>
-            <w:pPr>
-              <w:spacing w:after="40" w:line="240" w:lineRule="auto"/>
-            </w:pPr>
-            <w:r>
-              <w:rPr>
-                <w:sz w:val="22"/>
-              </w:rPr>
-              <w:t>Alto</w:t>
-            </w:r>
-          </w:p>
-        </w:tc>
-        <w:tc>
-          <w:tcPr>
-            <w:tcW w:type="dxa" w:w="2351"/>
-          </w:tcPr>
-          <w:p>
-            <w:pPr>
-              <w:spacing w:after="40" w:line="240" w:lineRule="auto"/>
-            </w:pPr>
-            <w:r>
-              <w:rPr>
-                <w:sz w:val="22"/>
-              </w:rPr>
-              <w:t>Baja (un driver malo afecta todo)</w:t>
-            </w:r>
-          </w:p>
-        </w:tc>
-        <w:tc>
-          <w:tcPr>
-            <w:tcW w:type="dxa" w:w="2351"/>
-          </w:tcPr>
-          <w:p>
-            <w:pPr>
-              <w:spacing w:after="40" w:line="240" w:lineRule="auto"/>
-            </w:pPr>
-            <w:r>
-              <w:rPr>
-                <w:sz w:val="22"/>
-              </w:rPr>
-              <w:t>Media</w:t>
-            </w:r>
-          </w:p>
-        </w:tc>
-      </w:tr>
-      <w:tr>
-        <w:tc>
-          <w:tcPr>
-            <w:tcW w:type="dxa" w:w="2351"/>
-          </w:tcPr>
-          <w:p>
-            <w:pPr>
-              <w:spacing w:after="40" w:line="240" w:lineRule="auto"/>
-            </w:pPr>
-            <w:r>
-              <w:rPr>
-                <w:sz w:val="22"/>
-              </w:rPr>
-              <w:t>Modular</w:t>
-            </w:r>
-          </w:p>
-        </w:tc>
-        <w:tc>
-          <w:tcPr>
-            <w:tcW w:type="dxa" w:w="2351"/>
-          </w:tcPr>
-          <w:p>
-            <w:pPr>
-              <w:spacing w:after="40" w:line="240" w:lineRule="auto"/>
-            </w:pPr>
-            <w:r>
-              <w:rPr>
-                <w:sz w:val="22"/>
-              </w:rPr>
-              <w:t>Alto</w:t>
-            </w:r>
-          </w:p>
-        </w:tc>
-        <w:tc>
-          <w:tcPr>
-            <w:tcW w:type="dxa" w:w="2351"/>
-          </w:tcPr>
-          <w:p>
-            <w:pPr>
-              <w:spacing w:after="40" w:line="240" w:lineRule="auto"/>
-            </w:pPr>
-            <w:r>
-              <w:rPr>
-                <w:sz w:val="22"/>
-              </w:rPr>
-              <w:t>Media</w:t>
-            </w:r>
-          </w:p>
-        </w:tc>
-        <w:tc>
-          <w:tcPr>
-            <w:tcW w:type="dxa" w:w="2351"/>
-          </w:tcPr>
-          <w:p>
-            <w:pPr>
-              <w:spacing w:after="40" w:line="240" w:lineRule="auto"/>
-            </w:pPr>
-            <w:r>
-              <w:rPr>
-                <w:sz w:val="22"/>
-              </w:rPr>
-              <w:t>Alta (módulos en caliente)</w:t>
-            </w:r>
-          </w:p>
-        </w:tc>
-      </w:tr>
-      <w:tr>
-        <w:tc>
-          <w:tcPr>
-            <w:tcW w:type="dxa" w:w="2351"/>
-          </w:tcPr>
-          <w:p>
-            <w:pPr>
-              <w:spacing w:after="40" w:line="240" w:lineRule="auto"/>
-            </w:pPr>
-            <w:r>
-              <w:rPr>
-                <w:sz w:val="22"/>
-              </w:rPr>
-              <w:t>Capas</w:t>
-            </w:r>
-          </w:p>
-        </w:tc>
-        <w:tc>
-          <w:tcPr>
-            <w:tcW w:type="dxa" w:w="2351"/>
-          </w:tcPr>
-          <w:p>
-            <w:pPr>
-              <w:spacing w:after="40" w:line="240" w:lineRule="auto"/>
-            </w:pPr>
-            <w:r>
-              <w:rPr>
-                <w:sz w:val="22"/>
-              </w:rPr>
-              <w:t>Medio</w:t>
-            </w:r>
-          </w:p>
-        </w:tc>
-        <w:tc>
-          <w:tcPr>
-            <w:tcW w:type="dxa" w:w="2351"/>
-          </w:tcPr>
-          <w:p>
-            <w:pPr>
-              <w:spacing w:after="40" w:line="240" w:lineRule="auto"/>
-            </w:pPr>
-            <w:r>
-              <w:rPr>
-                <w:sz w:val="22"/>
-              </w:rPr>
-              <w:t>Media</w:t>
-            </w:r>
-          </w:p>
-        </w:tc>
-        <w:tc>
-          <w:tcPr>
-            <w:tcW w:type="dxa" w:w="2351"/>
-          </w:tcPr>
-          <w:p>
-            <w:pPr>
-              <w:spacing w:after="40" w:line="240" w:lineRule="auto"/>
-            </w:pPr>
-            <w:r>
-              <w:rPr>
-                <w:sz w:val="22"/>
-              </w:rPr>
-              <w:t>Media</w:t>
-            </w:r>
-          </w:p>
-        </w:tc>
-      </w:tr>
-      <w:tr>
-        <w:tc>
-          <w:tcPr>
-            <w:tcW w:type="dxa" w:w="2351"/>
-          </w:tcPr>
-          <w:p>
-            <w:pPr>
-              <w:spacing w:after="40" w:line="240" w:lineRule="auto"/>
-            </w:pPr>
-            <w:r>
-              <w:rPr>
-                <w:sz w:val="22"/>
-              </w:rPr>
-              <w:t>Micronúcleo</w:t>
-            </w:r>
-          </w:p>
-        </w:tc>
-        <w:tc>
-          <w:tcPr>
-            <w:tcW w:type="dxa" w:w="2351"/>
-          </w:tcPr>
-          <w:p>
-            <w:pPr>
-              <w:spacing w:after="40" w:line="240" w:lineRule="auto"/>
-            </w:pPr>
-            <w:r>
-              <w:rPr>
-                <w:sz w:val="22"/>
-              </w:rPr>
-              <w:t>Menor (por los mensajes)</w:t>
-            </w:r>
-          </w:p>
-        </w:tc>
-        <w:tc>
-          <w:tcPr>
-            <w:tcW w:type="dxa" w:w="2351"/>
-          </w:tcPr>
-          <w:p>
-            <w:pPr>
-              <w:spacing w:after="40" w:line="240" w:lineRule="auto"/>
-            </w:pPr>
-            <w:r>
-              <w:rPr>
-                <w:sz w:val="22"/>
-              </w:rPr>
-              <w:t>Alta</w:t>
-            </w:r>
-          </w:p>
-        </w:tc>
-        <w:tc>
-          <w:tcPr>
-            <w:tcW w:type="dxa" w:w="2351"/>
-          </w:tcPr>
-          <w:p>
-            <w:pPr>
-              <w:spacing w:after="40" w:line="240" w:lineRule="auto"/>
-            </w:pPr>
-            <w:r>
-              <w:rPr>
-                <w:sz w:val="22"/>
-              </w:rPr>
-              <w:t>Alta</w:t>
-            </w:r>
-          </w:p>
-        </w:tc>
-      </w:tr>
-      <w:tr>
-        <w:tc>
-          <w:tcPr>
-            <w:tcW w:type="dxa" w:w="2351"/>
-          </w:tcPr>
-          <w:p>
-            <w:pPr>
-              <w:spacing w:after="40" w:line="240" w:lineRule="auto"/>
-            </w:pPr>
-            <w:r>
-              <w:rPr>
-                <w:sz w:val="22"/>
-              </w:rPr>
-              <w:t>Máquina virtual</w:t>
-            </w:r>
-          </w:p>
-        </w:tc>
-        <w:tc>
-          <w:tcPr>
-            <w:tcW w:type="dxa" w:w="2351"/>
-          </w:tcPr>
-          <w:p>
-            <w:pPr>
-              <w:spacing w:after="40" w:line="240" w:lineRule="auto"/>
-            </w:pPr>
-            <w:r>
-              <w:rPr>
-                <w:sz w:val="22"/>
-              </w:rPr>
-              <w:t>Menor (capa extra)</w:t>
-            </w:r>
-          </w:p>
-        </w:tc>
-        <w:tc>
-          <w:tcPr>
-            <w:tcW w:type="dxa" w:w="2351"/>
-          </w:tcPr>
-          <w:p>
-            <w:pPr>
-              <w:spacing w:after="40" w:line="240" w:lineRule="auto"/>
-            </w:pPr>
-            <w:r>
-              <w:rPr>
-                <w:sz w:val="22"/>
-              </w:rPr>
-              <w:t>Alta (aislamiento)</w:t>
-            </w:r>
-          </w:p>
-        </w:tc>
-        <w:tc>
-          <w:tcPr>
-            <w:tcW w:type="dxa" w:w="2351"/>
-          </w:tcPr>
-          <w:p>
-            <w:pPr>
-              <w:spacing w:after="40" w:line="240" w:lineRule="auto"/>
-            </w:pPr>
-            <w:r>
-              <w:rPr>
-                <w:sz w:val="22"/>
-              </w:rPr>
-              <w:t>Alta</w:t>
-            </w:r>
-          </w:p>
-        </w:tc>
-      </w:tr>
-    </w:tbl>
-    <w:p>
-      <w:pPr>
-        <w:spacing w:after="80"/>
-      </w:pPr>
-    </w:p>
-    <w:p>
-      <w:pPr>
-        <w:pStyle w:val="Heading2"/>
-      </w:pPr>
-      <w:r>
-        <w:t>3. Versión 6 (entrega: 19 de octubre de 2026)</w:t>
+        <w:t>3. Versión 6: Instalación y Clasificación</w:t>
       </w:r>
     </w:p>
     <w:p>
@@ -2013,41 +358,13 @@
         <w:pStyle w:val="Heading3"/>
       </w:pPr>
       <w:r>
-        <w:t>3.1 Instalar un nuevo kernel en Ubuntu, Oracle Linux o CentOS</w:t>
-      </w:r>
-    </w:p>
-    <w:p>
-      <w:pPr>
-        <w:jc w:val="both"/>
-      </w:pPr>
-      <w:r>
-        <w:t xml:space="preserve">Elijo </w:t>
-      </w:r>
-      <w:r>
-        <w:rPr>
-          <w:b/>
-        </w:rPr>
-        <w:t>Ubuntu</w:t>
-      </w:r>
-      <w:r>
-        <w:t xml:space="preserve"> porque es la más simple de probar. Hay dos formas.</w:t>
-      </w:r>
-    </w:p>
-    <w:p>
-      <w:pPr>
-        <w:jc w:val="both"/>
-      </w:pPr>
-      <w:r>
-        <w:rPr>
-          <w:b/>
-        </w:rPr>
-        <w:t>Forma A: instalar un kernel ya compilado desde los repositorios (la más segura)</w:t>
+        <w:t>3.1 Instalar un nuevo kernel en Ubuntu (Repositorios)</w:t>
       </w:r>
     </w:p>
     <w:p>
       <w:pPr>
         <w:spacing w:line="240" w:lineRule="auto" w:before="80" w:after="160"/>
-        <w:ind w:left="113" w:right="113"/>
+        <w:ind w:left="283" w:right="113"/>
         <w:shd w:val="clear" w:color="auto" w:fill="F4F4F4"/>
         <w:pBdr>
           <w:top w:val="single" w:sz="4" w:space="4" w:color="DDDDDD"/>
@@ -2059,22 +376,25 @@
       <w:r>
         <w:rPr>
           <w:rFonts w:ascii="Consolas" w:hAnsi="Consolas"/>
+          <w:color w:val="000000"/>
           <w:sz w:val="19"/>
         </w:rPr>
-        <w:t>uname -r                                  # kernel actual</w:t>
+        <w:t>uname -r</w:t>
         <w:br/>
       </w:r>
       <w:r>
         <w:rPr>
           <w:rFonts w:ascii="Consolas" w:hAnsi="Consolas"/>
+          <w:color w:val="000000"/>
           <w:sz w:val="19"/>
         </w:rPr>
-        <w:t>apt search linux-image-generic-hwe        # ver opciones disponibles</w:t>
+        <w:t>apt search linux-image-generic-hwe</w:t>
         <w:br/>
       </w:r>
       <w:r>
         <w:rPr>
           <w:rFonts w:ascii="Consolas" w:hAnsi="Consolas"/>
+          <w:color w:val="000000"/>
           <w:sz w:val="19"/>
         </w:rPr>
         <w:t>sudo apt update</w:t>
@@ -2083,6 +403,7 @@
       <w:r>
         <w:rPr>
           <w:rFonts w:ascii="Consolas" w:hAnsi="Consolas"/>
+          <w:color w:val="000000"/>
           <w:sz w:val="19"/>
         </w:rPr>
         <w:t>sudo apt install linux-generic-hwe-$(lsb_release -rs)</w:t>
@@ -2091,240 +412,10 @@
       <w:r>
         <w:rPr>
           <w:rFonts w:ascii="Consolas" w:hAnsi="Consolas"/>
+          <w:color w:val="000000"/>
           <w:sz w:val="19"/>
         </w:rPr>
         <w:t>sudo reboot</w:t>
-        <w:br/>
-      </w:r>
-      <w:r>
-        <w:rPr>
-          <w:rFonts w:ascii="Consolas" w:hAnsi="Consolas"/>
-          <w:sz w:val="19"/>
-        </w:rPr>
-        <w:t>uname -r                                  # debe mostrar el kernel nuevo</w:t>
-      </w:r>
-    </w:p>
-    <w:p>
-      <w:pPr>
-        <w:tabs>
-          <w:tab w:pos="510" w:val="left"/>
-        </w:tabs>
-        <w:ind w:left="510" w:hanging="340"/>
-        <w:jc w:val="both"/>
-      </w:pPr>
-      <w:r>
-        <w:t>1.</w:t>
-        <w:tab/>
-      </w:r>
-      <w:r>
-        <w:rPr>
-          <w:rFonts w:ascii="Consolas" w:hAnsi="Consolas"/>
-          <w:sz w:val="20"/>
-        </w:rPr>
-        <w:t>uname -r</w:t>
-      </w:r>
-      <w:r>
-        <w:t xml:space="preserve"> guarda la versión actual para comparar después.</w:t>
-      </w:r>
-    </w:p>
-    <w:p>
-      <w:pPr>
-        <w:tabs>
-          <w:tab w:pos="510" w:val="left"/>
-        </w:tabs>
-        <w:ind w:left="510" w:hanging="340"/>
-        <w:jc w:val="both"/>
-      </w:pPr>
-      <w:r>
-        <w:t>2.</w:t>
-        <w:tab/>
-      </w:r>
-      <w:r>
-        <w:rPr>
-          <w:rFonts w:ascii="Consolas" w:hAnsi="Consolas"/>
-          <w:sz w:val="20"/>
-        </w:rPr>
-        <w:t>apt install linux-generic-hwe-...</w:t>
-      </w:r>
-      <w:r>
-        <w:t xml:space="preserve"> instala el kernel más reciente que ofrece la versión de Ubuntu.</w:t>
-      </w:r>
-    </w:p>
-    <w:p>
-      <w:pPr>
-        <w:tabs>
-          <w:tab w:pos="510" w:val="left"/>
-        </w:tabs>
-        <w:ind w:left="510" w:hanging="340"/>
-        <w:jc w:val="both"/>
-      </w:pPr>
-      <w:r>
-        <w:t>3.</w:t>
-        <w:tab/>
-      </w:r>
-      <w:r>
-        <w:t xml:space="preserve">Se reinicia y se vuelve a ejecutar </w:t>
-      </w:r>
-      <w:r>
-        <w:rPr>
-          <w:rFonts w:ascii="Consolas" w:hAnsi="Consolas"/>
-          <w:sz w:val="20"/>
-        </w:rPr>
-        <w:t>uname -r</w:t>
-      </w:r>
-      <w:r>
-        <w:t xml:space="preserve"> para confirmar el cambio.</w:t>
-      </w:r>
-    </w:p>
-    <w:p>
-      <w:pPr>
-        <w:jc w:val="both"/>
-      </w:pPr>
-      <w:r>
-        <w:rPr>
-          <w:b/>
-        </w:rPr>
-        <w:t>Forma B: compilarlo desde el código fuente de kernel.org (la que se parece a la actividad de FreeBSD)</w:t>
-      </w:r>
-    </w:p>
-    <w:p>
-      <w:pPr>
-        <w:spacing w:line="240" w:lineRule="auto" w:before="80" w:after="160"/>
-        <w:ind w:left="113" w:right="113"/>
-        <w:shd w:val="clear" w:color="auto" w:fill="F4F4F4"/>
-        <w:pBdr>
-          <w:top w:val="single" w:sz="4" w:space="4" w:color="DDDDDD"/>
-          <w:left w:val="single" w:sz="4" w:space="4" w:color="DDDDDD"/>
-          <w:bottom w:val="single" w:sz="4" w:space="4" w:color="DDDDDD"/>
-          <w:right w:val="single" w:sz="4" w:space="4" w:color="DDDDDD"/>
-        </w:pBdr>
-      </w:pPr>
-      <w:r>
-        <w:rPr>
-          <w:rFonts w:ascii="Consolas" w:hAnsi="Consolas"/>
-          <w:sz w:val="19"/>
-        </w:rPr>
-        <w:t>sudo apt install build-essential libncurses-dev bison flex libssl-dev libelf-dev bc</w:t>
-        <w:br/>
-      </w:r>
-      <w:r>
-        <w:rPr>
-          <w:rFonts w:ascii="Consolas" w:hAnsi="Consolas"/>
-          <w:sz w:val="19"/>
-        </w:rPr>
-        <w:t>wget https://cdn.kernel.org/pub/linux/kernel/v6.x/linux-6.x.y.tar.xz   # poner la versión real</w:t>
-        <w:br/>
-      </w:r>
-      <w:r>
-        <w:rPr>
-          <w:rFonts w:ascii="Consolas" w:hAnsi="Consolas"/>
-          <w:sz w:val="19"/>
-        </w:rPr>
-        <w:t>tar xf linux-6.x.y.tar.xz &amp;&amp; cd linux-6.x.y</w:t>
-        <w:br/>
-      </w:r>
-      <w:r>
-        <w:rPr>
-          <w:rFonts w:ascii="Consolas" w:hAnsi="Consolas"/>
-          <w:sz w:val="19"/>
-        </w:rPr>
-        <w:t>cp /boot/config-$(uname -r) .config</w:t>
-        <w:br/>
-      </w:r>
-      <w:r>
-        <w:rPr>
-          <w:rFonts w:ascii="Consolas" w:hAnsi="Consolas"/>
-          <w:sz w:val="19"/>
-        </w:rPr>
-        <w:t>make olddefconfig</w:t>
-        <w:br/>
-      </w:r>
-      <w:r>
-        <w:rPr>
-          <w:rFonts w:ascii="Consolas" w:hAnsi="Consolas"/>
-          <w:sz w:val="19"/>
-        </w:rPr>
-        <w:t>make -j$(nproc)</w:t>
-        <w:br/>
-      </w:r>
-      <w:r>
-        <w:rPr>
-          <w:rFonts w:ascii="Consolas" w:hAnsi="Consolas"/>
-          <w:sz w:val="19"/>
-        </w:rPr>
-        <w:t>sudo make modules_install</w:t>
-        <w:br/>
-      </w:r>
-      <w:r>
-        <w:rPr>
-          <w:rFonts w:ascii="Consolas" w:hAnsi="Consolas"/>
-          <w:sz w:val="19"/>
-        </w:rPr>
-        <w:t>sudo make install</w:t>
-        <w:br/>
-      </w:r>
-      <w:r>
-        <w:rPr>
-          <w:rFonts w:ascii="Consolas" w:hAnsi="Consolas"/>
-          <w:sz w:val="19"/>
-        </w:rPr>
-        <w:t>sudo update-grub &amp;&amp; sudo reboot</w:t>
-      </w:r>
-    </w:p>
-    <w:p>
-      <w:pPr>
-        <w:jc w:val="both"/>
-      </w:pPr>
-      <w:r>
-        <w:t>Es el mismo proceso conceptual que en FreeBSD: configurar (</w:t>
-      </w:r>
-      <w:r>
-        <w:rPr>
-          <w:rFonts w:ascii="Consolas" w:hAnsi="Consolas"/>
-          <w:sz w:val="20"/>
-        </w:rPr>
-        <w:t>.config</w:t>
-      </w:r>
-      <w:r>
-        <w:t>), compilar, instalar y reiniciar. Como aviso: la diapositiva 34 dice que el código fuente pesa cientos de MiB y la compilación es lenta. Conviene hacerlo en una VM con al menos 4 GB de RAM y 30 GB de disco.</w:t>
-      </w:r>
-    </w:p>
-    <w:p>
-      <w:pPr>
-        <w:jc w:val="both"/>
-      </w:pPr>
-      <w:r>
-        <w:t xml:space="preserve">En Oracle Linux y CentOS el instalador de paquetes es </w:t>
-      </w:r>
-      <w:r>
-        <w:rPr>
-          <w:rFonts w:ascii="Consolas" w:hAnsi="Consolas"/>
-          <w:sz w:val="20"/>
-        </w:rPr>
-        <w:t>dnf</w:t>
-      </w:r>
-      <w:r>
-        <w:t xml:space="preserve">, y el equivalente de </w:t>
-      </w:r>
-      <w:r>
-        <w:rPr>
-          <w:rFonts w:ascii="Consolas" w:hAnsi="Consolas"/>
-          <w:sz w:val="20"/>
-        </w:rPr>
-        <w:t>update-grub</w:t>
-      </w:r>
-      <w:r>
-        <w:t xml:space="preserve"> es </w:t>
-      </w:r>
-      <w:r>
-        <w:rPr>
-          <w:rFonts w:ascii="Consolas" w:hAnsi="Consolas"/>
-          <w:sz w:val="20"/>
-        </w:rPr>
-        <w:t>grub2-mkconfig -o /boot/grub2/grub.cfg</w:t>
-      </w:r>
-      <w:r>
-        <w:t>.</w:t>
       </w:r>
     </w:p>
     <w:p>
@@ -2332,689 +423,52 @@
         <w:pStyle w:val="Heading3"/>
       </w:pPr>
       <w:r>
-        <w:t>3.2 ¿Qué tipo de kernel tienen estos SO?</w:t>
+        <w:t>3.2 Clasificación de SO</w:t>
       </w:r>
     </w:p>
     <w:p>
       <w:pPr>
+        <w:pStyle w:val="ListBullet"/>
         <w:jc w:val="both"/>
       </w:pPr>
       <w:r>
-        <w:t>La lista sale de la diapositiva 40. Esta clasificación es la que se ve en la literatura, pero varía según la fuente en los casos difíciles. Los que marco con (*) son los más discutibles.</w:t>
+        <w:t>BeOS, Mac OS X, newOS: Kernel Híbrido.</w:t>
       </w:r>
     </w:p>
     <w:p>
       <w:pPr>
+        <w:pStyle w:val="ListBullet"/>
         <w:jc w:val="both"/>
       </w:pPr>
       <w:r>
-        <w:rPr>
-          <w:b/>
-        </w:rPr>
-        <w:t>Grupo 1: BeOS, Mach, Mac OS X, newOS</w:t>
-      </w:r>
-    </w:p>
-    <w:tbl>
-      <w:tblPr>
-        <w:tblStyle w:val="TableGrid"/>
-        <w:tblW w:type="auto" w:w="0"/>
-        <w:jc w:val="center"/>
-        <w:tblLook w:firstColumn="1" w:firstRow="1" w:lastColumn="0" w:lastRow="0" w:noHBand="0" w:noVBand="1" w:val="04A0"/>
-        <w:tblBorders>
-          <w:top w:val="single" w:sz="4" w:space="0" w:color="A6A6A6"/>
-          <w:left w:val="single" w:sz="4" w:space="0" w:color="A6A6A6"/>
-          <w:bottom w:val="single" w:sz="4" w:space="0" w:color="A6A6A6"/>
-          <w:right w:val="single" w:sz="4" w:space="0" w:color="A6A6A6"/>
-          <w:insideH w:val="single" w:sz="4" w:space="0" w:color="A6A6A6"/>
-          <w:insideV w:val="single" w:sz="4" w:space="0" w:color="A6A6A6"/>
-        </w:tblBorders>
-      </w:tblPr>
-      <w:tblGrid>
-        <w:gridCol w:w="3135"/>
-        <w:gridCol w:w="3135"/>
-        <w:gridCol w:w="3135"/>
-      </w:tblGrid>
-      <w:tr>
-        <w:tc>
-          <w:tcPr>
-            <w:tcW w:type="dxa" w:w="3135"/>
-            <w:shd w:val="clear" w:color="auto" w:fill="D9D9D9"/>
-          </w:tcPr>
-          <w:p>
-            <w:pPr>
-              <w:spacing w:after="40" w:line="240" w:lineRule="auto"/>
-            </w:pPr>
-            <w:r>
-              <w:rPr>
-                <w:b/>
-                <w:color w:val="000000"/>
-                <w:sz w:val="22"/>
-              </w:rPr>
-              <w:t>SO</w:t>
-            </w:r>
-          </w:p>
-        </w:tc>
-        <w:tc>
-          <w:tcPr>
-            <w:tcW w:type="dxa" w:w="3135"/>
-            <w:shd w:val="clear" w:color="auto" w:fill="D9D9D9"/>
-          </w:tcPr>
-          <w:p>
-            <w:pPr>
-              <w:spacing w:after="40" w:line="240" w:lineRule="auto"/>
-            </w:pPr>
-            <w:r>
-              <w:rPr>
-                <w:b/>
-                <w:color w:val="000000"/>
-                <w:sz w:val="22"/>
-              </w:rPr>
-              <w:t>Tipo de kernel</w:t>
-            </w:r>
-          </w:p>
-        </w:tc>
-        <w:tc>
-          <w:tcPr>
-            <w:tcW w:type="dxa" w:w="3135"/>
-            <w:shd w:val="clear" w:color="auto" w:fill="D9D9D9"/>
-          </w:tcPr>
-          <w:p>
-            <w:pPr>
-              <w:spacing w:after="40" w:line="240" w:lineRule="auto"/>
-            </w:pPr>
-            <w:r>
-              <w:rPr>
-                <w:b/>
-                <w:color w:val="000000"/>
-                <w:sz w:val="22"/>
-              </w:rPr>
-              <w:t>Comentario</w:t>
-            </w:r>
-          </w:p>
-        </w:tc>
-      </w:tr>
-      <w:tr>
-        <w:tc>
-          <w:tcPr>
-            <w:tcW w:type="dxa" w:w="3135"/>
-          </w:tcPr>
-          <w:p>
-            <w:pPr>
-              <w:spacing w:after="40" w:line="240" w:lineRule="auto"/>
-            </w:pPr>
-            <w:r>
-              <w:rPr>
-                <w:sz w:val="22"/>
-              </w:rPr>
-              <w:t>BeOS</w:t>
-            </w:r>
-          </w:p>
-        </w:tc>
-        <w:tc>
-          <w:tcPr>
-            <w:tcW w:type="dxa" w:w="3135"/>
-          </w:tcPr>
-          <w:p>
-            <w:pPr>
-              <w:spacing w:after="40" w:line="240" w:lineRule="auto"/>
-            </w:pPr>
-            <w:r>
-              <w:rPr>
-                <w:b/>
-                <w:sz w:val="22"/>
-              </w:rPr>
-              <w:t>Híbrido</w:t>
-            </w:r>
-            <w:r>
-              <w:rPr>
-                <w:sz w:val="22"/>
-              </w:rPr>
-              <w:t xml:space="preserve"> (*)</w:t>
-            </w:r>
-          </w:p>
-        </w:tc>
-        <w:tc>
-          <w:tcPr>
-            <w:tcW w:type="dxa" w:w="3135"/>
-          </w:tcPr>
-          <w:p>
-            <w:pPr>
-              <w:spacing w:after="40" w:line="240" w:lineRule="auto"/>
-            </w:pPr>
-            <w:r>
-              <w:rPr>
-                <w:sz w:val="22"/>
-              </w:rPr>
-              <w:t>Kernel modular con servicios en espacio de usuario.</w:t>
-            </w:r>
-          </w:p>
-        </w:tc>
-      </w:tr>
-      <w:tr>
-        <w:tc>
-          <w:tcPr>
-            <w:tcW w:type="dxa" w:w="3135"/>
-          </w:tcPr>
-          <w:p>
-            <w:pPr>
-              <w:spacing w:after="40" w:line="240" w:lineRule="auto"/>
-            </w:pPr>
-            <w:r>
-              <w:rPr>
-                <w:sz w:val="22"/>
-              </w:rPr>
-              <w:t>Mach</w:t>
-            </w:r>
-          </w:p>
-        </w:tc>
-        <w:tc>
-          <w:tcPr>
-            <w:tcW w:type="dxa" w:w="3135"/>
-          </w:tcPr>
-          <w:p>
-            <w:pPr>
-              <w:spacing w:after="40" w:line="240" w:lineRule="auto"/>
-            </w:pPr>
-            <w:r>
-              <w:rPr>
-                <w:b/>
-                <w:sz w:val="22"/>
-              </w:rPr>
-              <w:t>Micronúcleo</w:t>
-            </w:r>
-          </w:p>
-        </w:tc>
-        <w:tc>
-          <w:tcPr>
-            <w:tcW w:type="dxa" w:w="3135"/>
-          </w:tcPr>
-          <w:p>
-            <w:pPr>
-              <w:spacing w:after="40" w:line="240" w:lineRule="auto"/>
-            </w:pPr>
-            <w:r>
-              <w:rPr>
-                <w:sz w:val="22"/>
-              </w:rPr>
-              <w:t>Desarrollado en Carnegie Mellon. Es la base de otros sistemas.</w:t>
-            </w:r>
-          </w:p>
-        </w:tc>
-      </w:tr>
-      <w:tr>
-        <w:tc>
-          <w:tcPr>
-            <w:tcW w:type="dxa" w:w="3135"/>
-          </w:tcPr>
-          <w:p>
-            <w:pPr>
-              <w:spacing w:after="40" w:line="240" w:lineRule="auto"/>
-            </w:pPr>
-            <w:r>
-              <w:rPr>
-                <w:sz w:val="22"/>
-              </w:rPr>
-              <w:t>Mac OS X</w:t>
-            </w:r>
-          </w:p>
-        </w:tc>
-        <w:tc>
-          <w:tcPr>
-            <w:tcW w:type="dxa" w:w="3135"/>
-          </w:tcPr>
-          <w:p>
-            <w:pPr>
-              <w:spacing w:after="40" w:line="240" w:lineRule="auto"/>
-            </w:pPr>
-            <w:r>
-              <w:rPr>
-                <w:b/>
-                <w:sz w:val="22"/>
-              </w:rPr>
-              <w:t>Híbrido</w:t>
-            </w:r>
-          </w:p>
-        </w:tc>
-        <w:tc>
-          <w:tcPr>
-            <w:tcW w:type="dxa" w:w="3135"/>
-          </w:tcPr>
-          <w:p>
-            <w:pPr>
-              <w:spacing w:after="40" w:line="240" w:lineRule="auto"/>
-            </w:pPr>
-            <w:r>
-              <w:rPr>
-                <w:sz w:val="22"/>
-              </w:rPr>
-              <w:t>Su kernel XNU combina Mach (micronúcleo) con partes de BSD.</w:t>
-            </w:r>
-          </w:p>
-        </w:tc>
-      </w:tr>
-      <w:tr>
-        <w:tc>
-          <w:tcPr>
-            <w:tcW w:type="dxa" w:w="3135"/>
-          </w:tcPr>
-          <w:p>
-            <w:pPr>
-              <w:spacing w:after="40" w:line="240" w:lineRule="auto"/>
-            </w:pPr>
-            <w:r>
-              <w:rPr>
-                <w:sz w:val="22"/>
-              </w:rPr>
-              <w:t>newOS</w:t>
-            </w:r>
-          </w:p>
-        </w:tc>
-        <w:tc>
-          <w:tcPr>
-            <w:tcW w:type="dxa" w:w="3135"/>
-          </w:tcPr>
-          <w:p>
-            <w:pPr>
-              <w:spacing w:after="40" w:line="240" w:lineRule="auto"/>
-            </w:pPr>
-            <w:r>
-              <w:rPr>
-                <w:b/>
-                <w:sz w:val="22"/>
-              </w:rPr>
-              <w:t>Híbrido / modular</w:t>
-            </w:r>
-            <w:r>
-              <w:rPr>
-                <w:sz w:val="22"/>
-              </w:rPr>
-              <w:t xml:space="preserve"> (*)</w:t>
-            </w:r>
-          </w:p>
-        </w:tc>
-        <w:tc>
-          <w:tcPr>
-            <w:tcW w:type="dxa" w:w="3135"/>
-          </w:tcPr>
-          <w:p>
-            <w:pPr>
-              <w:spacing w:after="40" w:line="240" w:lineRule="auto"/>
-            </w:pPr>
-            <w:r>
-              <w:rPr>
-                <w:sz w:val="22"/>
-              </w:rPr>
-              <w:t>Es un proyecto pequeño y pocas fuentes lo clasifican con claridad.</w:t>
-            </w:r>
-          </w:p>
-        </w:tc>
-      </w:tr>
-    </w:tbl>
-    <w:p>
-      <w:pPr>
-        <w:spacing w:after="80"/>
-      </w:pPr>
-    </w:p>
-    <w:p>
-      <w:pPr>
-        <w:jc w:val="both"/>
-      </w:pPr>
-      <w:r>
-        <w:rPr>
-          <w:b/>
-        </w:rPr>
-        <w:t>Grupo 2: AdeOS, EROS, KeyKOS, BriX-OS</w:t>
-      </w:r>
-    </w:p>
-    <w:tbl>
-      <w:tblPr>
-        <w:tblStyle w:val="TableGrid"/>
-        <w:tblW w:type="auto" w:w="0"/>
-        <w:jc w:val="center"/>
-        <w:tblLook w:firstColumn="1" w:firstRow="1" w:lastColumn="0" w:lastRow="0" w:noHBand="0" w:noVBand="1" w:val="04A0"/>
-        <w:tblBorders>
-          <w:top w:val="single" w:sz="4" w:space="0" w:color="A6A6A6"/>
-          <w:left w:val="single" w:sz="4" w:space="0" w:color="A6A6A6"/>
-          <w:bottom w:val="single" w:sz="4" w:space="0" w:color="A6A6A6"/>
-          <w:right w:val="single" w:sz="4" w:space="0" w:color="A6A6A6"/>
-          <w:insideH w:val="single" w:sz="4" w:space="0" w:color="A6A6A6"/>
-          <w:insideV w:val="single" w:sz="4" w:space="0" w:color="A6A6A6"/>
-        </w:tblBorders>
-      </w:tblPr>
-      <w:tblGrid>
-        <w:gridCol w:w="3135"/>
-        <w:gridCol w:w="3135"/>
-        <w:gridCol w:w="3135"/>
-      </w:tblGrid>
-      <w:tr>
-        <w:tc>
-          <w:tcPr>
-            <w:tcW w:type="dxa" w:w="3135"/>
-            <w:shd w:val="clear" w:color="auto" w:fill="D9D9D9"/>
-          </w:tcPr>
-          <w:p>
-            <w:pPr>
-              <w:spacing w:after="40" w:line="240" w:lineRule="auto"/>
-            </w:pPr>
-            <w:r>
-              <w:rPr>
-                <w:b/>
-                <w:color w:val="000000"/>
-                <w:sz w:val="22"/>
-              </w:rPr>
-              <w:t>SO</w:t>
-            </w:r>
-          </w:p>
-        </w:tc>
-        <w:tc>
-          <w:tcPr>
-            <w:tcW w:type="dxa" w:w="3135"/>
-            <w:shd w:val="clear" w:color="auto" w:fill="D9D9D9"/>
-          </w:tcPr>
-          <w:p>
-            <w:pPr>
-              <w:spacing w:after="40" w:line="240" w:lineRule="auto"/>
-            </w:pPr>
-            <w:r>
-              <w:rPr>
-                <w:b/>
-                <w:color w:val="000000"/>
-                <w:sz w:val="22"/>
-              </w:rPr>
-              <w:t>Tipo de kernel</w:t>
-            </w:r>
-          </w:p>
-        </w:tc>
-        <w:tc>
-          <w:tcPr>
-            <w:tcW w:type="dxa" w:w="3135"/>
-            <w:shd w:val="clear" w:color="auto" w:fill="D9D9D9"/>
-          </w:tcPr>
-          <w:p>
-            <w:pPr>
-              <w:spacing w:after="40" w:line="240" w:lineRule="auto"/>
-            </w:pPr>
-            <w:r>
-              <w:rPr>
-                <w:b/>
-                <w:color w:val="000000"/>
-                <w:sz w:val="22"/>
-              </w:rPr>
-              <w:t>Comentario</w:t>
-            </w:r>
-          </w:p>
-        </w:tc>
-      </w:tr>
-      <w:tr>
-        <w:tc>
-          <w:tcPr>
-            <w:tcW w:type="dxa" w:w="3135"/>
-          </w:tcPr>
-          <w:p>
-            <w:pPr>
-              <w:spacing w:after="40" w:line="240" w:lineRule="auto"/>
-            </w:pPr>
-            <w:r>
-              <w:rPr>
-                <w:sz w:val="22"/>
-              </w:rPr>
-              <w:t>AdeOS</w:t>
-            </w:r>
-          </w:p>
-        </w:tc>
-        <w:tc>
-          <w:tcPr>
-            <w:tcW w:type="dxa" w:w="3135"/>
-          </w:tcPr>
-          <w:p>
-            <w:pPr>
-              <w:spacing w:after="40" w:line="240" w:lineRule="auto"/>
-            </w:pPr>
-            <w:r>
-              <w:rPr>
-                <w:b/>
-                <w:sz w:val="22"/>
-              </w:rPr>
-              <w:t>Nanonúcleo</w:t>
-            </w:r>
-          </w:p>
-        </w:tc>
-        <w:tc>
-          <w:tcPr>
-            <w:tcW w:type="dxa" w:w="3135"/>
-          </w:tcPr>
-          <w:p>
-            <w:pPr>
-              <w:spacing w:after="40" w:line="240" w:lineRule="auto"/>
-            </w:pPr>
-            <w:r>
-              <w:rPr>
-                <w:sz w:val="22"/>
-              </w:rPr>
-              <w:t>Es una capa de virtualización de hardware que permite correr varios SO.</w:t>
-            </w:r>
-          </w:p>
-        </w:tc>
-      </w:tr>
-      <w:tr>
-        <w:tc>
-          <w:tcPr>
-            <w:tcW w:type="dxa" w:w="3135"/>
-          </w:tcPr>
-          <w:p>
-            <w:pPr>
-              <w:spacing w:after="40" w:line="240" w:lineRule="auto"/>
-            </w:pPr>
-            <w:r>
-              <w:rPr>
-                <w:sz w:val="22"/>
-              </w:rPr>
-              <w:t>EROS</w:t>
-            </w:r>
-          </w:p>
-        </w:tc>
-        <w:tc>
-          <w:tcPr>
-            <w:tcW w:type="dxa" w:w="3135"/>
-          </w:tcPr>
-          <w:p>
-            <w:pPr>
-              <w:spacing w:after="40" w:line="240" w:lineRule="auto"/>
-            </w:pPr>
-            <w:r>
-              <w:rPr>
-                <w:b/>
-                <w:sz w:val="22"/>
-              </w:rPr>
-              <w:t>Nanonúcleo</w:t>
-            </w:r>
-          </w:p>
-        </w:tc>
-        <w:tc>
-          <w:tcPr>
-            <w:tcW w:type="dxa" w:w="3135"/>
-          </w:tcPr>
-          <w:p>
-            <w:pPr>
-              <w:spacing w:after="40" w:line="240" w:lineRule="auto"/>
-            </w:pPr>
-            <w:r>
-              <w:rPr>
-                <w:sz w:val="22"/>
-              </w:rPr>
-              <w:t>Se basa en capacidades. Es el sucesor de KeyKOS.</w:t>
-            </w:r>
-          </w:p>
-        </w:tc>
-      </w:tr>
-      <w:tr>
-        <w:tc>
-          <w:tcPr>
-            <w:tcW w:type="dxa" w:w="3135"/>
-          </w:tcPr>
-          <w:p>
-            <w:pPr>
-              <w:spacing w:after="40" w:line="240" w:lineRule="auto"/>
-            </w:pPr>
-            <w:r>
-              <w:rPr>
-                <w:sz w:val="22"/>
-              </w:rPr>
-              <w:t>KeyKOS</w:t>
-            </w:r>
-          </w:p>
-        </w:tc>
-        <w:tc>
-          <w:tcPr>
-            <w:tcW w:type="dxa" w:w="3135"/>
-          </w:tcPr>
-          <w:p>
-            <w:pPr>
-              <w:spacing w:after="40" w:line="240" w:lineRule="auto"/>
-            </w:pPr>
-            <w:r>
-              <w:rPr>
-                <w:b/>
-                <w:sz w:val="22"/>
-              </w:rPr>
-              <w:t>Nanonúcleo</w:t>
-            </w:r>
-          </w:p>
-        </w:tc>
-        <w:tc>
-          <w:tcPr>
-            <w:tcW w:type="dxa" w:w="3135"/>
-          </w:tcPr>
-          <w:p>
-            <w:pPr>
-              <w:spacing w:after="40" w:line="240" w:lineRule="auto"/>
-            </w:pPr>
-            <w:r>
-              <w:rPr>
-                <w:sz w:val="22"/>
-              </w:rPr>
-              <w:t>Sistema de capacidades muy pequeño.</w:t>
-            </w:r>
-          </w:p>
-        </w:tc>
-      </w:tr>
-      <w:tr>
-        <w:tc>
-          <w:tcPr>
-            <w:tcW w:type="dxa" w:w="3135"/>
-          </w:tcPr>
-          <w:p>
-            <w:pPr>
-              <w:spacing w:after="40" w:line="240" w:lineRule="auto"/>
-            </w:pPr>
-            <w:r>
-              <w:rPr>
-                <w:sz w:val="22"/>
-              </w:rPr>
-              <w:t>BriX-OS</w:t>
-            </w:r>
-          </w:p>
-        </w:tc>
-        <w:tc>
-          <w:tcPr>
-            <w:tcW w:type="dxa" w:w="3135"/>
-          </w:tcPr>
-          <w:p>
-            <w:pPr>
-              <w:spacing w:after="40" w:line="240" w:lineRule="auto"/>
-            </w:pPr>
-            <w:r>
-              <w:rPr>
-                <w:b/>
-                <w:sz w:val="22"/>
-              </w:rPr>
-              <w:t>Ver grupo 3</w:t>
-            </w:r>
-            <w:r>
-              <w:rPr>
-                <w:sz w:val="22"/>
-              </w:rPr>
-              <w:t xml:space="preserve"> (*)</w:t>
-            </w:r>
-          </w:p>
-        </w:tc>
-        <w:tc>
-          <w:tcPr>
-            <w:tcW w:type="dxa" w:w="3135"/>
-          </w:tcPr>
-          <w:p>
-            <w:pPr>
-              <w:spacing w:after="40" w:line="240" w:lineRule="auto"/>
-            </w:pPr>
-            <w:r>
-              <w:rPr>
-                <w:sz w:val="22"/>
-              </w:rPr>
-              <w:t>BriX aparece de nuevo en el grupo de espacio de direcciones único.</w:t>
-            </w:r>
-          </w:p>
-        </w:tc>
-      </w:tr>
-    </w:tbl>
-    <w:p>
-      <w:pPr>
-        <w:spacing w:after="80"/>
-      </w:pPr>
-    </w:p>
-    <w:p>
-      <w:pPr>
-        <w:jc w:val="both"/>
-      </w:pPr>
-      <w:r>
-        <w:rPr>
-          <w:b/>
-        </w:rPr>
-        <w:t>Grupo 3: Opal, Mungi, BriX</w:t>
+        <w:t>Mach, MINIX: Micronúcleo.</w:t>
       </w:r>
     </w:p>
     <w:p>
       <w:pPr>
+        <w:pStyle w:val="ListBullet"/>
         <w:jc w:val="both"/>
       </w:pPr>
       <w:r>
-        <w:t xml:space="preserve">Los tres son </w:t>
-      </w:r>
-      <w:r>
-        <w:rPr>
-          <w:b/>
-        </w:rPr>
-        <w:t>SASOS (Single Address Space Operating System)</w:t>
-      </w:r>
-      <w:r>
-        <w:t>. Todos los procesos comparten un único espacio de direcciones virtual, y la protección se logra con capacidades en vez de espacios separados.</w:t>
+        <w:t>AdeOS, EROS, KeyKOS: Nanonúcleo.</w:t>
       </w:r>
     </w:p>
     <w:p>
       <w:pPr>
+        <w:pStyle w:val="ListBullet"/>
         <w:jc w:val="both"/>
       </w:pPr>
       <w:r>
-        <w:rPr>
-          <w:b/>
-        </w:rPr>
-        <w:t>Grupo 4: MIT exokernel</w:t>
+        <w:t>Opal, Mungi, BriX: SASOS (Single Address Space Operating System).</w:t>
       </w:r>
     </w:p>
     <w:p>
       <w:pPr>
+        <w:pStyle w:val="ListBullet"/>
         <w:jc w:val="both"/>
       </w:pPr>
       <w:r>
-        <w:t xml:space="preserve">Es un </w:t>
-      </w:r>
-      <w:r>
-        <w:rPr>
-          <w:b/>
-        </w:rPr>
-        <w:t>exonúcleo</w:t>
-      </w:r>
-      <w:r>
-        <w:t>. El kernel casi no abstrae el hardware y solo reparte recursos de forma segura. Las abstracciones las ponen las bibliotecas en espacio de usuario (*LibOS*).</w:t>
+        <w:t>MIT exokernel: Exonúcleo.</w:t>
       </w:r>
     </w:p>
     <w:p>
@@ -3022,95 +476,7 @@
         <w:pStyle w:val="Heading2"/>
       </w:pPr>
       <w:r>
-        <w:t>4. Evidencias reales</w:t>
-      </w:r>
-    </w:p>
-    <w:p>
-      <w:pPr>
-        <w:jc w:val="both"/>
-      </w:pPr>
-      <w:r>
-        <w:rPr>
-          <w:b/>
-        </w:rPr>
-        <w:t>Entorno de trabajo:</w:t>
-      </w:r>
-      <w:r>
-        <w:t xml:space="preserve"> todas las pruebas las hice en mi computador con </w:t>
-      </w:r>
-      <w:r>
-        <w:rPr>
-          <w:b/>
-        </w:rPr>
-        <w:t>Windows 11</w:t>
-      </w:r>
-      <w:r>
-        <w:t xml:space="preserve">. Para la parte de Linux usé </w:t>
-      </w:r>
-      <w:r>
-        <w:rPr>
-          <w:b/>
-        </w:rPr>
-        <w:t>Ubuntu 26.04 LTS sobre WSL2</w:t>
-      </w:r>
-      <w:r>
-        <w:t xml:space="preserve">, y para la parte de FreeBSD usé una </w:t>
-      </w:r>
-      <w:r>
-        <w:rPr>
-          <w:b/>
-        </w:rPr>
-        <w:t>máquina virtual de FreeBSD 15.1 en VirtualBox</w:t>
-      </w:r>
-      <w:r>
-        <w:t>. Las imágenes de esta sección son capturas de las salidas reales de la terminal de esos dos entornos. Mac OS X aparece en este documento solo como ejemplo teórico de kernel híbrido (sección 3) y no participó en ninguna prueba.</w:t>
-      </w:r>
-    </w:p>
-    <w:p>
-      <w:pPr>
-        <w:pStyle w:val="Heading3"/>
-      </w:pPr>
-      <w:r>
-        <w:t>4.1 Ubuntu 26.04 (WSL2): compilación del kernel 6.18.54</w:t>
-      </w:r>
-    </w:p>
-    <w:p>
-      <w:pPr>
-        <w:jc w:val="both"/>
-      </w:pPr>
-      <w:r>
-        <w:t>Lo hice en Ubuntu 26.04 LTS ejecutándose sobre WSL2 dentro de mi Windows 11, con 12 núcleos y 8 GB de RAM disponibles. Descargué el código fuente de kernel.org, partí de la configuración del kernel que estaba en uso (</w:t>
-      </w:r>
-      <w:r>
-        <w:rPr>
-          <w:rFonts w:ascii="Consolas" w:hAnsi="Consolas"/>
-          <w:sz w:val="20"/>
-        </w:rPr>
-        <w:t>/proc/config.gz</w:t>
-      </w:r>
-      <w:r>
-        <w:t xml:space="preserve">, el equivalente a copiar </w:t>
-      </w:r>
-      <w:r>
-        <w:rPr>
-          <w:rFonts w:ascii="Consolas" w:hAnsi="Consolas"/>
-          <w:sz w:val="20"/>
-        </w:rPr>
-        <w:t>/boot/config-$(uname -r)</w:t>
-      </w:r>
-      <w:r>
-        <w:t>) y compilé la imagen y los módulos.</w:t>
-      </w:r>
-    </w:p>
-    <w:p>
-      <w:pPr>
-        <w:jc w:val="both"/>
-      </w:pPr>
-      <w:r>
-        <w:rPr>
-          <w:b/>
-        </w:rPr>
-        <w:t>Kernel antes de empezar y descarga del código fuente:</w:t>
+        <w:t>4. Evidencias de Ejecución (Windows 11 / WSL2 / VirtualBox)</w:t>
       </w:r>
     </w:p>
     <w:p>
@@ -3161,17 +527,6 @@
     </w:p>
     <w:p>
       <w:pPr>
-        <w:jc w:val="both"/>
-      </w:pPr>
-      <w:r>
-        <w:rPr>
-          <w:b/>
-        </w:rPr>
-        <w:t>Configuración (`make olddefconfig`):</w:t>
-      </w:r>
-    </w:p>
-    <w:p>
-      <w:pPr>
         <w:keepLines/>
         <w:spacing w:before="120" w:after="200"/>
         <w:jc w:val="center"/>
@@ -3214,20 +569,6 @@
             </a:graphic>
           </wp:inline>
         </w:drawing>
-      </w:r>
-    </w:p>
-    <w:p>
-      <w:pPr>
-        <w:jc w:val="both"/>
-      </w:pPr>
-      <w:r>
-        <w:rPr>
-          <w:b/>
-        </w:rPr>
-        <w:t>Compilación (`make -j12 bzImage modules`):</w:t>
-      </w:r>
-      <w:r>
-        <w:t xml:space="preserve"> terminó sin errores.</w:t>
       </w:r>
     </w:p>
     <w:p>
@@ -3278,17 +619,6 @@
     </w:p>
     <w:p>
       <w:pPr>
-        <w:jc w:val="both"/>
-      </w:pPr>
-      <w:r>
-        <w:rPr>
-          <w:b/>
-        </w:rPr>
-        <w:t>Resultado:</w:t>
-      </w:r>
-    </w:p>
-    <w:p>
-      <w:pPr>
         <w:keepLines/>
         <w:spacing w:before="120" w:after="200"/>
         <w:jc w:val="center"/>
@@ -3331,138 +661,6 @@
             </a:graphic>
           </wp:inline>
         </w:drawing>
-      </w:r>
-    </w:p>
-    <w:p>
-      <w:pPr>
-        <w:jc w:val="both"/>
-      </w:pPr>
-      <w:r>
-        <w:t>Del resultado saco tres cosas:</w:t>
-      </w:r>
-    </w:p>
-    <w:p>
-      <w:pPr>
-        <w:pStyle w:val="ListBullet"/>
-        <w:jc w:val="both"/>
-      </w:pPr>
-      <w:r>
-        <w:t>El kernel nuevo (6.18.54) es un parche más nuevo del que estaba corriendo (6.18.33.2).</w:t>
-      </w:r>
-    </w:p>
-    <w:p>
-      <w:pPr>
-        <w:pStyle w:val="ListBullet"/>
-        <w:jc w:val="both"/>
-      </w:pPr>
-      <w:r>
-        <w:t xml:space="preserve">La imagen </w:t>
-      </w:r>
-      <w:r>
-        <w:rPr>
-          <w:rFonts w:ascii="Consolas" w:hAnsi="Consolas"/>
-          <w:sz w:val="20"/>
-        </w:rPr>
-        <w:t>bzImage</w:t>
-      </w:r>
-      <w:r>
-        <w:t xml:space="preserve"> pesa 15 MB, y los componentes que no van dentro se compilaron como 960 módulos </w:t>
-      </w:r>
-      <w:r>
-        <w:rPr>
-          <w:rFonts w:ascii="Consolas" w:hAnsi="Consolas"/>
-          <w:sz w:val="20"/>
-        </w:rPr>
-        <w:t>.ko</w:t>
-      </w:r>
-      <w:r>
-        <w:t>, tal como explica la diapositiva 34.</w:t>
-      </w:r>
-    </w:p>
-    <w:p>
-      <w:pPr>
-        <w:pStyle w:val="ListBullet"/>
-        <w:jc w:val="both"/>
-      </w:pPr>
-      <w:r>
-        <w:t xml:space="preserve">WSL2 arranca el kernel desde Windows y no desde GRUB, así que el paso </w:t>
-      </w:r>
-      <w:r>
-        <w:rPr>
-          <w:rFonts w:ascii="Consolas" w:hAnsi="Consolas"/>
-          <w:sz w:val="20"/>
-        </w:rPr>
-        <w:t>update-grub</w:t>
-      </w:r>
-      <w:r>
-        <w:t xml:space="preserve"> y el reinicio no aplican ahí. En una instalación normal de Ubuntu ese último paso es el que activa el kernel nuevo.</w:t>
-      </w:r>
-    </w:p>
-    <w:p>
-      <w:pPr>
-        <w:pStyle w:val="Heading3"/>
-      </w:pPr>
-      <w:r>
-        <w:t>4.2 FreeBSD 15.1: kernel personalizado CLASEKERN</w:t>
-      </w:r>
-    </w:p>
-    <w:p>
-      <w:pPr>
-        <w:jc w:val="both"/>
-      </w:pPr>
-      <w:r>
-        <w:t>Usé la máquina virtual de FreeBSD 15.1-RELEASE (amd64) que corre en VirtualBox sobre mi Windows 11, con 6 CPU y 4 GB de RAM, y trabajé con ella por SSH desde Windows. Ampliué el disco a 30 GB porque el original de 6 GB no alcanzaba para el código fuente y la compilación, y descargué las fuentes (</w:t>
-      </w:r>
-      <w:r>
-        <w:rPr>
-          <w:rFonts w:ascii="Consolas" w:hAnsi="Consolas"/>
-          <w:sz w:val="20"/>
-        </w:rPr>
-        <w:t>src.txz</w:t>
-      </w:r>
-      <w:r>
-        <w:t xml:space="preserve">, 241 MB) con </w:t>
-      </w:r>
-      <w:r>
-        <w:rPr>
-          <w:rFonts w:ascii="Consolas" w:hAnsi="Consolas"/>
-          <w:sz w:val="20"/>
-        </w:rPr>
-        <w:t>fetch</w:t>
-      </w:r>
-      <w:r>
-        <w:t xml:space="preserve"> desde download.freebsd.org. Como el sistema es de 64 bits, la ruta de configuración es </w:t>
-      </w:r>
-      <w:r>
-        <w:rPr>
-          <w:rFonts w:ascii="Consolas" w:hAnsi="Consolas"/>
-          <w:sz w:val="20"/>
-        </w:rPr>
-        <w:t>amd64</w:t>
-      </w:r>
-      <w:r>
-        <w:t xml:space="preserve"> y no </w:t>
-      </w:r>
-      <w:r>
-        <w:rPr>
-          <w:rFonts w:ascii="Consolas" w:hAnsi="Consolas"/>
-          <w:sz w:val="20"/>
-        </w:rPr>
-        <w:t>i386</w:t>
-      </w:r>
-      <w:r>
-        <w:t>.</w:t>
-      </w:r>
-    </w:p>
-    <w:p>
-      <w:pPr>
-        <w:jc w:val="both"/>
-      </w:pPr>
-      <w:r>
-        <w:rPr>
-          <w:b/>
-        </w:rPr>
-        <w:t>Identificar el sistema:</w:t>
       </w:r>
     </w:p>
     <w:p>
@@ -3513,40 +711,6 @@
     </w:p>
     <w:p>
       <w:pPr>
-        <w:jc w:val="both"/>
-      </w:pPr>
-      <w:r>
-        <w:rPr>
-          <w:b/>
-        </w:rPr>
-        <w:t>Configurar el kernel</w:t>
-      </w:r>
-      <w:r>
-        <w:t xml:space="preserve"> (cambié la línea </w:t>
-      </w:r>
-      <w:r>
-        <w:rPr>
-          <w:rFonts w:ascii="Consolas" w:hAnsi="Consolas"/>
-          <w:sz w:val="20"/>
-        </w:rPr>
-        <w:t>ident</w:t>
-      </w:r>
-      <w:r>
-        <w:t xml:space="preserve"> a </w:t>
-      </w:r>
-      <w:r>
-        <w:rPr>
-          <w:rFonts w:ascii="Consolas" w:hAnsi="Consolas"/>
-          <w:sz w:val="20"/>
-        </w:rPr>
-        <w:t>CLASEKERN</w:t>
-      </w:r>
-      <w:r>
-        <w:t xml:space="preserve"> para poder reconocerlo después):</w:t>
-      </w:r>
-    </w:p>
-    <w:p>
-      <w:pPr>
         <w:keepLines/>
         <w:spacing w:before="120" w:after="200"/>
         <w:jc w:val="center"/>
@@ -3589,40 +753,6 @@
             </a:graphic>
           </wp:inline>
         </w:drawing>
-      </w:r>
-    </w:p>
-    <w:p>
-      <w:pPr>
-        <w:jc w:val="both"/>
-      </w:pPr>
-      <w:r>
-        <w:rPr>
-          <w:b/>
-        </w:rPr>
-        <w:t>Compilar</w:t>
-      </w:r>
-      <w:r>
-        <w:t xml:space="preserve"> (</w:t>
-      </w:r>
-      <w:r>
-        <w:rPr>
-          <w:rFonts w:ascii="Consolas" w:hAnsi="Consolas"/>
-          <w:sz w:val="20"/>
-        </w:rPr>
-        <w:t>make -j6 buildkernel KERNCONF=CLASEKERN</w:t>
-      </w:r>
-      <w:r>
-        <w:t xml:space="preserve">, desde </w:t>
-      </w:r>
-      <w:r>
-        <w:rPr>
-          <w:rFonts w:ascii="Consolas" w:hAnsi="Consolas"/>
-          <w:sz w:val="20"/>
-        </w:rPr>
-        <w:t>/usr/src</w:t>
-      </w:r>
-      <w:r>
-        <w:t>):</w:t>
       </w:r>
     </w:p>
     <w:p>
@@ -3673,30 +803,6 @@
     </w:p>
     <w:p>
       <w:pPr>
-        <w:jc w:val="both"/>
-      </w:pPr>
-      <w:r>
-        <w:rPr>
-          <w:b/>
-        </w:rPr>
-        <w:t>Primer intento de instalar</w:t>
-      </w:r>
-      <w:r>
-        <w:t xml:space="preserve"> (</w:t>
-      </w:r>
-      <w:r>
-        <w:rPr>
-          <w:rFonts w:ascii="Consolas" w:hAnsi="Consolas"/>
-          <w:sz w:val="20"/>
-        </w:rPr>
-        <w:t>make installkernel KERNCONF=CLASEKERN</w:t>
-      </w:r>
-      <w:r>
-        <w:t>), que falló:</w:t>
-      </w:r>
-    </w:p>
-    <w:p>
-      <w:pPr>
         <w:keepLines/>
         <w:spacing w:before="120" w:after="200"/>
         <w:jc w:val="center"/>
@@ -3739,17 +845,6 @@
             </a:graphic>
           </wp:inline>
         </w:drawing>
-      </w:r>
-    </w:p>
-    <w:p>
-      <w:pPr>
-        <w:jc w:val="both"/>
-      </w:pPr>
-      <w:r>
-        <w:rPr>
-          <w:b/>
-        </w:rPr>
-        <w:t>Instalación en otra ruta y arranque:</w:t>
       </w:r>
     </w:p>
     <w:p>
@@ -3800,17 +895,6 @@
     </w:p>
     <w:p>
       <w:pPr>
-        <w:jc w:val="both"/>
-      </w:pPr>
-      <w:r>
-        <w:rPr>
-          <w:b/>
-        </w:rPr>
-        <w:t>Después de reiniciar:</w:t>
-      </w:r>
-    </w:p>
-    <w:p>
-      <w:pPr>
         <w:keepLines/>
         <w:spacing w:before="120" w:after="200"/>
         <w:jc w:val="center"/>
@@ -3853,54 +937,6 @@
             </a:graphic>
           </wp:inline>
         </w:drawing>
-      </w:r>
-    </w:p>
-    <w:p>
-      <w:pPr>
-        <w:jc w:val="both"/>
-      </w:pPr>
-      <w:r>
-        <w:t xml:space="preserve">Con esto queda comprobado que el sistema arrancó con mi kernel </w:t>
-      </w:r>
-      <w:r>
-        <w:rPr>
-          <w:rFonts w:ascii="Consolas" w:hAnsi="Consolas"/>
-          <w:sz w:val="20"/>
-        </w:rPr>
-        <w:t>CLASEKERN</w:t>
-      </w:r>
-      <w:r>
-        <w:t xml:space="preserve">. Antes decía </w:t>
-      </w:r>
-      <w:r>
-        <w:rPr>
-          <w:rFonts w:ascii="Consolas" w:hAnsi="Consolas"/>
-          <w:sz w:val="20"/>
-        </w:rPr>
-        <w:t>GENERIC</w:t>
-      </w:r>
-      <w:r>
-        <w:t xml:space="preserve"> al final de </w:t>
-      </w:r>
-      <w:r>
-        <w:rPr>
-          <w:rFonts w:ascii="Consolas" w:hAnsi="Consolas"/>
-          <w:sz w:val="20"/>
-        </w:rPr>
-        <w:t>uname -a</w:t>
-      </w:r>
-      <w:r>
-        <w:t xml:space="preserve"> y ahora dice </w:t>
-      </w:r>
-      <w:r>
-        <w:rPr>
-          <w:rFonts w:ascii="Consolas" w:hAnsi="Consolas"/>
-          <w:sz w:val="20"/>
-        </w:rPr>
-        <w:t>CLASEKERN</w:t>
-      </w:r>
-      <w:r>
-        <w:t>. La compilación tardó más de una hora aun con 6 CPU, lo que confirma lo que decía la diapositiva 35 sobre que compilar un kernel lleva su tiempo.</w:t>
       </w:r>
     </w:p>
     <w:sectPr>
@@ -4281,6 +1317,7 @@
     </w:pPr>
     <w:rPr>
       <w:rFonts w:ascii="Arial" w:hAnsi="Arial" w:eastAsia="Arial" w:cs="Arial"/>
+      <w:color w:val="000000"/>
       <w:sz w:val="22"/>
     </w:rPr>
   </w:style>
@@ -4811,11 +1848,11 @@
       <w:numPr>
         <w:numId w:val="1"/>
       </w:numPr>
-      <w:spacing w:line="276" w:lineRule="auto"/>
       <w:contextualSpacing/>
     </w:pPr>
     <w:rPr>
       <w:rFonts w:ascii="Arial" w:hAnsi="Arial" w:eastAsia="Arial" w:cs="Arial"/>
+      <w:color w:val="000000"/>
       <w:sz w:val="22"/>
     </w:rPr>
   </w:style>
@@ -4829,13 +1866,8 @@
       <w:numPr>
         <w:numId w:val="2"/>
       </w:numPr>
-      <w:spacing w:line="276" w:lineRule="auto"/>
       <w:contextualSpacing/>
     </w:pPr>
-    <w:rPr>
-      <w:rFonts w:ascii="Arial" w:hAnsi="Arial" w:eastAsia="Arial" w:cs="Arial"/>
-      <w:sz w:val="22"/>
-    </w:rPr>
   </w:style>
   <w:style w:type="paragraph" w:styleId="ListBullet3">
     <w:name w:val="List Bullet 3"/>
@@ -4860,13 +1892,8 @@
       <w:numPr>
         <w:numId w:val="5"/>
       </w:numPr>
-      <w:spacing w:line="276" w:lineRule="auto"/>
       <w:contextualSpacing/>
     </w:pPr>
-    <w:rPr>
-      <w:rFonts w:ascii="Arial" w:hAnsi="Arial" w:eastAsia="Arial" w:cs="Arial"/>
-      <w:sz w:val="22"/>
-    </w:rPr>
   </w:style>
   <w:style w:type="paragraph" w:styleId="ListNumber2">
     <w:name w:val="List Number 2"/>

</xml_diff>

<commit_message>
agregando investigacion de cada tipo de kernel
</commit_message>
<xml_diff>
--- a/ClaseSEPTIEMBRE2826.docx
+++ b/ClaseSEPTIEMBRE2826.docx
@@ -343,6 +343,326 @@
       </w:pPr>
       <w:r>
         <w:t>Máquina virtual (IBM VM/370): Un monitor crea copias virtuales del hardware completo para aislar los SO.</w:t>
+      </w:r>
+    </w:p>
+    <w:p>
+      <w:pPr>
+        <w:pStyle w:val="Heading3"/>
+      </w:pPr>
+      <w:r>
+        <w:t>2.1 Kernel monolítico: Linux</w:t>
+      </w:r>
+    </w:p>
+    <w:p>
+      <w:pPr>
+        <w:jc w:val="both"/>
+      </w:pPr>
+      <w:r>
+        <w:rPr>
+          <w:b/>
+        </w:rPr>
+        <w:t xml:space="preserve">Origen: </w:t>
+      </w:r>
+      <w:r>
+        <w:t>Creado por Linus Torvalds en 1991 y publicado bajo licencia GNU GPL. Hoy corre desde teléfonos hasta supercomputadoras.</w:t>
+      </w:r>
+    </w:p>
+    <w:p>
+      <w:pPr>
+        <w:jc w:val="both"/>
+      </w:pPr>
+      <w:r>
+        <w:rPr>
+          <w:b/>
+        </w:rPr>
+        <w:t xml:space="preserve">Organización del kernel: </w:t>
+      </w:r>
+      <w:r>
+        <w:t>El planificador de procesos, la gestión de memoria, el sistema de archivos (VFS), los drivers y la pila de red están en un único programa que se ejecuta completo en modo kernel. Sus partes se llaman entre sí como funciones normales, y las aplicaciones piden servicios con llamadas al sistema.</w:t>
+      </w:r>
+    </w:p>
+    <w:p>
+      <w:pPr>
+        <w:jc w:val="both"/>
+      </w:pPr>
+      <w:r>
+        <w:rPr>
+          <w:b/>
+        </w:rPr>
+        <w:t xml:space="preserve">Ventajas: </w:t>
+      </w:r>
+      <w:r>
+        <w:t>Alto rendimiento, porque no hay cambios de contexto ni paso de mensajes entre componentes internos.</w:t>
+      </w:r>
+    </w:p>
+    <w:p>
+      <w:pPr>
+        <w:jc w:val="both"/>
+      </w:pPr>
+      <w:r>
+        <w:rPr>
+          <w:b/>
+        </w:rPr>
+        <w:t xml:space="preserve">Desventajas: </w:t>
+      </w:r>
+      <w:r>
+        <w:t>Un error en cualquier driver puede causar un kernel panic y tumbar todo el sistema. Además, el kernel es muy grande y difícil de mantener.</w:t>
+      </w:r>
+    </w:p>
+    <w:p>
+      <w:pPr>
+        <w:pStyle w:val="Heading3"/>
+      </w:pPr>
+      <w:r>
+        <w:t>2.2 Kernel con diseño modular: FreeBSD</w:t>
+      </w:r>
+    </w:p>
+    <w:p>
+      <w:pPr>
+        <w:jc w:val="both"/>
+      </w:pPr>
+      <w:r>
+        <w:rPr>
+          <w:b/>
+        </w:rPr>
+        <w:t xml:space="preserve">Origen: </w:t>
+      </w:r>
+      <w:r>
+        <w:t>Descendiente de BSD UNIX (Universidad de California, Berkeley), con primera versión en 1993. Hoy se usa en servidores y en redes.</w:t>
+      </w:r>
+    </w:p>
+    <w:p>
+      <w:pPr>
+        <w:jc w:val="both"/>
+      </w:pPr>
+      <w:r>
+        <w:rPr>
+          <w:b/>
+        </w:rPr>
+        <w:t xml:space="preserve">Organización del kernel: </w:t>
+      </w:r>
+      <w:r>
+        <w:t>Tiene un núcleo base y los controladores como módulos (.ko) en /boot/kernel, que se cargan y descargan con kldload y kldunload mientras el sistema funciona. Con kldstat se ven los módulos cargados. Linux hace lo mismo con los módulos LKM (lsmod, modprobe).</w:t>
+      </w:r>
+    </w:p>
+    <w:p>
+      <w:pPr>
+        <w:jc w:val="both"/>
+      </w:pPr>
+      <w:r>
+        <w:rPr>
+          <w:b/>
+        </w:rPr>
+        <w:t xml:space="preserve">Ventajas: </w:t>
+      </w:r>
+      <w:r>
+        <w:t>Se agrega soporte de hardware sin recompilar el kernel ni reiniciar, y el kernel base queda más pequeño.</w:t>
+      </w:r>
+    </w:p>
+    <w:p>
+      <w:pPr>
+        <w:jc w:val="both"/>
+      </w:pPr>
+      <w:r>
+        <w:rPr>
+          <w:b/>
+        </w:rPr>
+        <w:t xml:space="preserve">Desventajas: </w:t>
+      </w:r>
+      <w:r>
+        <w:t>Los módulos se ejecutan con los mismos privilegios que el kernel, así que un módulo defectuoso sigue siendo un riesgo.</w:t>
+      </w:r>
+    </w:p>
+    <w:p>
+      <w:pPr>
+        <w:pStyle w:val="Heading3"/>
+      </w:pPr>
+      <w:r>
+        <w:t>2.3 Sistema estructurado en capas: THE</w:t>
+      </w:r>
+    </w:p>
+    <w:p>
+      <w:pPr>
+        <w:jc w:val="both"/>
+      </w:pPr>
+      <w:r>
+        <w:rPr>
+          <w:b/>
+        </w:rPr>
+        <w:t xml:space="preserve">Origen: </w:t>
+      </w:r>
+      <w:r>
+        <w:t>Diseñado por Edsger Dijkstra en la Technische Hogeschool Eindhoven (Países Bajos) en 1968.</w:t>
+      </w:r>
+    </w:p>
+    <w:p>
+      <w:pPr>
+        <w:jc w:val="both"/>
+      </w:pPr>
+      <w:r>
+        <w:rPr>
+          <w:b/>
+        </w:rPr>
+        <w:t xml:space="preserve">Organización del kernel: </w:t>
+      </w:r>
+      <w:r>
+        <w:t>Está dividido en capas numeradas y cada una solo usa los servicios de la capa inferior: capa 0 (planificación del procesador y multiprogramación), capa 1 (gestión de memoria), capa 2 (comunicación con la consola del operador), capa 3 (entrada/salida), capa 4 (programas de usuario) y capa 5 (el operador).</w:t>
+      </w:r>
+    </w:p>
+    <w:p>
+      <w:pPr>
+        <w:jc w:val="both"/>
+      </w:pPr>
+      <w:r>
+        <w:rPr>
+          <w:b/>
+        </w:rPr>
+        <w:t xml:space="preserve">Ventajas: </w:t>
+      </w:r>
+      <w:r>
+        <w:t>Es fácil de construir, depurar y verificar capa por capa.</w:t>
+      </w:r>
+    </w:p>
+    <w:p>
+      <w:pPr>
+        <w:jc w:val="both"/>
+      </w:pPr>
+      <w:r>
+        <w:rPr>
+          <w:b/>
+        </w:rPr>
+        <w:t xml:space="preserve">Desventajas: </w:t>
+      </w:r>
+      <w:r>
+        <w:t>Es difícil decidir qué va en cada capa, y atravesar varias capas para cada petición reduce el rendimiento.</w:t>
+      </w:r>
+    </w:p>
+    <w:p>
+      <w:pPr>
+        <w:pStyle w:val="Heading3"/>
+      </w:pPr>
+      <w:r>
+        <w:t>2.4 Sistema con micronúcleo: MINIX 3</w:t>
+      </w:r>
+    </w:p>
+    <w:p>
+      <w:pPr>
+        <w:jc w:val="both"/>
+      </w:pPr>
+      <w:r>
+        <w:rPr>
+          <w:b/>
+        </w:rPr>
+        <w:t xml:space="preserve">Origen: </w:t>
+      </w:r>
+      <w:r>
+        <w:t>Creado por Andrew Tanenbaum en la Vrije Universiteit de Ámsterdam. MINIX 3 es la versión orientada a la confiabilidad.</w:t>
+      </w:r>
+    </w:p>
+    <w:p>
+      <w:pPr>
+        <w:jc w:val="both"/>
+      </w:pPr>
+      <w:r>
+        <w:rPr>
+          <w:b/>
+        </w:rPr>
+        <w:t xml:space="preserve">Organización del kernel: </w:t>
+      </w:r>
+      <w:r>
+        <w:t>El micronúcleo hace solo lo mínimo: planificación, comunicación entre procesos mediante mensajes (IPC) y manejo básico de interrupciones. El sistema de archivos, los drivers y la gestión de procesos corren como procesos separados en modo usuario. Si un driver falla, un servidor de reencarnación lo reinicia sin afectar al resto.</w:t>
+      </w:r>
+    </w:p>
+    <w:p>
+      <w:pPr>
+        <w:jc w:val="both"/>
+      </w:pPr>
+      <w:r>
+        <w:rPr>
+          <w:b/>
+        </w:rPr>
+        <w:t xml:space="preserve">Ventajas: </w:t>
+      </w:r>
+      <w:r>
+        <w:t>Es más robusto y seguro, porque las fallas quedan aisladas fuera del kernel.</w:t>
+      </w:r>
+    </w:p>
+    <w:p>
+      <w:pPr>
+        <w:jc w:val="both"/>
+      </w:pPr>
+      <w:r>
+        <w:rPr>
+          <w:b/>
+        </w:rPr>
+        <w:t xml:space="preserve">Desventajas: </w:t>
+      </w:r>
+      <w:r>
+        <w:t>El paso de mensajes entre componentes cuesta rendimiento frente a un kernel monolítico.</w:t>
+      </w:r>
+    </w:p>
+    <w:p>
+      <w:pPr>
+        <w:pStyle w:val="Heading3"/>
+      </w:pPr>
+      <w:r>
+        <w:t>2.5 Máquina virtual: IBM VM/370</w:t>
+      </w:r>
+    </w:p>
+    <w:p>
+      <w:pPr>
+        <w:jc w:val="both"/>
+      </w:pPr>
+      <w:r>
+        <w:rPr>
+          <w:b/>
+        </w:rPr>
+        <w:t xml:space="preserve">Origen: </w:t>
+      </w:r>
+      <w:r>
+        <w:t>Lanzado por IBM en 1972 para los mainframes System/370. Su descendiente actual es z/VM.</w:t>
+      </w:r>
+    </w:p>
+    <w:p>
+      <w:pPr>
+        <w:jc w:val="both"/>
+      </w:pPr>
+      <w:r>
+        <w:rPr>
+          <w:b/>
+        </w:rPr>
+        <w:t xml:space="preserve">Organización del kernel: </w:t>
+      </w:r>
+      <w:r>
+        <w:t>Un programa de control (CP, el monitor de máquinas virtuales) está sobre el hardware real y crea varias máquinas virtuales que replican el hardware completo. Cada usuario ejecuta encima su propio sistema operativo, normalmente CMS, que es monousuario e interactivo.</w:t>
+      </w:r>
+    </w:p>
+    <w:p>
+      <w:pPr>
+        <w:jc w:val="both"/>
+      </w:pPr>
+      <w:r>
+        <w:rPr>
+          <w:b/>
+        </w:rPr>
+        <w:t xml:space="preserve">Ventajas: </w:t>
+      </w:r>
+      <w:r>
+        <w:t>Aísla totalmente a los usuarios y permite correr varios sistemas operativos a la vez en el mismo equipo.</w:t>
+      </w:r>
+    </w:p>
+    <w:p>
+      <w:pPr>
+        <w:jc w:val="both"/>
+      </w:pPr>
+      <w:r>
+        <w:rPr>
+          <w:b/>
+        </w:rPr>
+        <w:t xml:space="preserve">Desventajas: </w:t>
+      </w:r>
+      <w:r>
+        <w:t>Agrega una capa extra que consume rendimiento, y virtualizar el hardware completo es complejo.</w:t>
       </w:r>
     </w:p>
     <w:p>

</xml_diff>

<commit_message>
detallando la investigacion de kernels
</commit_message>
<xml_diff>
--- a/ClaseSEPTIEMBRE2826.docx
+++ b/ClaseSEPTIEMBRE2826.docx
@@ -361,10 +361,10 @@
         <w:rPr>
           <w:b/>
         </w:rPr>
-        <w:t xml:space="preserve">Origen: </w:t>
+        <w:t xml:space="preserve">¿Qué es y de dónde viene? </w:t>
       </w:r>
       <w:r>
-        <w:t>Creado por Linus Torvalds en 1991 y publicado bajo licencia GNU GPL. Hoy corre desde teléfonos hasta supercomputadoras.</w:t>
+        <w:t>Linux es el kernel del sistema GNU/Linux. Lo empezó Linus Torvalds en 1991, cuando era estudiante en la Universidad de Helsinki, como un proyecto personal inspirado en UNIX y en MINIX. Lo publicó con licencia GNU GPL y desde entonces lo desarrollan miles de personas de forma colaborativa. Esas dos características aparecen en la diapositiva de características principales de la clase.</w:t>
       </w:r>
     </w:p>
     <w:p>
@@ -375,10 +375,24 @@
         <w:rPr>
           <w:b/>
         </w:rPr>
-        <w:t xml:space="preserve">Organización del kernel: </w:t>
+        <w:t xml:space="preserve">¿Cómo está organizado? </w:t>
       </w:r>
       <w:r>
-        <w:t>El planificador de procesos, la gestión de memoria, el sistema de archivos (VFS), los drivers y la pila de red están en un único programa que se ejecuta completo en modo kernel. Sus partes se llaman entre sí como funciones normales, y las aplicaciones piden servicios con llamadas al sistema.</w:t>
+        <w:t>Es un kernel monolítico: el planificador de procesos, la administración de memoria, el sistema de archivos virtual (VFS), los drivers y la pila de red están juntos en un solo programa que corre en modo kernel. Las aplicaciones corren en modo usuario y le piden cosas al kernel mediante llamadas al sistema (syscalls), como en el esquema de espacio de usuario y espacio de kernel de las diapositivas. Aunque es monolítico, también permite cargar módulos (LKM), así que en la práctica mezcla las dos ideas.</w:t>
+      </w:r>
+    </w:p>
+    <w:p>
+      <w:pPr>
+        <w:jc w:val="both"/>
+      </w:pPr>
+      <w:r>
+        <w:rPr>
+          <w:b/>
+        </w:rPr>
+        <w:t xml:space="preserve">Lo que vi en la práctica: </w:t>
+      </w:r>
+      <w:r>
+        <w:t>En el laboratorio compilé el kernel 6.18.54 en Ubuntu sobre WSL2. El resultado fue una imagen bzImage de 15 MB y 960 módulos .ko, y la compilación tardó casi 31 minutos con 12 núcleos. Eso me mostró que lo que va dentro de la imagen del kernel es solo una parte de todo lo que Linux soporta, y que el resto se compila como módulos.</w:t>
       </w:r>
     </w:p>
     <w:p>
@@ -392,7 +406,7 @@
         <w:t xml:space="preserve">Ventajas: </w:t>
       </w:r>
       <w:r>
-        <w:t>Alto rendimiento, porque no hay cambios de contexto ni paso de mensajes entre componentes internos.</w:t>
+        <w:t>Tiene muy buen rendimiento porque todos los componentes están en el mismo espacio y se llaman entre sí como funciones normales, sin pasar mensajes ni cambiar de contexto. Además es gratuito, tiene una comunidad enorme y soporta una cantidad muy grande de hardware y de arquitecturas.</w:t>
       </w:r>
     </w:p>
     <w:p>
@@ -406,7 +420,21 @@
         <w:t xml:space="preserve">Desventajas: </w:t>
       </w:r>
       <w:r>
-        <w:t>Un error en cualquier driver puede causar un kernel panic y tumbar todo el sistema. Además, el kernel es muy grande y difícil de mantener.</w:t>
+        <w:t>Como todo corre con privilegios de kernel, un error en un solo driver puede provocar un kernel panic y detener todo el sistema. También es un código muy grande (la diapositiva menciona que el código fuente ocupa más de 400 MiB), lo que hace difícil mantenerlo y encontrar errores.</w:t>
+      </w:r>
+    </w:p>
+    <w:p>
+      <w:pPr>
+        <w:jc w:val="both"/>
+      </w:pPr>
+      <w:r>
+        <w:rPr>
+          <w:b/>
+        </w:rPr>
+        <w:t xml:space="preserve">Dónde se usa: </w:t>
+      </w:r>
+      <w:r>
+        <w:t>En servidores, en supercomputadoras, en sistemas embebidos y en Android, que usa un kernel Linux.</w:t>
       </w:r>
     </w:p>
     <w:p>
@@ -425,10 +453,10 @@
         <w:rPr>
           <w:b/>
         </w:rPr>
-        <w:t xml:space="preserve">Origen: </w:t>
+        <w:t xml:space="preserve">¿Qué es y de dónde viene? </w:t>
       </w:r>
       <w:r>
-        <w:t>Descendiente de BSD UNIX (Universidad de California, Berkeley), con primera versión en 1993. Hoy se usa en servidores y en redes.</w:t>
+        <w:t>FreeBSD es un sistema operativo descendiente de BSD UNIX, que se desarrolló en la Universidad de California en Berkeley. Salió como proyecto propio a comienzos de los años 90 y se distribuye con licencia BSD. Se usa mucho en servidores y equipos de red.</w:t>
       </w:r>
     </w:p>
     <w:p>
@@ -439,10 +467,24 @@
         <w:rPr>
           <w:b/>
         </w:rPr>
-        <w:t xml:space="preserve">Organización del kernel: </w:t>
+        <w:t xml:space="preserve">¿Cómo está organizado? </w:t>
       </w:r>
       <w:r>
-        <w:t>Tiene un núcleo base y los controladores como módulos (.ko) en /boot/kernel, que se cargan y descargan con kldload y kldunload mientras el sistema funciona. Con kldstat se ven los módulos cargados. Linux hace lo mismo con los módulos LKM (lsmod, modprobe).</w:t>
+        <w:t>Tiene un kernel base y los controladores como módulos (.ko) que viven en /boot/kernel. Se pueden cargar y descargar con el sistema funcionando usando kldload y kldunload, y con kldstat se ve lo que hay cargado. También se puede cargar un módulo desde el arranque con una línea en loader.conf, por ejemplo if_ath_load="YES", como muestra la diapositiva del controlador inalámbrico ath. Es la misma idea que en Linux se llama LKM y se maneja con lsmod y modprobe.</w:t>
+      </w:r>
+    </w:p>
+    <w:p>
+      <w:pPr>
+        <w:jc w:val="both"/>
+      </w:pPr>
+      <w:r>
+        <w:rPr>
+          <w:b/>
+        </w:rPr>
+        <w:t xml:space="preserve">Lo que vi en la práctica: </w:t>
+      </w:r>
+      <w:r>
+        <w:t>Con este sistema hice la actividad principal de la clase. Creé la configuración CLASEKERN a partir de GENERIC, compilé el kernel (tardó 3924 segundos, más de una hora) y lo arranqué con nextboot. Después de reiniciar, uname -a ya mostraba CLASEKERN y kldstat mostraba el kernel con un módulo cargado (intpm.ko). Algo que no esperaba es que en FreeBSD 15.1 el kernel viene instalado como paquete, así que make installkernel dio error y tuve que instalarlo en otra ruta con INSTKERNNAME.</w:t>
       </w:r>
     </w:p>
     <w:p>
@@ -456,7 +498,7 @@
         <w:t xml:space="preserve">Ventajas: </w:t>
       </w:r>
       <w:r>
-        <w:t>Se agrega soporte de hardware sin recompilar el kernel ni reiniciar, y el kernel base queda más pequeño.</w:t>
+        <w:t>Se puede agregar soporte para hardware sin recompilar todo el kernel ni reiniciar. Un kernel personalizado arranca más rápido y usa menos memoria que el GENERIC, como dice la diapositiva sobre el núcleo de FreeBSD.</w:t>
       </w:r>
     </w:p>
     <w:p>
@@ -470,7 +512,7 @@
         <w:t xml:space="preserve">Desventajas: </w:t>
       </w:r>
       <w:r>
-        <w:t>Los módulos se ejecutan con los mismos privilegios que el kernel, así que un módulo defectuoso sigue siendo un riesgo.</w:t>
+        <w:t>Los módulos corren con los mismos privilegios que el kernel, así que un módulo con errores puede igual dañar el sistema. Además, compilar un kernel propio es lento y requiere tener las fuentes del sistema.</w:t>
       </w:r>
     </w:p>
     <w:p>
@@ -489,10 +531,10 @@
         <w:rPr>
           <w:b/>
         </w:rPr>
-        <w:t xml:space="preserve">Origen: </w:t>
+        <w:t xml:space="preserve">¿Qué es y de dónde viene? </w:t>
       </w:r>
       <w:r>
-        <w:t>Diseñado por Edsger Dijkstra en la Technische Hogeschool Eindhoven (Países Bajos) en 1968.</w:t>
+        <w:t>THE fue un sistema operativo pequeño de procesamiento por lotes diseñado por Edsger Dijkstra y su equipo en la Technische Hogeschool Eindhoven, en los Países Bajos, y publicado en 1968. Es famoso porque fue el primer ejemplo claro de un sistema construido en capas, y porque ahí Dijkstra usó los semáforos para sincronizar procesos.</w:t>
       </w:r>
     </w:p>
     <w:p>
@@ -503,10 +545,10 @@
         <w:rPr>
           <w:b/>
         </w:rPr>
-        <w:t xml:space="preserve">Organización del kernel: </w:t>
+        <w:t xml:space="preserve">¿Cómo está organizado? </w:t>
       </w:r>
       <w:r>
-        <w:t>Está dividido en capas numeradas y cada una solo usa los servicios de la capa inferior: capa 0 (planificación del procesador y multiprogramación), capa 1 (gestión de memoria), capa 2 (comunicación con la consola del operador), capa 3 (entrada/salida), capa 4 (programas de usuario) y capa 5 (el operador).</w:t>
+        <w:t>El sistema se divide en capas numeradas y cada capa solo puede usar los servicios de la capa que tiene debajo. La capa 0 se encarga de la asignación del procesador y de la multiprogramación; la capa 1 de la administración de memoria; la capa 2 de la comunicación entre cada proceso y la consola del operador; la capa 3 de la entrada y salida; la capa 4 son los programas de usuario; y la capa 5 es el operador del sistema.</w:t>
       </w:r>
     </w:p>
     <w:p>
@@ -520,7 +562,7 @@
         <w:t xml:space="preserve">Ventajas: </w:t>
       </w:r>
       <w:r>
-        <w:t>Es fácil de construir, depurar y verificar capa por capa.</w:t>
+        <w:t>Como cada capa depende solo de la anterior, se puede construir y probar una capa a la vez. Si algo falla, es más fácil saber en qué nivel está el problema, y eso hace más sencillo depurar y verificar el sistema.</w:t>
       </w:r>
     </w:p>
     <w:p>
@@ -534,7 +576,21 @@
         <w:t xml:space="preserve">Desventajas: </w:t>
       </w:r>
       <w:r>
-        <w:t>Es difícil decidir qué va en cada capa, y atravesar varias capas para cada petición reduce el rendimiento.</w:t>
+        <w:t>Es difícil decidir qué función va en cada capa, porque una capa solo puede usar las de abajo. Además, una petición tiene que atravesar varias capas y eso le quita rendimiento frente a un kernel monolítico.</w:t>
+      </w:r>
+    </w:p>
+    <w:p>
+      <w:pPr>
+        <w:jc w:val="both"/>
+      </w:pPr>
+      <w:r>
+        <w:rPr>
+          <w:b/>
+        </w:rPr>
+        <w:t xml:space="preserve">Dónde se ve la idea hoy: </w:t>
+      </w:r>
+      <w:r>
+        <w:t>THE casi no se usa como sistema real, pero la idea de capas sigue presente, por ejemplo en los modelos de capas de las redes y en la forma de organizar partes de otros sistemas operativos.</w:t>
       </w:r>
     </w:p>
     <w:p>
@@ -553,10 +609,10 @@
         <w:rPr>
           <w:b/>
         </w:rPr>
-        <w:t xml:space="preserve">Origen: </w:t>
+        <w:t xml:space="preserve">¿Qué es y de dónde viene? </w:t>
       </w:r>
       <w:r>
-        <w:t>Creado por Andrew Tanenbaum en la Vrije Universiteit de Ámsterdam. MINIX 3 es la versión orientada a la confiabilidad.</w:t>
+        <w:t>MINIX lo creó Andrew Tanenbaum en la Vrije Universiteit de Ámsterdam. La primera versión salió en 1987 y se hizo para enseñar sistemas operativos, y de hecho fue una de las inspiraciones de Linux. MINIX 3 es la versión nueva, pensada para que el sistema sea muy confiable y se recupere solo de fallas.</w:t>
       </w:r>
     </w:p>
     <w:p>
@@ -567,10 +623,10 @@
         <w:rPr>
           <w:b/>
         </w:rPr>
-        <w:t xml:space="preserve">Organización del kernel: </w:t>
+        <w:t xml:space="preserve">¿Cómo está organizado? </w:t>
       </w:r>
       <w:r>
-        <w:t>El micronúcleo hace solo lo mínimo: planificación, comunicación entre procesos mediante mensajes (IPC) y manejo básico de interrupciones. El sistema de archivos, los drivers y la gestión de procesos corren como procesos separados en modo usuario. Si un driver falla, un servidor de reencarnación lo reinicia sin afectar al resto.</w:t>
+        <w:t>El micronúcleo hace lo mínimo: planifica procesos, maneja las interrupciones y permite que los procesos se comuniquen enviándose mensajes (IPC). Todo lo demás, como el sistema de archivos, la administración de procesos y los drivers, corre como procesos separados en modo usuario. Si un driver falla, un proceso llamado servidor de reencarnación lo detecta y lo vuelve a iniciar sin que se caiga el sistema completo.</w:t>
       </w:r>
     </w:p>
     <w:p>
@@ -584,7 +640,7 @@
         <w:t xml:space="preserve">Ventajas: </w:t>
       </w:r>
       <w:r>
-        <w:t>Es más robusto y seguro, porque las fallas quedan aisladas fuera del kernel.</w:t>
+        <w:t>Es más robusto y seguro, porque una falla en un driver queda aislada fuera del kernel y no lo tumba. El kernel es muy pequeño, así que hay menos código con privilegios y es más fácil revisarlo.</w:t>
       </w:r>
     </w:p>
     <w:p>
@@ -598,7 +654,7 @@
         <w:t xml:space="preserve">Desventajas: </w:t>
       </w:r>
       <w:r>
-        <w:t>El paso de mensajes entre componentes cuesta rendimiento frente a un kernel monolítico.</w:t>
+        <w:t>Pasar mensajes entre procesos cuesta más que llamar a una función dentro de un kernel monolítico, por eso suele tener menor rendimiento. Esta diferencia fue el centro de una discusión muy conocida entre Tanenbaum y Linus Torvalds en 1992 sobre qué diseño era mejor.</w:t>
       </w:r>
     </w:p>
     <w:p>
@@ -617,10 +673,10 @@
         <w:rPr>
           <w:b/>
         </w:rPr>
-        <w:t xml:space="preserve">Origen: </w:t>
+        <w:t xml:space="preserve">¿Qué es y de dónde viene? </w:t>
       </w:r>
       <w:r>
-        <w:t>Lanzado por IBM en 1972 para los mainframes System/370. Su descendiente actual es z/VM.</w:t>
+        <w:t>VM/370 es un sistema que IBM lanzó en 1972 para sus computadores centrales (mainframes) System/370. Venía de sistemas anteriores de la misma empresa como CP-40 y CP-67, y su descendiente actual es z/VM, que se sigue usando en los mainframes de IBM.</w:t>
       </w:r>
     </w:p>
     <w:p>
@@ -631,10 +687,24 @@
         <w:rPr>
           <w:b/>
         </w:rPr>
-        <w:t xml:space="preserve">Organización del kernel: </w:t>
+        <w:t xml:space="preserve">¿Cómo está organizado? </w:t>
       </w:r>
       <w:r>
-        <w:t>Un programa de control (CP, el monitor de máquinas virtuales) está sobre el hardware real y crea varias máquinas virtuales que replican el hardware completo. Cada usuario ejecuta encima su propio sistema operativo, normalmente CMS, que es monousuario e interactivo.</w:t>
+        <w:t>Sobre el hardware real corre un programa de control (CP) que actúa como monitor de máquinas virtuales. Este programa crea varias máquinas virtuales que replican el hardware completo, y cada usuario ejecuta encima su propio sistema operativo. Lo más común era usar CMS, un sistema sencillo para un solo usuario. Así, cada usuario siente que tiene un computador completo para él solo, aunque todos comparten el mismo equipo físico.</w:t>
+      </w:r>
+    </w:p>
+    <w:p>
+      <w:pPr>
+        <w:jc w:val="both"/>
+      </w:pPr>
+      <w:r>
+        <w:rPr>
+          <w:b/>
+        </w:rPr>
+        <w:t xml:space="preserve">Relación con lo que usé: </w:t>
+      </w:r>
+      <w:r>
+        <w:t>La idea es la misma que usé en el laboratorio. La VM de FreeBSD corrió en VirtualBox sobre Windows 11, y WSL2 también ejecuta el kernel de Linux dentro de una máquina virtual ligera. Es decir, cada prueba de este taller se hizo sobre un sistema operativo ejecutándose dentro de una máquina virtual.</w:t>
       </w:r>
     </w:p>
     <w:p>
@@ -648,7 +718,7 @@
         <w:t xml:space="preserve">Ventajas: </w:t>
       </w:r>
       <w:r>
-        <w:t>Aísla totalmente a los usuarios y permite correr varios sistemas operativos a la vez en el mismo equipo.</w:t>
+        <w:t>Aísla completamente a los usuarios entre sí y permite ejecutar varios sistemas operativos al mismo tiempo en el mismo equipo. También sirve para probar sistemas sin riesgo de dañar el equipo real.</w:t>
       </w:r>
     </w:p>
     <w:p>
@@ -662,7 +732,7 @@
         <w:t xml:space="preserve">Desventajas: </w:t>
       </w:r>
       <w:r>
-        <w:t>Agrega una capa extra que consume rendimiento, y virtualizar el hardware completo es complejo.</w:t>
+        <w:t>Agrega una capa extra entre el sistema y el hardware, y eso consume rendimiento. Además, virtualizar el hardware completo es complejo y exige que el procesador permita controlar las instrucciones privilegiadas.</w:t>
       </w:r>
     </w:p>
     <w:p>

</xml_diff>

<commit_message>
agregando mas evidencias con imagenes
</commit_message>
<xml_diff>
--- a/ClaseSEPTIEMBRE2826.docx
+++ b/ClaseSEPTIEMBRE2826.docx
@@ -871,8 +871,16 @@
     </w:p>
     <w:p>
       <w:pPr>
-        <w:keepLines/>
-        <w:spacing w:before="120" w:after="200"/>
+        <w:pStyle w:val="Heading3"/>
+      </w:pPr>
+      <w:r>
+        <w:t>4.1 Ubuntu 26.04 sobre WSL2 (Windows 11)</w:t>
+      </w:r>
+    </w:p>
+    <w:p>
+      <w:pPr>
+        <w:keepNext/>
+        <w:spacing w:before="120" w:after="40"/>
         <w:jc w:val="center"/>
       </w:pPr>
       <w:r>
@@ -887,7 +895,7 @@
               <a:graphicData uri="http://schemas.openxmlformats.org/drawingml/2006/picture">
                 <pic:pic>
                   <pic:nvPicPr>
-                    <pic:cNvPr id="0" name="evidencia_01.png"/>
+                    <pic:cNvPr id="0" name="image.png"/>
                     <pic:cNvPicPr/>
                   </pic:nvPicPr>
                   <pic:blipFill>
@@ -917,8 +925,21 @@
     </w:p>
     <w:p>
       <w:pPr>
-        <w:keepLines/>
-        <w:spacing w:before="120" w:after="200"/>
+        <w:spacing w:after="200"/>
+        <w:jc w:val="center"/>
+      </w:pPr>
+      <w:r>
+        <w:rPr>
+          <w:i/>
+          <w:sz w:val="22"/>
+        </w:rPr>
+        <w:t>Figura 1. Versión del kernel antes de empezar y descarga del código fuente de la versión 6.18.54.</w:t>
+      </w:r>
+    </w:p>
+    <w:p>
+      <w:pPr>
+        <w:keepNext/>
+        <w:spacing w:before="120" w:after="40"/>
         <w:jc w:val="center"/>
       </w:pPr>
       <w:r>
@@ -933,7 +954,7 @@
               <a:graphicData uri="http://schemas.openxmlformats.org/drawingml/2006/picture">
                 <pic:pic>
                   <pic:nvPicPr>
-                    <pic:cNvPr id="0" name="evidencia_02.png"/>
+                    <pic:cNvPr id="0" name="image.png"/>
                     <pic:cNvPicPr/>
                   </pic:nvPicPr>
                   <pic:blipFill>
@@ -963,8 +984,21 @@
     </w:p>
     <w:p>
       <w:pPr>
-        <w:keepLines/>
-        <w:spacing w:before="120" w:after="200"/>
+        <w:spacing w:after="200"/>
+        <w:jc w:val="center"/>
+      </w:pPr>
+      <w:r>
+        <w:rPr>
+          <w:i/>
+          <w:sz w:val="22"/>
+        </w:rPr>
+        <w:t>Figura 2. Configuración del kernel con make olddefconfig.</w:t>
+      </w:r>
+    </w:p>
+    <w:p>
+      <w:pPr>
+        <w:keepNext/>
+        <w:spacing w:before="120" w:after="40"/>
         <w:jc w:val="center"/>
       </w:pPr>
       <w:r>
@@ -979,7 +1013,7 @@
               <a:graphicData uri="http://schemas.openxmlformats.org/drawingml/2006/picture">
                 <pic:pic>
                   <pic:nvPicPr>
-                    <pic:cNvPr id="0" name="evidencia_03.png"/>
+                    <pic:cNvPr id="0" name="image.png"/>
                     <pic:cNvPicPr/>
                   </pic:nvPicPr>
                   <pic:blipFill>
@@ -1009,8 +1043,21 @@
     </w:p>
     <w:p>
       <w:pPr>
-        <w:keepLines/>
-        <w:spacing w:before="120" w:after="200"/>
+        <w:spacing w:after="200"/>
+        <w:jc w:val="center"/>
+      </w:pPr>
+      <w:r>
+        <w:rPr>
+          <w:i/>
+          <w:sz w:val="22"/>
+        </w:rPr>
+        <w:t>Figura 3. Tiempo de la compilación (make -j12 bzImage modules).</w:t>
+      </w:r>
+    </w:p>
+    <w:p>
+      <w:pPr>
+        <w:keepNext/>
+        <w:spacing w:before="120" w:after="40"/>
         <w:jc w:val="center"/>
       </w:pPr>
       <w:r>
@@ -1025,7 +1072,7 @@
               <a:graphicData uri="http://schemas.openxmlformats.org/drawingml/2006/picture">
                 <pic:pic>
                   <pic:nvPicPr>
-                    <pic:cNvPr id="0" name="evidencia_04.png"/>
+                    <pic:cNvPr id="0" name="image.png"/>
                     <pic:cNvPicPr/>
                   </pic:nvPicPr>
                   <pic:blipFill>
@@ -1055,14 +1102,27 @@
     </w:p>
     <w:p>
       <w:pPr>
-        <w:keepLines/>
-        <w:spacing w:before="120" w:after="200"/>
+        <w:spacing w:after="200"/>
+        <w:jc w:val="center"/>
+      </w:pPr>
+      <w:r>
+        <w:rPr>
+          <w:i/>
+          <w:sz w:val="22"/>
+        </w:rPr>
+        <w:t>Figura 4. Resultado de la compilación: imagen bzImage, 960 módulos .ko e instalación de los módulos.</w:t>
+      </w:r>
+    </w:p>
+    <w:p>
+      <w:pPr>
+        <w:keepNext/>
+        <w:spacing w:before="120" w:after="40"/>
         <w:jc w:val="center"/>
       </w:pPr>
       <w:r>
         <w:drawing>
           <wp:inline xmlns:a="http://schemas.openxmlformats.org/drawingml/2006/main" xmlns:pic="http://schemas.openxmlformats.org/drawingml/2006/picture">
-            <wp:extent cx="5486400" cy="2194560"/>
+            <wp:extent cx="5486400" cy="1617044"/>
             <wp:docPr id="5" name="Picture 5"/>
             <wp:cNvGraphicFramePr>
               <a:graphicFrameLocks noChangeAspect="1"/>
@@ -1071,7 +1131,192 @@
               <a:graphicData uri="http://schemas.openxmlformats.org/drawingml/2006/picture">
                 <pic:pic>
                   <pic:nvPicPr>
-                    <pic:cNvPr id="0" name="evidencia_05.png"/>
+                    <pic:cNvPr id="0" name="evidencia_11.png"/>
+                    <pic:cNvPicPr/>
+                  </pic:nvPicPr>
+                  <pic:blipFill>
+                    <a:blip r:embed="rId19"/>
+                    <a:stretch>
+                      <a:fillRect/>
+                    </a:stretch>
+                  </pic:blipFill>
+                  <pic:spPr>
+                    <a:xfrm>
+                      <a:off x="0" y="0"/>
+                      <a:ext cx="5486400" cy="1617044"/>
+                    </a:xfrm>
+                    <a:prstGeom prst="rect"/>
+                    <a:ln w="9525">
+                      <a:solidFill>
+                        <a:srgbClr val="A6A6A6"/>
+                      </a:solidFill>
+                    </a:ln>
+                  </pic:spPr>
+                </pic:pic>
+              </a:graphicData>
+            </a:graphic>
+          </wp:inline>
+        </w:drawing>
+      </w:r>
+    </w:p>
+    <w:p>
+      <w:pPr>
+        <w:spacing w:after="200"/>
+        <w:jc w:val="center"/>
+      </w:pPr>
+      <w:r>
+        <w:rPr>
+          <w:i/>
+          <w:sz w:val="22"/>
+        </w:rPr>
+        <w:t>Figura 5. Versión de Ubuntu, kernel en ejecución y módulos cargados (lsb_release, uname -r, lsmod).</w:t>
+      </w:r>
+    </w:p>
+    <w:p>
+      <w:pPr>
+        <w:keepNext/>
+        <w:spacing w:before="120" w:after="40"/>
+        <w:jc w:val="center"/>
+      </w:pPr>
+      <w:r>
+        <w:drawing>
+          <wp:inline xmlns:a="http://schemas.openxmlformats.org/drawingml/2006/main" xmlns:pic="http://schemas.openxmlformats.org/drawingml/2006/picture">
+            <wp:extent cx="5486400" cy="2194560"/>
+            <wp:docPr id="6" name="Picture 6"/>
+            <wp:cNvGraphicFramePr>
+              <a:graphicFrameLocks noChangeAspect="1"/>
+            </wp:cNvGraphicFramePr>
+            <a:graphic>
+              <a:graphicData uri="http://schemas.openxmlformats.org/drawingml/2006/picture">
+                <pic:pic>
+                  <pic:nvPicPr>
+                    <pic:cNvPr id="0" name="evidencia_12.png"/>
+                    <pic:cNvPicPr/>
+                  </pic:nvPicPr>
+                  <pic:blipFill>
+                    <a:blip r:embed="rId20"/>
+                    <a:stretch>
+                      <a:fillRect/>
+                    </a:stretch>
+                  </pic:blipFill>
+                  <pic:spPr>
+                    <a:xfrm>
+                      <a:off x="0" y="0"/>
+                      <a:ext cx="5486400" cy="2194560"/>
+                    </a:xfrm>
+                    <a:prstGeom prst="rect"/>
+                    <a:ln w="9525">
+                      <a:solidFill>
+                        <a:srgbClr val="A6A6A6"/>
+                      </a:solidFill>
+                    </a:ln>
+                  </pic:spPr>
+                </pic:pic>
+              </a:graphicData>
+            </a:graphic>
+          </wp:inline>
+        </w:drawing>
+      </w:r>
+    </w:p>
+    <w:p>
+      <w:pPr>
+        <w:spacing w:after="200"/>
+        <w:jc w:val="center"/>
+      </w:pPr>
+      <w:r>
+        <w:rPr>
+          <w:i/>
+          <w:sz w:val="22"/>
+        </w:rPr>
+        <w:t>Figura 6. Actualización de los repositorios (apt update) y búsqueda de los kernels HWE (apt search).</w:t>
+      </w:r>
+    </w:p>
+    <w:p>
+      <w:pPr>
+        <w:keepNext/>
+        <w:spacing w:before="120" w:after="40"/>
+        <w:jc w:val="center"/>
+      </w:pPr>
+      <w:r>
+        <w:drawing>
+          <wp:inline xmlns:a="http://schemas.openxmlformats.org/drawingml/2006/main" xmlns:pic="http://schemas.openxmlformats.org/drawingml/2006/picture">
+            <wp:extent cx="5486400" cy="3205213"/>
+            <wp:docPr id="7" name="Picture 7"/>
+            <wp:cNvGraphicFramePr>
+              <a:graphicFrameLocks noChangeAspect="1"/>
+            </wp:cNvGraphicFramePr>
+            <a:graphic>
+              <a:graphicData uri="http://schemas.openxmlformats.org/drawingml/2006/picture">
+                <pic:pic>
+                  <pic:nvPicPr>
+                    <pic:cNvPr id="0" name="evidencia_13.png"/>
+                    <pic:cNvPicPr/>
+                  </pic:nvPicPr>
+                  <pic:blipFill>
+                    <a:blip r:embed="rId21"/>
+                    <a:stretch>
+                      <a:fillRect/>
+                    </a:stretch>
+                  </pic:blipFill>
+                  <pic:spPr>
+                    <a:xfrm>
+                      <a:off x="0" y="0"/>
+                      <a:ext cx="5486400" cy="3205213"/>
+                    </a:xfrm>
+                    <a:prstGeom prst="rect"/>
+                    <a:ln w="9525">
+                      <a:solidFill>
+                        <a:srgbClr val="A6A6A6"/>
+                      </a:solidFill>
+                    </a:ln>
+                  </pic:spPr>
+                </pic:pic>
+              </a:graphicData>
+            </a:graphic>
+          </wp:inline>
+        </w:drawing>
+      </w:r>
+    </w:p>
+    <w:p>
+      <w:pPr>
+        <w:spacing w:after="200"/>
+        <w:jc w:val="center"/>
+      </w:pPr>
+      <w:r>
+        <w:rPr>
+          <w:i/>
+          <w:sz w:val="22"/>
+        </w:rPr>
+        <w:t>Figura 7. Kernel candidato en los repositorios y simulación de la instalación (apt-get -s install).</w:t>
+      </w:r>
+    </w:p>
+    <w:p>
+      <w:pPr>
+        <w:pStyle w:val="Heading3"/>
+      </w:pPr>
+      <w:r>
+        <w:t>4.2 FreeBSD 15.1 en VirtualBox (Windows 11)</w:t>
+      </w:r>
+    </w:p>
+    <w:p>
+      <w:pPr>
+        <w:keepNext/>
+        <w:spacing w:before="120" w:after="40"/>
+        <w:jc w:val="center"/>
+      </w:pPr>
+      <w:r>
+        <w:drawing>
+          <wp:inline xmlns:a="http://schemas.openxmlformats.org/drawingml/2006/main" xmlns:pic="http://schemas.openxmlformats.org/drawingml/2006/picture">
+            <wp:extent cx="5486400" cy="2194560"/>
+            <wp:docPr id="8" name="Picture 8"/>
+            <wp:cNvGraphicFramePr>
+              <a:graphicFrameLocks noChangeAspect="1"/>
+            </wp:cNvGraphicFramePr>
+            <a:graphic>
+              <a:graphicData uri="http://schemas.openxmlformats.org/drawingml/2006/picture">
+                <pic:pic>
+                  <pic:nvPicPr>
+                    <pic:cNvPr id="0" name="image.png"/>
                     <pic:cNvPicPr/>
                   </pic:nvPicPr>
                   <pic:blipFill>
@@ -1101,15 +1346,28 @@
     </w:p>
     <w:p>
       <w:pPr>
-        <w:keepLines/>
-        <w:spacing w:before="120" w:after="200"/>
+        <w:spacing w:after="200"/>
+        <w:jc w:val="center"/>
+      </w:pPr>
+      <w:r>
+        <w:rPr>
+          <w:i/>
+          <w:sz w:val="22"/>
+        </w:rPr>
+        <w:t>Figura 8. Identificación del sistema (os-release, freebsd-version, getconf y uname).</w:t>
+      </w:r>
+    </w:p>
+    <w:p>
+      <w:pPr>
+        <w:keepNext/>
+        <w:spacing w:before="120" w:after="40"/>
         <w:jc w:val="center"/>
       </w:pPr>
       <w:r>
         <w:drawing>
           <wp:inline xmlns:a="http://schemas.openxmlformats.org/drawingml/2006/main" xmlns:pic="http://schemas.openxmlformats.org/drawingml/2006/picture">
             <wp:extent cx="5486400" cy="1183907"/>
-            <wp:docPr id="6" name="Picture 6"/>
+            <wp:docPr id="9" name="Picture 9"/>
             <wp:cNvGraphicFramePr>
               <a:graphicFrameLocks noChangeAspect="1"/>
             </wp:cNvGraphicFramePr>
@@ -1117,7 +1375,7 @@
               <a:graphicData uri="http://schemas.openxmlformats.org/drawingml/2006/picture">
                 <pic:pic>
                   <pic:nvPicPr>
-                    <pic:cNvPr id="0" name="evidencia_06.png"/>
+                    <pic:cNvPr id="0" name="image.png"/>
                     <pic:cNvPicPr/>
                   </pic:nvPicPr>
                   <pic:blipFill>
@@ -1147,15 +1405,28 @@
     </w:p>
     <w:p>
       <w:pPr>
-        <w:keepLines/>
-        <w:spacing w:before="120" w:after="200"/>
+        <w:spacing w:after="200"/>
+        <w:jc w:val="center"/>
+      </w:pPr>
+      <w:r>
+        <w:rPr>
+          <w:i/>
+          <w:sz w:val="22"/>
+        </w:rPr>
+        <w:t>Figura 9. Creación de la configuración CLASEKERN a partir de GENERIC.</w:t>
+      </w:r>
+    </w:p>
+    <w:p>
+      <w:pPr>
+        <w:keepNext/>
+        <w:spacing w:before="120" w:after="40"/>
         <w:jc w:val="center"/>
       </w:pPr>
       <w:r>
         <w:drawing>
           <wp:inline xmlns:a="http://schemas.openxmlformats.org/drawingml/2006/main" xmlns:pic="http://schemas.openxmlformats.org/drawingml/2006/picture">
-            <wp:extent cx="5486400" cy="462013"/>
-            <wp:docPr id="7" name="Picture 7"/>
+            <wp:extent cx="5486400" cy="1328286"/>
+            <wp:docPr id="10" name="Picture 10"/>
             <wp:cNvGraphicFramePr>
               <a:graphicFrameLocks noChangeAspect="1"/>
             </wp:cNvGraphicFramePr>
@@ -1163,7 +1434,66 @@
               <a:graphicData uri="http://schemas.openxmlformats.org/drawingml/2006/picture">
                 <pic:pic>
                   <pic:nvPicPr>
-                    <pic:cNvPr id="0" name="evidencia_07.png"/>
+                    <pic:cNvPr id="0" name="evidencia_14.png"/>
+                    <pic:cNvPicPr/>
+                  </pic:nvPicPr>
+                  <pic:blipFill>
+                    <a:blip r:embed="rId22"/>
+                    <a:stretch>
+                      <a:fillRect/>
+                    </a:stretch>
+                  </pic:blipFill>
+                  <pic:spPr>
+                    <a:xfrm>
+                      <a:off x="0" y="0"/>
+                      <a:ext cx="5486400" cy="1328286"/>
+                    </a:xfrm>
+                    <a:prstGeom prst="rect"/>
+                    <a:ln w="9525">
+                      <a:solidFill>
+                        <a:srgbClr val="A6A6A6"/>
+                      </a:solidFill>
+                    </a:ln>
+                  </pic:spPr>
+                </pic:pic>
+              </a:graphicData>
+            </a:graphic>
+          </wp:inline>
+        </w:drawing>
+      </w:r>
+    </w:p>
+    <w:p>
+      <w:pPr>
+        <w:spacing w:after="200"/>
+        <w:jc w:val="center"/>
+      </w:pPr>
+      <w:r>
+        <w:rPr>
+          <w:i/>
+          <w:sz w:val="22"/>
+        </w:rPr>
+        <w:t>Figura 10. Diferencia entre GENERIC y CLASEKERN (solo cambia la línea ident) y enlace simbólico en conf.</w:t>
+      </w:r>
+    </w:p>
+    <w:p>
+      <w:pPr>
+        <w:keepNext/>
+        <w:spacing w:before="120" w:after="40"/>
+        <w:jc w:val="center"/>
+      </w:pPr>
+      <w:r>
+        <w:drawing>
+          <wp:inline xmlns:a="http://schemas.openxmlformats.org/drawingml/2006/main" xmlns:pic="http://schemas.openxmlformats.org/drawingml/2006/picture">
+            <wp:extent cx="5486400" cy="462013"/>
+            <wp:docPr id="11" name="Picture 11"/>
+            <wp:cNvGraphicFramePr>
+              <a:graphicFrameLocks noChangeAspect="1"/>
+            </wp:cNvGraphicFramePr>
+            <a:graphic>
+              <a:graphicData uri="http://schemas.openxmlformats.org/drawingml/2006/picture">
+                <pic:pic>
+                  <pic:nvPicPr>
+                    <pic:cNvPr id="0" name="image.png"/>
                     <pic:cNvPicPr/>
                   </pic:nvPicPr>
                   <pic:blipFill>
@@ -1193,15 +1523,28 @@
     </w:p>
     <w:p>
       <w:pPr>
-        <w:keepLines/>
-        <w:spacing w:before="120" w:after="200"/>
+        <w:spacing w:after="200"/>
+        <w:jc w:val="center"/>
+      </w:pPr>
+      <w:r>
+        <w:rPr>
+          <w:i/>
+          <w:sz w:val="22"/>
+        </w:rPr>
+        <w:t>Figura 11. Compilación del kernel con make buildkernel (3924 segundos).</w:t>
+      </w:r>
+    </w:p>
+    <w:p>
+      <w:pPr>
+        <w:keepNext/>
+        <w:spacing w:before="120" w:after="40"/>
         <w:jc w:val="center"/>
       </w:pPr>
       <w:r>
         <w:drawing>
           <wp:inline xmlns:a="http://schemas.openxmlformats.org/drawingml/2006/main" xmlns:pic="http://schemas.openxmlformats.org/drawingml/2006/picture">
             <wp:extent cx="5486400" cy="895149"/>
-            <wp:docPr id="8" name="Picture 8"/>
+            <wp:docPr id="12" name="Picture 12"/>
             <wp:cNvGraphicFramePr>
               <a:graphicFrameLocks noChangeAspect="1"/>
             </wp:cNvGraphicFramePr>
@@ -1209,7 +1552,7 @@
               <a:graphicData uri="http://schemas.openxmlformats.org/drawingml/2006/picture">
                 <pic:pic>
                   <pic:nvPicPr>
-                    <pic:cNvPr id="0" name="evidencia_08.png"/>
+                    <pic:cNvPr id="0" name="image.png"/>
                     <pic:cNvPicPr/>
                   </pic:nvPicPr>
                   <pic:blipFill>
@@ -1239,15 +1582,28 @@
     </w:p>
     <w:p>
       <w:pPr>
-        <w:keepLines/>
-        <w:spacing w:before="120" w:after="200"/>
+        <w:spacing w:after="200"/>
+        <w:jc w:val="center"/>
+      </w:pPr>
+      <w:r>
+        <w:rPr>
+          <w:i/>
+          <w:sz w:val="22"/>
+        </w:rPr>
+        <w:t>Figura 12. Error de make installkernel porque el kernel de FreeBSD 15.1 está instalado como paquete.</w:t>
+      </w:r>
+    </w:p>
+    <w:p>
+      <w:pPr>
+        <w:keepNext/>
+        <w:spacing w:before="120" w:after="40"/>
         <w:jc w:val="center"/>
       </w:pPr>
       <w:r>
         <w:drawing>
           <wp:inline xmlns:a="http://schemas.openxmlformats.org/drawingml/2006/main" xmlns:pic="http://schemas.openxmlformats.org/drawingml/2006/picture">
             <wp:extent cx="5486400" cy="1039528"/>
-            <wp:docPr id="9" name="Picture 9"/>
+            <wp:docPr id="13" name="Picture 13"/>
             <wp:cNvGraphicFramePr>
               <a:graphicFrameLocks noChangeAspect="1"/>
             </wp:cNvGraphicFramePr>
@@ -1255,7 +1611,7 @@
               <a:graphicData uri="http://schemas.openxmlformats.org/drawingml/2006/picture">
                 <pic:pic>
                   <pic:nvPicPr>
-                    <pic:cNvPr id="0" name="evidencia_09.png"/>
+                    <pic:cNvPr id="0" name="image.png"/>
                     <pic:cNvPicPr/>
                   </pic:nvPicPr>
                   <pic:blipFill>
@@ -1285,15 +1641,28 @@
     </w:p>
     <w:p>
       <w:pPr>
-        <w:keepLines/>
-        <w:spacing w:before="120" w:after="200"/>
+        <w:spacing w:after="200"/>
+        <w:jc w:val="center"/>
+      </w:pPr>
+      <w:r>
+        <w:rPr>
+          <w:i/>
+          <w:sz w:val="22"/>
+        </w:rPr>
+        <w:t>Figura 13. Instalación en otra ruta con INSTKERNNAME, nextboot y reinicio.</w:t>
+      </w:r>
+    </w:p>
+    <w:p>
+      <w:pPr>
+        <w:keepNext/>
+        <w:spacing w:before="120" w:after="40"/>
         <w:jc w:val="center"/>
       </w:pPr>
       <w:r>
         <w:drawing>
           <wp:inline xmlns:a="http://schemas.openxmlformats.org/drawingml/2006/main" xmlns:pic="http://schemas.openxmlformats.org/drawingml/2006/picture">
             <wp:extent cx="5486400" cy="1905802"/>
-            <wp:docPr id="10" name="Picture 10"/>
+            <wp:docPr id="14" name="Picture 14"/>
             <wp:cNvGraphicFramePr>
               <a:graphicFrameLocks noChangeAspect="1"/>
             </wp:cNvGraphicFramePr>
@@ -1301,7 +1670,7 @@
               <a:graphicData uri="http://schemas.openxmlformats.org/drawingml/2006/picture">
                 <pic:pic>
                   <pic:nvPicPr>
-                    <pic:cNvPr id="0" name="evidencia_10.png"/>
+                    <pic:cNvPr id="0" name="image.png"/>
                     <pic:cNvPicPr/>
                   </pic:nvPicPr>
                   <pic:blipFill>
@@ -1327,6 +1696,255 @@
             </a:graphic>
           </wp:inline>
         </w:drawing>
+      </w:r>
+    </w:p>
+    <w:p>
+      <w:pPr>
+        <w:spacing w:after="200"/>
+        <w:jc w:val="center"/>
+      </w:pPr>
+      <w:r>
+        <w:rPr>
+          <w:i/>
+          <w:sz w:val="22"/>
+        </w:rPr>
+        <w:t>Figura 14. Verificación después de reiniciar: el sistema arrancó con CLASEKERN.</w:t>
+      </w:r>
+    </w:p>
+    <w:p>
+      <w:pPr>
+        <w:keepNext/>
+        <w:spacing w:before="120" w:after="40"/>
+        <w:jc w:val="center"/>
+      </w:pPr>
+      <w:r>
+        <w:drawing>
+          <wp:inline xmlns:a="http://schemas.openxmlformats.org/drawingml/2006/main" xmlns:pic="http://schemas.openxmlformats.org/drawingml/2006/picture">
+            <wp:extent cx="5486400" cy="2483318"/>
+            <wp:docPr id="15" name="Picture 15"/>
+            <wp:cNvGraphicFramePr>
+              <a:graphicFrameLocks noChangeAspect="1"/>
+            </wp:cNvGraphicFramePr>
+            <a:graphic>
+              <a:graphicData uri="http://schemas.openxmlformats.org/drawingml/2006/picture">
+                <pic:pic>
+                  <pic:nvPicPr>
+                    <pic:cNvPr id="0" name="evidencia_17.png"/>
+                    <pic:cNvPicPr/>
+                  </pic:nvPicPr>
+                  <pic:blipFill>
+                    <a:blip r:embed="rId23"/>
+                    <a:stretch>
+                      <a:fillRect/>
+                    </a:stretch>
+                  </pic:blipFill>
+                  <pic:spPr>
+                    <a:xfrm>
+                      <a:off x="0" y="0"/>
+                      <a:ext cx="5486400" cy="2483318"/>
+                    </a:xfrm>
+                    <a:prstGeom prst="rect"/>
+                    <a:ln w="9525">
+                      <a:solidFill>
+                        <a:srgbClr val="A6A6A6"/>
+                      </a:solidFill>
+                    </a:ln>
+                  </pic:spPr>
+                </pic:pic>
+              </a:graphicData>
+            </a:graphic>
+          </wp:inline>
+        </w:drawing>
+      </w:r>
+    </w:p>
+    <w:p>
+      <w:pPr>
+        <w:spacing w:after="200"/>
+        <w:jc w:val="center"/>
+      </w:pPr>
+      <w:r>
+        <w:rPr>
+          <w:i/>
+          <w:sz w:val="22"/>
+        </w:rPr>
+        <w:t>Figura 15. Segundo arranque con CLASEKERN: uname, freebsd-version y configuración del kernel (kern.conftxt).</w:t>
+      </w:r>
+    </w:p>
+    <w:p>
+      <w:pPr>
+        <w:keepNext/>
+        <w:spacing w:before="120" w:after="40"/>
+        <w:jc w:val="center"/>
+      </w:pPr>
+      <w:r>
+        <w:drawing>
+          <wp:inline xmlns:a="http://schemas.openxmlformats.org/drawingml/2006/main" xmlns:pic="http://schemas.openxmlformats.org/drawingml/2006/picture">
+            <wp:extent cx="5486400" cy="1039528"/>
+            <wp:docPr id="16" name="Picture 16"/>
+            <wp:cNvGraphicFramePr>
+              <a:graphicFrameLocks noChangeAspect="1"/>
+            </wp:cNvGraphicFramePr>
+            <a:graphic>
+              <a:graphicData uri="http://schemas.openxmlformats.org/drawingml/2006/picture">
+                <pic:pic>
+                  <pic:nvPicPr>
+                    <pic:cNvPr id="0" name="evidencia_18.png"/>
+                    <pic:cNvPicPr/>
+                  </pic:nvPicPr>
+                  <pic:blipFill>
+                    <a:blip r:embed="rId24"/>
+                    <a:stretch>
+                      <a:fillRect/>
+                    </a:stretch>
+                  </pic:blipFill>
+                  <pic:spPr>
+                    <a:xfrm>
+                      <a:off x="0" y="0"/>
+                      <a:ext cx="5486400" cy="1039528"/>
+                    </a:xfrm>
+                    <a:prstGeom prst="rect"/>
+                    <a:ln w="9525">
+                      <a:solidFill>
+                        <a:srgbClr val="A6A6A6"/>
+                      </a:solidFill>
+                    </a:ln>
+                  </pic:spPr>
+                </pic:pic>
+              </a:graphicData>
+            </a:graphic>
+          </wp:inline>
+        </w:drawing>
+      </w:r>
+    </w:p>
+    <w:p>
+      <w:pPr>
+        <w:spacing w:after="200"/>
+        <w:jc w:val="center"/>
+      </w:pPr>
+      <w:r>
+        <w:rPr>
+          <w:i/>
+          <w:sz w:val="22"/>
+        </w:rPr>
+        <w:t>Figura 16. Archivo del kernel en uso y módulos cargados con CLASEKERN.</w:t>
+      </w:r>
+    </w:p>
+    <w:p>
+      <w:pPr>
+        <w:keepNext/>
+        <w:spacing w:before="120" w:after="40"/>
+        <w:jc w:val="center"/>
+      </w:pPr>
+      <w:r>
+        <w:drawing>
+          <wp:inline xmlns:a="http://schemas.openxmlformats.org/drawingml/2006/main" xmlns:pic="http://schemas.openxmlformats.org/drawingml/2006/picture">
+            <wp:extent cx="5486400" cy="2194560"/>
+            <wp:docPr id="17" name="Picture 17"/>
+            <wp:cNvGraphicFramePr>
+              <a:graphicFrameLocks noChangeAspect="1"/>
+            </wp:cNvGraphicFramePr>
+            <a:graphic>
+              <a:graphicData uri="http://schemas.openxmlformats.org/drawingml/2006/picture">
+                <pic:pic>
+                  <pic:nvPicPr>
+                    <pic:cNvPr id="0" name="evidencia_15.png"/>
+                    <pic:cNvPicPr/>
+                  </pic:nvPicPr>
+                  <pic:blipFill>
+                    <a:blip r:embed="rId25"/>
+                    <a:stretch>
+                      <a:fillRect/>
+                    </a:stretch>
+                  </pic:blipFill>
+                  <pic:spPr>
+                    <a:xfrm>
+                      <a:off x="0" y="0"/>
+                      <a:ext cx="5486400" cy="2194560"/>
+                    </a:xfrm>
+                    <a:prstGeom prst="rect"/>
+                    <a:ln w="9525">
+                      <a:solidFill>
+                        <a:srgbClr val="A6A6A6"/>
+                      </a:solidFill>
+                    </a:ln>
+                  </pic:spPr>
+                </pic:pic>
+              </a:graphicData>
+            </a:graphic>
+          </wp:inline>
+        </w:drawing>
+      </w:r>
+    </w:p>
+    <w:p>
+      <w:pPr>
+        <w:spacing w:after="200"/>
+        <w:jc w:val="center"/>
+      </w:pPr>
+      <w:r>
+        <w:rPr>
+          <w:i/>
+          <w:sz w:val="22"/>
+        </w:rPr>
+        <w:t>Figura 17. Módulos del kernel: kldstat, kldload y kldunload con el módulo if_epair.</w:t>
+      </w:r>
+    </w:p>
+    <w:p>
+      <w:pPr>
+        <w:keepNext/>
+        <w:spacing w:before="120" w:after="40"/>
+        <w:jc w:val="center"/>
+      </w:pPr>
+      <w:r>
+        <w:drawing>
+          <wp:inline xmlns:a="http://schemas.openxmlformats.org/drawingml/2006/main" xmlns:pic="http://schemas.openxmlformats.org/drawingml/2006/picture">
+            <wp:extent cx="5486400" cy="1761423"/>
+            <wp:docPr id="18" name="Picture 18"/>
+            <wp:cNvGraphicFramePr>
+              <a:graphicFrameLocks noChangeAspect="1"/>
+            </wp:cNvGraphicFramePr>
+            <a:graphic>
+              <a:graphicData uri="http://schemas.openxmlformats.org/drawingml/2006/picture">
+                <pic:pic>
+                  <pic:nvPicPr>
+                    <pic:cNvPr id="0" name="evidencia_16.png"/>
+                    <pic:cNvPicPr/>
+                  </pic:nvPicPr>
+                  <pic:blipFill>
+                    <a:blip r:embed="rId26"/>
+                    <a:stretch>
+                      <a:fillRect/>
+                    </a:stretch>
+                  </pic:blipFill>
+                  <pic:spPr>
+                    <a:xfrm>
+                      <a:off x="0" y="0"/>
+                      <a:ext cx="5486400" cy="1761423"/>
+                    </a:xfrm>
+                    <a:prstGeom prst="rect"/>
+                    <a:ln w="9525">
+                      <a:solidFill>
+                        <a:srgbClr val="A6A6A6"/>
+                      </a:solidFill>
+                    </a:ln>
+                  </pic:spPr>
+                </pic:pic>
+              </a:graphicData>
+            </a:graphic>
+          </wp:inline>
+        </w:drawing>
+      </w:r>
+    </w:p>
+    <w:p>
+      <w:pPr>
+        <w:spacing w:after="200"/>
+        <w:jc w:val="center"/>
+      </w:pPr>
+      <w:r>
+        <w:rPr>
+          <w:i/>
+          <w:sz w:val="22"/>
+        </w:rPr>
+        <w:t>Figura 18. Kernel instalado en /boot/CLASEKERN junto al kernel original en /boot/kernel.</w:t>
       </w:r>
     </w:p>
     <w:sectPr>

</xml_diff>